<commit_message>
Working on WP3 as a .md object, and redoing plan
</commit_message>
<xml_diff>
--- a/Approach v0.2.docx
+++ b/Approach v0.2.docx
@@ -2,7 +2,4295 @@
 <file path=word/document.xml><?xml version="1.0" encoding="utf-8"?>
 <w:document xmlns:wpc="http://schemas.microsoft.com/office/word/2010/wordprocessingCanvas" xmlns:cx="http://schemas.microsoft.com/office/drawing/2014/chartex" xmlns:cx1="http://schemas.microsoft.com/office/drawing/2015/9/8/chartex" xmlns:cx2="http://schemas.microsoft.com/office/drawing/2015/10/21/chartex" xmlns:cx3="http://schemas.microsoft.com/office/drawing/2016/5/9/chartex" xmlns:cx4="http://schemas.microsoft.com/office/drawing/2016/5/10/chartex" xmlns:cx5="http://schemas.microsoft.com/office/drawing/2016/5/11/chartex" xmlns:cx6="http://schemas.microsoft.com/office/drawing/2016/5/12/chartex" xmlns:cx7="http://schemas.microsoft.com/office/drawing/2016/5/13/chartex" xmlns:cx8="http://schemas.microsoft.com/office/drawing/2016/5/14/chartex" xmlns:mc="http://schemas.openxmlformats.org/markup-compatibility/2006" xmlns:aink="http://schemas.microsoft.com/office/drawing/2016/ink" xmlns:am3d="http://schemas.microsoft.com/office/drawing/2017/model3d" xmlns:o="urn:schemas-microsoft-com:office:office" xmlns:oel="http://schemas.microsoft.com/office/2019/extlst" xmlns:r="http://schemas.openxmlformats.org/officeDocument/2006/relationships" xmlns:m="http://schemas.openxmlformats.org/officeDocument/2006/math" xmlns:v="urn:schemas-microsoft-com:vml" xmlns:wp14="http://schemas.microsoft.com/office/word/2010/wordprocessingDrawing" xmlns:wp="http://schemas.openxmlformats.org/drawingml/2006/wordprocessingDrawing" xmlns:w10="urn:schemas-microsoft-com:office:word" xmlns:w="http://schemas.openxmlformats.org/wordprocessingml/2006/main" xmlns:w14="http://schemas.microsoft.com/office/word/2010/wordml" xmlns:w15="http://schemas.microsoft.com/office/word/2012/wordml" xmlns:w16cex="http://schemas.microsoft.com/office/word/2018/wordml/cex" xmlns:w16cid="http://schemas.microsoft.com/office/word/2016/wordml/cid" xmlns:w16="http://schemas.microsoft.com/office/word/2018/wordml" xmlns:w16du="http://schemas.microsoft.com/office/word/2023/wordml/word16du" xmlns:w16sdtdh="http://schemas.microsoft.com/office/word/2020/wordml/sdtdatahash" xmlns:w16sdtfl="http://schemas.microsoft.com/office/word/2024/wordml/sdtformatlock" xmlns:w16se="http://schemas.microsoft.com/office/word/2015/wordml/symex" xmlns:wpg="http://schemas.microsoft.com/office/word/2010/wordprocessingGroup" xmlns:wpi="http://schemas.microsoft.com/office/word/2010/wordprocessingInk" xmlns:wne="http://schemas.microsoft.com/office/word/2006/wordml" xmlns:wps="http://schemas.microsoft.com/office/word/2010/wordprocessingShape" mc:Ignorable="w14 w15 w16se w16cid w16 w16cex w16sdtdh w16sdtfl w16du wp14">
   <w:body>
-    <w:p/>
+    <w:p>
+      <w:pPr>
+        <w:rPr>
+          <w:rFonts w:ascii="Times New Roman" w:eastAsia="Times New Roman" w:hAnsi="Times New Roman" w:cs="Times New Roman"/>
+          <w:kern w:val="0"/>
+          <w:lang w:eastAsia="en-GB"/>
+          <w14:ligatures w14:val="none"/>
+        </w:rPr>
+      </w:pPr>
+      <w:r>
+        <w:rPr>
+          <w:rFonts w:ascii="Times New Roman" w:eastAsia="Times New Roman" w:hAnsi="Times New Roman" w:cs="Times New Roman"/>
+          <w:noProof/>
+          <w:kern w:val="0"/>
+          <w:lang w:eastAsia="en-GB"/>
+        </w:rPr>
+        <w:pict w14:anchorId="7F00E05C">
+          <v:rect id="_x0000_i1038" alt="" style="width:451.3pt;height:.05pt;mso-width-percent:0;mso-height-percent:0;mso-width-percent:0;mso-height-percent:0" o:hralign="center" o:hrstd="t" o:hr="t" fillcolor="#a0a0a0" stroked="f"/>
+        </w:pict>
+      </w:r>
+    </w:p>
+    <w:p>
+      <w:pPr>
+        <w:spacing w:before="100" w:beforeAutospacing="1" w:after="100" w:afterAutospacing="1"/>
+        <w:outlineLvl w:val="1"/>
+        <w:rPr>
+          <w:rFonts w:ascii="Times New Roman" w:eastAsia="Times New Roman" w:hAnsi="Times New Roman" w:cs="Times New Roman"/>
+          <w:b/>
+          <w:bCs/>
+          <w:kern w:val="0"/>
+          <w:sz w:val="36"/>
+          <w:szCs w:val="36"/>
+          <w:lang w:eastAsia="en-GB"/>
+          <w14:ligatures w14:val="none"/>
+        </w:rPr>
+      </w:pPr>
+      <w:r>
+        <w:rPr>
+          <w:rFonts w:ascii="Times New Roman" w:eastAsia="Times New Roman" w:hAnsi="Times New Roman" w:cs="Times New Roman"/>
+          <w:b/>
+          <w:bCs/>
+          <w:kern w:val="0"/>
+          <w:sz w:val="36"/>
+          <w:szCs w:val="36"/>
+          <w:lang w:eastAsia="en-GB"/>
+          <w14:ligatures w14:val="none"/>
+        </w:rPr>
+        <w:t>Motivation</w:t>
+      </w:r>
+    </w:p>
+    <w:p>
+      <w:pPr>
+        <w:spacing w:before="100" w:beforeAutospacing="1" w:after="100" w:afterAutospacing="1"/>
+        <w:rPr>
+          <w:rFonts w:ascii="Times New Roman" w:eastAsia="Times New Roman" w:hAnsi="Times New Roman" w:cs="Times New Roman"/>
+          <w:kern w:val="0"/>
+          <w:lang w:eastAsia="en-GB"/>
+          <w14:ligatures w14:val="none"/>
+        </w:rPr>
+      </w:pPr>
+      <w:r>
+        <w:rPr>
+          <w:rFonts w:ascii="Times New Roman" w:eastAsia="Times New Roman" w:hAnsi="Times New Roman" w:cs="Times New Roman"/>
+          <w:kern w:val="0"/>
+          <w:lang w:eastAsia="en-GB"/>
+          <w14:ligatures w14:val="none"/>
+        </w:rPr>
+        <w:t xml:space="preserve">Antimicrobial resistance (AMR) </w:t>
+      </w:r>
+      <w:r>
+        <w:rPr>
+          <w:rFonts w:ascii="Times New Roman" w:eastAsia="Times New Roman" w:hAnsi="Times New Roman" w:cs="Times New Roman"/>
+          <w:kern w:val="0"/>
+          <w:lang w:eastAsia="en-GB"/>
+          <w14:ligatures w14:val="none"/>
+        </w:rPr>
+        <w:t xml:space="preserve">is a global epidemic and World Health Organisation priority. In 2019 it </w:t>
+      </w:r>
+      <w:r>
+        <w:rPr>
+          <w:rFonts w:ascii="Times New Roman" w:eastAsia="Times New Roman" w:hAnsi="Times New Roman" w:cs="Times New Roman"/>
+          <w:kern w:val="0"/>
+          <w:lang w:eastAsia="en-GB"/>
+          <w14:ligatures w14:val="none"/>
+        </w:rPr>
+        <w:t>kill</w:t>
+      </w:r>
+      <w:r>
+        <w:rPr>
+          <w:rFonts w:ascii="Times New Roman" w:eastAsia="Times New Roman" w:hAnsi="Times New Roman" w:cs="Times New Roman"/>
+          <w:kern w:val="0"/>
+          <w:lang w:eastAsia="en-GB"/>
+          <w14:ligatures w14:val="none"/>
+        </w:rPr>
+        <w:t>ed</w:t>
+      </w:r>
+      <w:r>
+        <w:rPr>
+          <w:rFonts w:ascii="Times New Roman" w:eastAsia="Times New Roman" w:hAnsi="Times New Roman" w:cs="Times New Roman"/>
+          <w:kern w:val="0"/>
+          <w:lang w:eastAsia="en-GB"/>
+          <w14:ligatures w14:val="none"/>
+        </w:rPr>
+        <w:t xml:space="preserve"> 1.27 million people and contributed to 4.95 million deaths worldwide</w:t>
+      </w:r>
+      <w:r>
+        <w:rPr>
+          <w:rFonts w:ascii="Times New Roman" w:eastAsia="Times New Roman" w:hAnsi="Times New Roman" w:cs="Times New Roman"/>
+          <w:kern w:val="0"/>
+          <w:lang w:eastAsia="en-GB"/>
+          <w14:ligatures w14:val="none"/>
+        </w:rPr>
+        <w:t xml:space="preserve"> and </w:t>
+      </w:r>
+      <w:r>
+        <w:rPr>
+          <w:rFonts w:ascii="Times New Roman" w:eastAsia="Times New Roman" w:hAnsi="Times New Roman" w:cs="Times New Roman"/>
+          <w:kern w:val="0"/>
+          <w:lang w:eastAsia="en-GB"/>
+          <w14:ligatures w14:val="none"/>
+        </w:rPr>
+        <w:t>projected</w:t>
+      </w:r>
+      <w:r>
+        <w:rPr>
+          <w:rFonts w:ascii="Times New Roman" w:eastAsia="Times New Roman" w:hAnsi="Times New Roman" w:cs="Times New Roman"/>
+          <w:kern w:val="0"/>
+          <w:lang w:eastAsia="en-GB"/>
+          <w14:ligatures w14:val="none"/>
+        </w:rPr>
+        <w:t xml:space="preserve"> </w:t>
+      </w:r>
+      <w:r>
+        <w:rPr>
+          <w:rFonts w:ascii="Times New Roman" w:eastAsia="Times New Roman" w:hAnsi="Times New Roman" w:cs="Times New Roman"/>
+          <w:kern w:val="0"/>
+          <w:lang w:eastAsia="en-GB"/>
+          <w14:ligatures w14:val="none"/>
+        </w:rPr>
+        <w:t>costs</w:t>
+      </w:r>
+      <w:r>
+        <w:rPr>
+          <w:rFonts w:ascii="Times New Roman" w:eastAsia="Times New Roman" w:hAnsi="Times New Roman" w:cs="Times New Roman"/>
+          <w:kern w:val="0"/>
+          <w:lang w:eastAsia="en-GB"/>
+          <w14:ligatures w14:val="none"/>
+        </w:rPr>
+        <w:t xml:space="preserve"> reach US$3.4 trillion in global GDP and over US$1 trillion in </w:t>
+      </w:r>
+      <w:r>
+        <w:rPr>
+          <w:rFonts w:ascii="Times New Roman" w:eastAsia="Times New Roman" w:hAnsi="Times New Roman" w:cs="Times New Roman"/>
+          <w:kern w:val="0"/>
+          <w:lang w:eastAsia="en-GB"/>
+          <w14:ligatures w14:val="none"/>
+        </w:rPr>
+        <w:t>direct</w:t>
+      </w:r>
+      <w:r>
+        <w:rPr>
+          <w:rFonts w:ascii="Times New Roman" w:eastAsia="Times New Roman" w:hAnsi="Times New Roman" w:cs="Times New Roman"/>
+          <w:kern w:val="0"/>
+          <w:lang w:eastAsia="en-GB"/>
+          <w14:ligatures w14:val="none"/>
+        </w:rPr>
+        <w:t xml:space="preserve"> healthcare costs by 2050. This crisis is driven not only by the spread of resistant strains between individuals and hospitals, but by continuous bacterial evolution within patients — acquiring resistance genes, developing antibiotic tolerance, and adapting to evade the immune system.</w:t>
+      </w:r>
+    </w:p>
+    <w:p>
+      <w:pPr>
+        <w:spacing w:before="100" w:beforeAutospacing="1" w:after="100" w:afterAutospacing="1"/>
+        <w:rPr>
+          <w:rFonts w:ascii="Times New Roman" w:eastAsia="Times New Roman" w:hAnsi="Times New Roman" w:cs="Times New Roman"/>
+          <w:kern w:val="0"/>
+          <w:lang w:eastAsia="en-GB"/>
+          <w14:ligatures w14:val="none"/>
+        </w:rPr>
+      </w:pPr>
+      <w:r>
+        <w:rPr>
+          <w:rFonts w:ascii="Times New Roman" w:eastAsia="Times New Roman" w:hAnsi="Times New Roman" w:cs="Times New Roman"/>
+          <w:kern w:val="0"/>
+          <w:lang w:eastAsia="en-GB"/>
+          <w14:ligatures w14:val="none"/>
+        </w:rPr>
+        <w:t>Despite this urgency, our predictive capacity remains profoundly limited. At the global level, we cannot reliably anticipate which strains will become epidemic, which resistance mechanisms will spread, or how pathogens evolve to specialise in human infection. At the clinical level, we still rely on culture and antimicrobial susceptibility testing (AST) — technology largely unchanged since the early twentieth century — that fails to predict treatment outcomes in many invasive and chronic infections. This fellowship addresses both levels directly, using population-scale genomics and machine learning to build and validate a practical prediction framework spanning global pathogen emergence to individual patient treatment decisions.</w:t>
+      </w:r>
+    </w:p>
+    <w:p>
+      <w:pPr>
+        <w:spacing w:before="100" w:beforeAutospacing="1" w:after="100" w:afterAutospacing="1"/>
+        <w:rPr>
+          <w:rFonts w:ascii="Times New Roman" w:eastAsia="Times New Roman" w:hAnsi="Times New Roman" w:cs="Times New Roman"/>
+          <w:kern w:val="0"/>
+          <w:lang w:eastAsia="en-GB"/>
+          <w14:ligatures w14:val="none"/>
+        </w:rPr>
+      </w:pPr>
+      <w:r>
+        <w:rPr>
+          <w:rFonts w:ascii="Times New Roman" w:eastAsia="Times New Roman" w:hAnsi="Times New Roman" w:cs="Times New Roman"/>
+          <w:i/>
+          <w:iCs/>
+          <w:kern w:val="0"/>
+          <w:lang w:eastAsia="en-GB"/>
+          <w14:ligatures w14:val="none"/>
+        </w:rPr>
+        <w:t>~160 words</w:t>
+      </w:r>
+    </w:p>
+    <w:p>
+      <w:pPr>
+        <w:rPr>
+          <w:rFonts w:ascii="Times New Roman" w:eastAsia="Times New Roman" w:hAnsi="Times New Roman" w:cs="Times New Roman"/>
+          <w:kern w:val="0"/>
+          <w:lang w:eastAsia="en-GB"/>
+          <w14:ligatures w14:val="none"/>
+        </w:rPr>
+      </w:pPr>
+      <w:r>
+        <w:rPr>
+          <w:rFonts w:ascii="Times New Roman" w:eastAsia="Times New Roman" w:hAnsi="Times New Roman" w:cs="Times New Roman"/>
+          <w:noProof/>
+          <w:kern w:val="0"/>
+          <w:lang w:eastAsia="en-GB"/>
+        </w:rPr>
+        <w:pict w14:anchorId="5CD63373">
+          <v:rect id="_x0000_i1037" alt="" style="width:451.3pt;height:.05pt;mso-width-percent:0;mso-height-percent:0;mso-width-percent:0;mso-height-percent:0" o:hralign="center" o:hrstd="t" o:hr="t" fillcolor="#a0a0a0" stroked="f"/>
+        </w:pict>
+      </w:r>
+    </w:p>
+    <w:p>
+      <w:pPr>
+        <w:spacing w:before="100" w:beforeAutospacing="1" w:after="100" w:afterAutospacing="1"/>
+        <w:outlineLvl w:val="1"/>
+        <w:rPr>
+          <w:rFonts w:ascii="Times New Roman" w:eastAsia="Times New Roman" w:hAnsi="Times New Roman" w:cs="Times New Roman"/>
+          <w:b/>
+          <w:bCs/>
+          <w:kern w:val="0"/>
+          <w:sz w:val="36"/>
+          <w:szCs w:val="36"/>
+          <w:lang w:eastAsia="en-GB"/>
+          <w14:ligatures w14:val="none"/>
+        </w:rPr>
+      </w:pPr>
+      <w:r>
+        <w:rPr>
+          <w:rFonts w:ascii="Times New Roman" w:eastAsia="Times New Roman" w:hAnsi="Times New Roman" w:cs="Times New Roman"/>
+          <w:b/>
+          <w:bCs/>
+          <w:kern w:val="0"/>
+          <w:sz w:val="36"/>
+          <w:szCs w:val="36"/>
+          <w:lang w:eastAsia="en-GB"/>
+          <w14:ligatures w14:val="none"/>
+        </w:rPr>
+        <w:t>Aims</w:t>
+      </w:r>
+    </w:p>
+    <w:p>
+      <w:pPr>
+        <w:spacing w:before="100" w:beforeAutospacing="1" w:after="100" w:afterAutospacing="1"/>
+        <w:rPr>
+          <w:rFonts w:ascii="Times New Roman" w:eastAsia="Times New Roman" w:hAnsi="Times New Roman" w:cs="Times New Roman"/>
+          <w:kern w:val="0"/>
+          <w:lang w:eastAsia="en-GB"/>
+          <w14:ligatures w14:val="none"/>
+        </w:rPr>
+      </w:pPr>
+      <w:r>
+        <w:rPr>
+          <w:rFonts w:ascii="Times New Roman" w:eastAsia="Times New Roman" w:hAnsi="Times New Roman" w:cs="Times New Roman"/>
+          <w:kern w:val="0"/>
+          <w:lang w:eastAsia="en-GB"/>
+          <w14:ligatures w14:val="none"/>
+        </w:rPr>
+        <w:t>This fellowship aims to:</w:t>
+      </w:r>
+    </w:p>
+    <w:p>
+      <w:pPr>
+        <w:numPr>
+          <w:ilvl w:val="0"/>
+          <w:numId w:val="1"/>
+        </w:numPr>
+        <w:spacing w:before="100" w:beforeAutospacing="1" w:after="100" w:afterAutospacing="1"/>
+        <w:rPr>
+          <w:rFonts w:ascii="Times New Roman" w:eastAsia="Times New Roman" w:hAnsi="Times New Roman" w:cs="Times New Roman"/>
+          <w:kern w:val="0"/>
+          <w:lang w:eastAsia="en-GB"/>
+          <w14:ligatures w14:val="none"/>
+        </w:rPr>
+      </w:pPr>
+      <w:r>
+        <w:rPr>
+          <w:rFonts w:ascii="Times New Roman" w:eastAsia="Times New Roman" w:hAnsi="Times New Roman" w:cs="Times New Roman"/>
+          <w:b/>
+          <w:bCs/>
+          <w:kern w:val="0"/>
+          <w:lang w:eastAsia="en-GB"/>
+          <w14:ligatures w14:val="none"/>
+        </w:rPr>
+        <w:t xml:space="preserve">Reconstruct the emergence, pathoadaptation, and horizontal gene transfer networks of </w:t>
+      </w:r>
+      <w:r>
+        <w:rPr>
+          <w:rFonts w:ascii="Times New Roman" w:eastAsia="Times New Roman" w:hAnsi="Times New Roman" w:cs="Times New Roman"/>
+          <w:b/>
+          <w:bCs/>
+          <w:i/>
+          <w:iCs/>
+          <w:kern w:val="0"/>
+          <w:lang w:eastAsia="en-GB"/>
+          <w14:ligatures w14:val="none"/>
+        </w:rPr>
+        <w:t>Klebsiella pneumoniae</w:t>
+      </w:r>
+      <w:r>
+        <w:rPr>
+          <w:rFonts w:ascii="Times New Roman" w:eastAsia="Times New Roman" w:hAnsi="Times New Roman" w:cs="Times New Roman"/>
+          <w:kern w:val="0"/>
+          <w:lang w:eastAsia="en-GB"/>
+          <w14:ligatures w14:val="none"/>
+        </w:rPr>
+        <w:t>, a globally expanding AMR pathogen, to define the evolutionary drivers of virulence and resistance dissemination.</w:t>
+      </w:r>
+    </w:p>
+    <w:p>
+      <w:pPr>
+        <w:numPr>
+          <w:ilvl w:val="0"/>
+          <w:numId w:val="1"/>
+        </w:numPr>
+        <w:spacing w:before="100" w:beforeAutospacing="1" w:after="100" w:afterAutospacing="1"/>
+        <w:rPr>
+          <w:rFonts w:ascii="Times New Roman" w:eastAsia="Times New Roman" w:hAnsi="Times New Roman" w:cs="Times New Roman"/>
+          <w:kern w:val="0"/>
+          <w:lang w:eastAsia="en-GB"/>
+          <w14:ligatures w14:val="none"/>
+        </w:rPr>
+      </w:pPr>
+      <w:r>
+        <w:rPr>
+          <w:rFonts w:ascii="Times New Roman" w:eastAsia="Times New Roman" w:hAnsi="Times New Roman" w:cs="Times New Roman"/>
+          <w:b/>
+          <w:bCs/>
+          <w:kern w:val="0"/>
+          <w:lang w:eastAsia="en-GB"/>
+          <w14:ligatures w14:val="none"/>
+        </w:rPr>
+        <w:t>Develop and validate next-generation machine learning models</w:t>
+      </w:r>
+      <w:r>
+        <w:rPr>
+          <w:rFonts w:ascii="Times New Roman" w:eastAsia="Times New Roman" w:hAnsi="Times New Roman" w:cs="Times New Roman"/>
+          <w:kern w:val="0"/>
+          <w:lang w:eastAsia="en-GB"/>
+          <w14:ligatures w14:val="none"/>
+        </w:rPr>
+        <w:t xml:space="preserve"> that predict antimicrobial resistance and invasive disease propensity directly from whole genome sequence, across </w:t>
+      </w:r>
+      <w:r>
+        <w:rPr>
+          <w:rFonts w:ascii="Times New Roman" w:eastAsia="Times New Roman" w:hAnsi="Times New Roman" w:cs="Times New Roman"/>
+          <w:i/>
+          <w:iCs/>
+          <w:kern w:val="0"/>
+          <w:lang w:eastAsia="en-GB"/>
+          <w14:ligatures w14:val="none"/>
+        </w:rPr>
+        <w:t>Klebsiella</w:t>
+      </w:r>
+      <w:r>
+        <w:rPr>
+          <w:rFonts w:ascii="Times New Roman" w:eastAsia="Times New Roman" w:hAnsi="Times New Roman" w:cs="Times New Roman"/>
+          <w:kern w:val="0"/>
+          <w:lang w:eastAsia="en-GB"/>
+          <w14:ligatures w14:val="none"/>
+        </w:rPr>
+        <w:t xml:space="preserve"> and </w:t>
+      </w:r>
+      <w:r>
+        <w:rPr>
+          <w:rFonts w:ascii="Times New Roman" w:eastAsia="Times New Roman" w:hAnsi="Times New Roman" w:cs="Times New Roman"/>
+          <w:i/>
+          <w:iCs/>
+          <w:kern w:val="0"/>
+          <w:lang w:eastAsia="en-GB"/>
+          <w14:ligatures w14:val="none"/>
+        </w:rPr>
+        <w:t>Pseudomonas aeruginosa</w:t>
+      </w:r>
+      <w:r>
+        <w:rPr>
+          <w:rFonts w:ascii="Times New Roman" w:eastAsia="Times New Roman" w:hAnsi="Times New Roman" w:cs="Times New Roman"/>
+          <w:kern w:val="0"/>
+          <w:lang w:eastAsia="en-GB"/>
+          <w14:ligatures w14:val="none"/>
+        </w:rPr>
+        <w:t>.</w:t>
+      </w:r>
+    </w:p>
+    <w:p>
+      <w:pPr>
+        <w:numPr>
+          <w:ilvl w:val="0"/>
+          <w:numId w:val="1"/>
+        </w:numPr>
+        <w:spacing w:before="100" w:beforeAutospacing="1" w:after="100" w:afterAutospacing="1"/>
+        <w:rPr>
+          <w:rFonts w:ascii="Times New Roman" w:eastAsia="Times New Roman" w:hAnsi="Times New Roman" w:cs="Times New Roman"/>
+          <w:kern w:val="0"/>
+          <w:lang w:eastAsia="en-GB"/>
+          <w14:ligatures w14:val="none"/>
+        </w:rPr>
+      </w:pPr>
+      <w:r>
+        <w:rPr>
+          <w:rFonts w:ascii="Times New Roman" w:eastAsia="Times New Roman" w:hAnsi="Times New Roman" w:cs="Times New Roman"/>
+          <w:b/>
+          <w:bCs/>
+          <w:kern w:val="0"/>
+          <w:lang w:eastAsia="en-GB"/>
+          <w14:ligatures w14:val="none"/>
+        </w:rPr>
+        <w:t>Predict clinical outcomes of antibiotic treatment</w:t>
+      </w:r>
+      <w:r>
+        <w:rPr>
+          <w:rFonts w:ascii="Times New Roman" w:eastAsia="Times New Roman" w:hAnsi="Times New Roman" w:cs="Times New Roman"/>
+          <w:kern w:val="0"/>
+          <w:lang w:eastAsia="en-GB"/>
+          <w14:ligatures w14:val="none"/>
+        </w:rPr>
+        <w:t xml:space="preserve"> in chronic respiratory infection by integrating pathogen genomics, strain dynamics, and clinical metadata — moving beyond the fundamental limitations of standard AST.</w:t>
+      </w:r>
+    </w:p>
+    <w:p>
+      <w:pPr>
+        <w:spacing w:before="100" w:beforeAutospacing="1" w:after="100" w:afterAutospacing="1"/>
+        <w:rPr>
+          <w:rFonts w:ascii="Times New Roman" w:eastAsia="Times New Roman" w:hAnsi="Times New Roman" w:cs="Times New Roman"/>
+          <w:kern w:val="0"/>
+          <w:lang w:eastAsia="en-GB"/>
+          <w14:ligatures w14:val="none"/>
+        </w:rPr>
+      </w:pPr>
+      <w:r>
+        <w:rPr>
+          <w:rFonts w:ascii="Times New Roman" w:eastAsia="Times New Roman" w:hAnsi="Times New Roman" w:cs="Times New Roman"/>
+          <w:kern w:val="0"/>
+          <w:lang w:eastAsia="en-GB"/>
+          <w14:ligatures w14:val="none"/>
+        </w:rPr>
+        <w:t>The overarching goal is a genomics-informed prediction framework, validated at population and clinical scale, that moves beyond binary "susceptible/resistant" reporting to support individualised antibiotic decisions.</w:t>
+      </w:r>
+    </w:p>
+    <w:p>
+      <w:pPr>
+        <w:spacing w:before="100" w:beforeAutospacing="1" w:after="100" w:afterAutospacing="1"/>
+        <w:rPr>
+          <w:rFonts w:ascii="Times New Roman" w:eastAsia="Times New Roman" w:hAnsi="Times New Roman" w:cs="Times New Roman"/>
+          <w:kern w:val="0"/>
+          <w:lang w:eastAsia="en-GB"/>
+          <w14:ligatures w14:val="none"/>
+        </w:rPr>
+      </w:pPr>
+      <w:r>
+        <w:rPr>
+          <w:rFonts w:ascii="Times New Roman" w:eastAsia="Times New Roman" w:hAnsi="Times New Roman" w:cs="Times New Roman"/>
+          <w:i/>
+          <w:iCs/>
+          <w:kern w:val="0"/>
+          <w:lang w:eastAsia="en-GB"/>
+          <w14:ligatures w14:val="none"/>
+        </w:rPr>
+        <w:t>~110 words</w:t>
+      </w:r>
+    </w:p>
+    <w:p>
+      <w:pPr>
+        <w:rPr>
+          <w:rFonts w:ascii="Times New Roman" w:eastAsia="Times New Roman" w:hAnsi="Times New Roman" w:cs="Times New Roman"/>
+          <w:kern w:val="0"/>
+          <w:lang w:eastAsia="en-GB"/>
+          <w14:ligatures w14:val="none"/>
+        </w:rPr>
+      </w:pPr>
+      <w:r>
+        <w:rPr>
+          <w:rFonts w:ascii="Times New Roman" w:eastAsia="Times New Roman" w:hAnsi="Times New Roman" w:cs="Times New Roman"/>
+          <w:noProof/>
+          <w:kern w:val="0"/>
+          <w:lang w:eastAsia="en-GB"/>
+        </w:rPr>
+        <w:pict w14:anchorId="7A921CEF">
+          <v:rect id="_x0000_i1036" alt="" style="width:451.3pt;height:.05pt;mso-width-percent:0;mso-height-percent:0;mso-width-percent:0;mso-height-percent:0" o:hralign="center" o:hrstd="t" o:hr="t" fillcolor="#a0a0a0" stroked="f"/>
+        </w:pict>
+      </w:r>
+    </w:p>
+    <w:p>
+      <w:pPr>
+        <w:rPr>
+          <w:rFonts w:ascii="Times New Roman" w:eastAsia="Times New Roman" w:hAnsi="Times New Roman" w:cs="Times New Roman"/>
+          <w:kern w:val="0"/>
+          <w:lang w:eastAsia="en-GB"/>
+          <w14:ligatures w14:val="none"/>
+        </w:rPr>
+      </w:pPr>
+      <w:r>
+        <w:rPr>
+          <w:rFonts w:ascii="Times New Roman" w:eastAsia="Times New Roman" w:hAnsi="Times New Roman" w:cs="Times New Roman"/>
+          <w:kern w:val="0"/>
+          <w:lang w:eastAsia="en-GB"/>
+          <w14:ligatures w14:val="none"/>
+        </w:rPr>
+        <w:br w:type="page"/>
+      </w:r>
+    </w:p>
+    <w:p>
+      <w:pPr>
+        <w:rPr>
+          <w:rFonts w:ascii="Times New Roman" w:eastAsia="Times New Roman" w:hAnsi="Times New Roman" w:cs="Times New Roman"/>
+          <w:kern w:val="0"/>
+          <w:lang w:eastAsia="en-GB"/>
+          <w14:ligatures w14:val="none"/>
+        </w:rPr>
+      </w:pPr>
+      <w:r>
+        <w:rPr>
+          <w:rFonts w:ascii="Times New Roman" w:eastAsia="Times New Roman" w:hAnsi="Times New Roman" w:cs="Times New Roman"/>
+          <w:noProof/>
+          <w:kern w:val="0"/>
+          <w:lang w:eastAsia="en-GB"/>
+        </w:rPr>
+        <w:lastRenderedPageBreak/>
+        <w:pict w14:anchorId="52538709">
+          <v:rect id="_x0000_i1035" alt="" style="width:451.3pt;height:.05pt;mso-width-percent:0;mso-height-percent:0;mso-width-percent:0;mso-height-percent:0" o:hralign="center" o:hrstd="t" o:hr="t" fillcolor="#a0a0a0" stroked="f"/>
+        </w:pict>
+      </w:r>
+    </w:p>
+    <w:p>
+      <w:pPr>
+        <w:spacing w:before="100" w:beforeAutospacing="1" w:after="100" w:afterAutospacing="1"/>
+        <w:outlineLvl w:val="1"/>
+        <w:rPr>
+          <w:rFonts w:ascii="Times New Roman" w:eastAsia="Times New Roman" w:hAnsi="Times New Roman" w:cs="Times New Roman"/>
+          <w:b/>
+          <w:bCs/>
+          <w:kern w:val="0"/>
+          <w:sz w:val="36"/>
+          <w:szCs w:val="36"/>
+          <w:lang w:eastAsia="en-GB"/>
+          <w14:ligatures w14:val="none"/>
+        </w:rPr>
+      </w:pPr>
+      <w:r>
+        <w:rPr>
+          <w:rFonts w:ascii="Times New Roman" w:eastAsia="Times New Roman" w:hAnsi="Times New Roman" w:cs="Times New Roman"/>
+          <w:b/>
+          <w:bCs/>
+          <w:kern w:val="0"/>
+          <w:sz w:val="36"/>
+          <w:szCs w:val="36"/>
+          <w:lang w:eastAsia="en-GB"/>
+          <w14:ligatures w14:val="none"/>
+        </w:rPr>
+        <w:t xml:space="preserve">WP1: Emergence and Pathoadaptation of </w:t>
+      </w:r>
+      <w:r>
+        <w:rPr>
+          <w:rFonts w:ascii="Times New Roman" w:eastAsia="Times New Roman" w:hAnsi="Times New Roman" w:cs="Times New Roman"/>
+          <w:b/>
+          <w:bCs/>
+          <w:i/>
+          <w:iCs/>
+          <w:kern w:val="0"/>
+          <w:sz w:val="36"/>
+          <w:szCs w:val="36"/>
+          <w:lang w:eastAsia="en-GB"/>
+          <w14:ligatures w14:val="none"/>
+        </w:rPr>
+        <w:t>Klebsiella pneumoniae</w:t>
+      </w:r>
+    </w:p>
+    <w:p>
+      <w:pPr>
+        <w:spacing w:before="100" w:beforeAutospacing="1" w:after="100" w:afterAutospacing="1"/>
+        <w:rPr>
+          <w:rFonts w:ascii="Times New Roman" w:eastAsia="Times New Roman" w:hAnsi="Times New Roman" w:cs="Times New Roman"/>
+          <w:kern w:val="0"/>
+          <w:lang w:eastAsia="en-GB"/>
+          <w14:ligatures w14:val="none"/>
+        </w:rPr>
+      </w:pPr>
+      <w:r>
+        <w:rPr>
+          <w:rFonts w:ascii="Times New Roman" w:eastAsia="Times New Roman" w:hAnsi="Times New Roman" w:cs="Times New Roman"/>
+          <w:b/>
+          <w:bCs/>
+          <w:kern w:val="0"/>
+          <w:lang w:eastAsia="en-GB"/>
+          <w14:ligatures w14:val="none"/>
+        </w:rPr>
+        <w:t>Objective:</w:t>
+      </w:r>
+      <w:r>
+        <w:rPr>
+          <w:rFonts w:ascii="Times New Roman" w:eastAsia="Times New Roman" w:hAnsi="Times New Roman" w:cs="Times New Roman"/>
+          <w:kern w:val="0"/>
+          <w:lang w:eastAsia="en-GB"/>
+          <w14:ligatures w14:val="none"/>
+        </w:rPr>
+        <w:t xml:space="preserve"> To reconstruct the evolutionary history, vertical mutational trajectories, and horizontal gene transfer (HGT) networks driving the global emergence, pathoadaptation, and antimicrobial resistance of </w:t>
+      </w:r>
+      <w:r>
+        <w:rPr>
+          <w:rFonts w:ascii="Times New Roman" w:eastAsia="Times New Roman" w:hAnsi="Times New Roman" w:cs="Times New Roman"/>
+          <w:i/>
+          <w:iCs/>
+          <w:kern w:val="0"/>
+          <w:lang w:eastAsia="en-GB"/>
+          <w14:ligatures w14:val="none"/>
+        </w:rPr>
+        <w:t>K. pneumoniae</w:t>
+      </w:r>
+      <w:r>
+        <w:rPr>
+          <w:rFonts w:ascii="Times New Roman" w:eastAsia="Times New Roman" w:hAnsi="Times New Roman" w:cs="Times New Roman"/>
+          <w:kern w:val="0"/>
+          <w:lang w:eastAsia="en-GB"/>
+          <w14:ligatures w14:val="none"/>
+        </w:rPr>
+        <w:t>.</w:t>
+      </w:r>
+    </w:p>
+    <w:p>
+      <w:pPr>
+        <w:spacing w:before="100" w:beforeAutospacing="1" w:after="100" w:afterAutospacing="1"/>
+        <w:outlineLvl w:val="1"/>
+        <w:rPr>
+          <w:rFonts w:ascii="Times New Roman" w:eastAsia="Times New Roman" w:hAnsi="Times New Roman" w:cs="Times New Roman"/>
+          <w:b/>
+          <w:bCs/>
+          <w:kern w:val="0"/>
+          <w:sz w:val="28"/>
+          <w:szCs w:val="28"/>
+          <w:lang w:eastAsia="en-GB"/>
+          <w14:ligatures w14:val="none"/>
+        </w:rPr>
+      </w:pPr>
+      <w:r>
+        <w:rPr>
+          <w:rFonts w:ascii="Times New Roman" w:eastAsia="Times New Roman" w:hAnsi="Times New Roman" w:cs="Times New Roman"/>
+          <w:b/>
+          <w:bCs/>
+          <w:kern w:val="0"/>
+          <w:sz w:val="28"/>
+          <w:szCs w:val="28"/>
+          <w:lang w:eastAsia="en-GB"/>
+          <w14:ligatures w14:val="none"/>
+        </w:rPr>
+        <w:t>Background</w:t>
+      </w:r>
+    </w:p>
+    <w:p>
+      <w:pPr>
+        <w:spacing w:before="100" w:beforeAutospacing="1" w:after="100" w:afterAutospacing="1"/>
+        <w:rPr>
+          <w:rFonts w:ascii="Times New Roman" w:eastAsia="Times New Roman" w:hAnsi="Times New Roman" w:cs="Times New Roman"/>
+          <w:kern w:val="0"/>
+          <w:lang w:eastAsia="en-GB"/>
+          <w14:ligatures w14:val="none"/>
+        </w:rPr>
+      </w:pPr>
+      <w:r>
+        <w:rPr>
+          <w:rFonts w:ascii="Times New Roman" w:eastAsia="Times New Roman" w:hAnsi="Times New Roman" w:cs="Times New Roman"/>
+          <w:kern w:val="0"/>
+          <w:lang w:eastAsia="en-GB"/>
+          <w14:ligatures w14:val="none"/>
+        </w:rPr>
+        <w:t xml:space="preserve">Bacterial pathogens adapt to human infection through two complementary mechanisms. Vertical pathoadaptation drives convergent mutation of the core and accessory genomes — rewiring global transcription to enable immune evasion and macrophage survival, as we demonstrated in </w:t>
+      </w:r>
+      <w:r>
+        <w:rPr>
+          <w:rFonts w:ascii="Times New Roman" w:eastAsia="Times New Roman" w:hAnsi="Times New Roman" w:cs="Times New Roman"/>
+          <w:i/>
+          <w:iCs/>
+          <w:kern w:val="0"/>
+          <w:lang w:eastAsia="en-GB"/>
+          <w14:ligatures w14:val="none"/>
+        </w:rPr>
+        <w:t>P. aeruginosa</w:t>
+      </w:r>
+      <w:r>
+        <w:rPr>
+          <w:rFonts w:ascii="Times New Roman" w:eastAsia="Times New Roman" w:hAnsi="Times New Roman" w:cs="Times New Roman"/>
+          <w:kern w:val="0"/>
+          <w:lang w:eastAsia="en-GB"/>
+          <w14:ligatures w14:val="none"/>
+        </w:rPr>
+        <w:t xml:space="preserve"> and </w:t>
+      </w:r>
+      <w:r>
+        <w:rPr>
+          <w:rFonts w:ascii="Times New Roman" w:eastAsia="Times New Roman" w:hAnsi="Times New Roman" w:cs="Times New Roman"/>
+          <w:i/>
+          <w:iCs/>
+          <w:kern w:val="0"/>
+          <w:lang w:eastAsia="en-GB"/>
+          <w14:ligatures w14:val="none"/>
+        </w:rPr>
+        <w:t>M. abscessus</w:t>
+      </w:r>
+      <w:r>
+        <w:rPr>
+          <w:rFonts w:ascii="Times New Roman" w:eastAsia="Times New Roman" w:hAnsi="Times New Roman" w:cs="Times New Roman"/>
+          <w:kern w:val="0"/>
+          <w:lang w:eastAsia="en-GB"/>
+          <w14:ligatures w14:val="none"/>
+        </w:rPr>
+        <w:t xml:space="preserve"> (Weimann et al., </w:t>
+      </w:r>
+      <w:r>
+        <w:rPr>
+          <w:rFonts w:ascii="Times New Roman" w:eastAsia="Times New Roman" w:hAnsi="Times New Roman" w:cs="Times New Roman"/>
+          <w:i/>
+          <w:iCs/>
+          <w:kern w:val="0"/>
+          <w:lang w:eastAsia="en-GB"/>
+          <w14:ligatures w14:val="none"/>
+        </w:rPr>
+        <w:t>Science</w:t>
+      </w:r>
+      <w:r>
+        <w:rPr>
+          <w:rFonts w:ascii="Times New Roman" w:eastAsia="Times New Roman" w:hAnsi="Times New Roman" w:cs="Times New Roman"/>
+          <w:kern w:val="0"/>
+          <w:lang w:eastAsia="en-GB"/>
+          <w14:ligatures w14:val="none"/>
+        </w:rPr>
+        <w:t xml:space="preserve"> 2024; Bryant et al., </w:t>
+      </w:r>
+      <w:r>
+        <w:rPr>
+          <w:rFonts w:ascii="Times New Roman" w:eastAsia="Times New Roman" w:hAnsi="Times New Roman" w:cs="Times New Roman"/>
+          <w:i/>
+          <w:iCs/>
+          <w:kern w:val="0"/>
+          <w:lang w:eastAsia="en-GB"/>
+          <w14:ligatures w14:val="none"/>
+        </w:rPr>
+        <w:t>Science</w:t>
+      </w:r>
+      <w:r>
+        <w:rPr>
+          <w:rFonts w:ascii="Times New Roman" w:eastAsia="Times New Roman" w:hAnsi="Times New Roman" w:cs="Times New Roman"/>
+          <w:kern w:val="0"/>
+          <w:lang w:eastAsia="en-GB"/>
+          <w14:ligatures w14:val="none"/>
+        </w:rPr>
+        <w:t xml:space="preserve"> 2021). Horizontal pathoadaptation via HGT enables saltatory leaps in fitness — through bacteriophage-mediated transfer, capsule locus acquisition, and plasmid uptake — as seen in </w:t>
+      </w:r>
+      <w:r>
+        <w:rPr>
+          <w:rFonts w:ascii="Times New Roman" w:eastAsia="Times New Roman" w:hAnsi="Times New Roman" w:cs="Times New Roman"/>
+          <w:i/>
+          <w:iCs/>
+          <w:kern w:val="0"/>
+          <w:lang w:eastAsia="en-GB"/>
+          <w14:ligatures w14:val="none"/>
+        </w:rPr>
+        <w:t>M. abscessus</w:t>
+      </w:r>
+      <w:r>
+        <w:rPr>
+          <w:rFonts w:ascii="Times New Roman" w:eastAsia="Times New Roman" w:hAnsi="Times New Roman" w:cs="Times New Roman"/>
+          <w:kern w:val="0"/>
+          <w:lang w:eastAsia="en-GB"/>
+          <w14:ligatures w14:val="none"/>
+        </w:rPr>
+        <w:t xml:space="preserve"> (Bryant et al., </w:t>
+      </w:r>
+      <w:r>
+        <w:rPr>
+          <w:rFonts w:ascii="Times New Roman" w:eastAsia="Times New Roman" w:hAnsi="Times New Roman" w:cs="Times New Roman"/>
+          <w:i/>
+          <w:iCs/>
+          <w:kern w:val="0"/>
+          <w:lang w:eastAsia="en-GB"/>
+          <w14:ligatures w14:val="none"/>
+        </w:rPr>
+        <w:t>Science</w:t>
+      </w:r>
+      <w:r>
+        <w:rPr>
+          <w:rFonts w:ascii="Times New Roman" w:eastAsia="Times New Roman" w:hAnsi="Times New Roman" w:cs="Times New Roman"/>
+          <w:kern w:val="0"/>
+          <w:lang w:eastAsia="en-GB"/>
+          <w14:ligatures w14:val="none"/>
+        </w:rPr>
+        <w:t xml:space="preserve"> 2016) and </w:t>
+      </w:r>
+      <w:r>
+        <w:rPr>
+          <w:rFonts w:ascii="Times New Roman" w:eastAsia="Times New Roman" w:hAnsi="Times New Roman" w:cs="Times New Roman"/>
+          <w:i/>
+          <w:iCs/>
+          <w:kern w:val="0"/>
+          <w:lang w:eastAsia="en-GB"/>
+          <w14:ligatures w14:val="none"/>
+        </w:rPr>
+        <w:t>Klebsiella</w:t>
+      </w:r>
+      <w:r>
+        <w:rPr>
+          <w:rFonts w:ascii="Times New Roman" w:eastAsia="Times New Roman" w:hAnsi="Times New Roman" w:cs="Times New Roman"/>
+          <w:kern w:val="0"/>
+          <w:lang w:eastAsia="en-GB"/>
+          <w14:ligatures w14:val="none"/>
+        </w:rPr>
+        <w:t xml:space="preserve"> (Holt et al.</w:t>
+      </w:r>
+      <w:r>
+        <w:rPr>
+          <w:rFonts w:ascii="Times New Roman" w:eastAsia="Times New Roman" w:hAnsi="Times New Roman" w:cs="Times New Roman"/>
+          <w:kern w:val="0"/>
+          <w:lang w:eastAsia="en-GB"/>
+          <w14:ligatures w14:val="none"/>
+        </w:rPr>
+        <w:t xml:space="preserve"> 2015</w:t>
+      </w:r>
+      <w:r>
+        <w:rPr>
+          <w:rFonts w:ascii="Times New Roman" w:eastAsia="Times New Roman" w:hAnsi="Times New Roman" w:cs="Times New Roman"/>
+          <w:kern w:val="0"/>
+          <w:lang w:eastAsia="en-GB"/>
+          <w14:ligatures w14:val="none"/>
+        </w:rPr>
+        <w:t xml:space="preserve">). Crucially, plasmids themselves have undergone profound evolutionary domestication in the post-antibiotic era: a minority of ancestral backbones have fused into large, self-transmissible, multi-replicon vectors that now drive global multidrug resistance dissemination (Cazares et al., </w:t>
+      </w:r>
+      <w:r>
+        <w:rPr>
+          <w:rFonts w:ascii="Times New Roman" w:eastAsia="Times New Roman" w:hAnsi="Times New Roman" w:cs="Times New Roman"/>
+          <w:i/>
+          <w:iCs/>
+          <w:kern w:val="0"/>
+          <w:lang w:eastAsia="en-GB"/>
+          <w14:ligatures w14:val="none"/>
+        </w:rPr>
+        <w:t>Science</w:t>
+      </w:r>
+      <w:r>
+        <w:rPr>
+          <w:rFonts w:ascii="Times New Roman" w:eastAsia="Times New Roman" w:hAnsi="Times New Roman" w:cs="Times New Roman"/>
+          <w:kern w:val="0"/>
+          <w:lang w:eastAsia="en-GB"/>
+          <w14:ligatures w14:val="none"/>
+        </w:rPr>
+        <w:t xml:space="preserve"> 2025).</w:t>
+      </w:r>
+    </w:p>
+    <w:p>
+      <w:pPr>
+        <w:spacing w:before="100" w:beforeAutospacing="1" w:after="100" w:afterAutospacing="1"/>
+        <w:rPr>
+          <w:rFonts w:ascii="Times New Roman" w:eastAsia="Times New Roman" w:hAnsi="Times New Roman" w:cs="Times New Roman"/>
+          <w:kern w:val="0"/>
+          <w:lang w:eastAsia="en-GB"/>
+          <w14:ligatures w14:val="none"/>
+        </w:rPr>
+      </w:pPr>
+      <w:r>
+        <w:rPr>
+          <w:rFonts w:ascii="Times New Roman" w:eastAsia="Times New Roman" w:hAnsi="Times New Roman" w:cs="Times New Roman"/>
+          <w:i/>
+          <w:iCs/>
+          <w:kern w:val="0"/>
+          <w:lang w:eastAsia="en-GB"/>
+          <w14:ligatures w14:val="none"/>
+        </w:rPr>
+        <w:t>K. pneumoniae</w:t>
+      </w:r>
+      <w:r>
+        <w:rPr>
+          <w:rFonts w:ascii="Times New Roman" w:eastAsia="Times New Roman" w:hAnsi="Times New Roman" w:cs="Times New Roman"/>
+          <w:kern w:val="0"/>
+          <w:lang w:eastAsia="en-GB"/>
+          <w14:ligatures w14:val="none"/>
+        </w:rPr>
+        <w:t xml:space="preserve"> makes these processes unusually tractable and important to study: it is a globally expanding AMR pathogen, a major cause of bacteraemia and respiratory mortality</w:t>
+      </w:r>
+      <w:r>
+        <w:rPr>
+          <w:rFonts w:ascii="Times New Roman" w:eastAsia="Times New Roman" w:hAnsi="Times New Roman" w:cs="Times New Roman"/>
+          <w:kern w:val="0"/>
+          <w:lang w:eastAsia="en-GB"/>
+          <w14:ligatures w14:val="none"/>
+        </w:rPr>
+        <w:t>,</w:t>
+      </w:r>
+      <w:r>
+        <w:rPr>
+          <w:rFonts w:ascii="Times New Roman" w:eastAsia="Times New Roman" w:hAnsi="Times New Roman" w:cs="Times New Roman"/>
+          <w:kern w:val="0"/>
+          <w:lang w:eastAsia="en-GB"/>
+          <w14:ligatures w14:val="none"/>
+        </w:rPr>
+        <w:t xml:space="preserve"> the most common cause of newborn fatality worldwide responsible for &gt; 100,000 deaths p.a</w:t>
+      </w:r>
+      <w:r>
+        <w:rPr>
+          <w:rFonts w:ascii="Times New Roman" w:eastAsia="Times New Roman" w:hAnsi="Times New Roman" w:cs="Times New Roman"/>
+          <w:kern w:val="0"/>
+          <w:lang w:eastAsia="en-GB"/>
+          <w14:ligatures w14:val="none"/>
+        </w:rPr>
+        <w:t xml:space="preserve">, and characterised by exceptionally frequent HGT, capsule recombination, and acquisition of large plasmids carrying both AMR and virulence determinants. The success of lineages such as ST258 likely reflects a complex and poorly understood interplay of these vertical and horizontal forces. Population-scale tools — whole-genome pangenome graphs (Panaroo), Bayesian </w:t>
+      </w:r>
+      <w:r>
+        <w:rPr>
+          <w:rFonts w:ascii="Times New Roman" w:eastAsia="Times New Roman" w:hAnsi="Times New Roman" w:cs="Times New Roman"/>
+          <w:kern w:val="0"/>
+          <w:lang w:eastAsia="en-GB"/>
+          <w14:ligatures w14:val="none"/>
+        </w:rPr>
+        <w:t>phylodynamic</w:t>
+      </w:r>
+      <w:r>
+        <w:rPr>
+          <w:rFonts w:ascii="Times New Roman" w:eastAsia="Times New Roman" w:hAnsi="Times New Roman" w:cs="Times New Roman"/>
+          <w:kern w:val="0"/>
+          <w:lang w:eastAsia="en-GB"/>
+          <w14:ligatures w14:val="none"/>
+        </w:rPr>
+        <w:t xml:space="preserve"> (BEAST), mixed-model GWAS (PySeer), and mobile element detection (ISEScan) — now make systematic interrogation of these processes across tens of thousands of genomes tractable for the first time.</w:t>
+      </w:r>
+    </w:p>
+    <w:p>
+      <w:pPr>
+        <w:spacing w:before="100" w:beforeAutospacing="1" w:after="100" w:afterAutospacing="1"/>
+        <w:rPr>
+          <w:rFonts w:ascii="Times New Roman" w:eastAsia="Times New Roman" w:hAnsi="Times New Roman" w:cs="Times New Roman"/>
+          <w:kern w:val="0"/>
+          <w:lang w:eastAsia="en-GB"/>
+          <w14:ligatures w14:val="none"/>
+        </w:rPr>
+      </w:pPr>
+      <w:r>
+        <w:rPr>
+          <w:rFonts w:ascii="Times New Roman" w:eastAsia="Times New Roman" w:hAnsi="Times New Roman" w:cs="Times New Roman"/>
+          <w:i/>
+          <w:iCs/>
+          <w:kern w:val="0"/>
+          <w:lang w:eastAsia="en-GB"/>
+          <w14:ligatures w14:val="none"/>
+        </w:rPr>
+        <w:t>~200 words</w:t>
+      </w:r>
+    </w:p>
+    <w:p>
+      <w:pPr>
+        <w:spacing w:before="100" w:beforeAutospacing="1" w:after="100" w:afterAutospacing="1"/>
+        <w:outlineLvl w:val="1"/>
+        <w:rPr>
+          <w:rFonts w:ascii="Times New Roman" w:eastAsia="Times New Roman" w:hAnsi="Times New Roman" w:cs="Times New Roman"/>
+          <w:b/>
+          <w:bCs/>
+          <w:kern w:val="0"/>
+          <w:sz w:val="28"/>
+          <w:szCs w:val="28"/>
+          <w:lang w:eastAsia="en-GB"/>
+          <w14:ligatures w14:val="none"/>
+        </w:rPr>
+      </w:pPr>
+      <w:r>
+        <w:rPr>
+          <w:rFonts w:ascii="Times New Roman" w:eastAsia="Times New Roman" w:hAnsi="Times New Roman" w:cs="Times New Roman"/>
+          <w:b/>
+          <w:bCs/>
+          <w:kern w:val="0"/>
+          <w:sz w:val="28"/>
+          <w:szCs w:val="28"/>
+          <w:lang w:eastAsia="en-GB"/>
+          <w14:ligatures w14:val="none"/>
+        </w:rPr>
+        <w:t>Preliminary Data</w:t>
+      </w:r>
+    </w:p>
+    <w:p>
+      <w:pPr>
+        <w:spacing w:before="100" w:beforeAutospacing="1" w:after="100" w:afterAutospacing="1"/>
+        <w:rPr>
+          <w:rFonts w:ascii="Times New Roman" w:eastAsia="Times New Roman" w:hAnsi="Times New Roman" w:cs="Times New Roman"/>
+          <w:kern w:val="0"/>
+          <w:lang w:eastAsia="en-GB"/>
+          <w14:ligatures w14:val="none"/>
+        </w:rPr>
+      </w:pPr>
+      <w:r>
+        <w:rPr>
+          <w:rFonts w:ascii="Times New Roman" w:eastAsia="Times New Roman" w:hAnsi="Times New Roman" w:cs="Times New Roman"/>
+          <w:kern w:val="0"/>
+          <w:lang w:eastAsia="en-GB"/>
+          <w14:ligatures w14:val="none"/>
+        </w:rPr>
+        <w:t>I have curated a global dataset of over 8</w:t>
+      </w:r>
+      <w:r>
+        <w:rPr>
+          <w:rFonts w:ascii="Times New Roman" w:eastAsia="Times New Roman" w:hAnsi="Times New Roman" w:cs="Times New Roman"/>
+          <w:kern w:val="0"/>
+          <w:lang w:eastAsia="en-GB"/>
+          <w14:ligatures w14:val="none"/>
+        </w:rPr>
+        <w:t>8</w:t>
+      </w:r>
+      <w:r>
+        <w:rPr>
+          <w:rFonts w:ascii="Times New Roman" w:eastAsia="Times New Roman" w:hAnsi="Times New Roman" w:cs="Times New Roman"/>
+          <w:kern w:val="0"/>
+          <w:lang w:eastAsia="en-GB"/>
+          <w14:ligatures w14:val="none"/>
+        </w:rPr>
+        <w:t xml:space="preserve">,000 </w:t>
+      </w:r>
+      <w:r>
+        <w:rPr>
+          <w:rFonts w:ascii="Times New Roman" w:eastAsia="Times New Roman" w:hAnsi="Times New Roman" w:cs="Times New Roman"/>
+          <w:i/>
+          <w:iCs/>
+          <w:kern w:val="0"/>
+          <w:lang w:eastAsia="en-GB"/>
+          <w14:ligatures w14:val="none"/>
+        </w:rPr>
+        <w:t>K. pneumoniae</w:t>
+      </w:r>
+      <w:r>
+        <w:rPr>
+          <w:rFonts w:ascii="Times New Roman" w:eastAsia="Times New Roman" w:hAnsi="Times New Roman" w:cs="Times New Roman"/>
+          <w:kern w:val="0"/>
+          <w:lang w:eastAsia="en-GB"/>
+          <w14:ligatures w14:val="none"/>
+        </w:rPr>
+        <w:t xml:space="preserve"> genomes</w:t>
+      </w:r>
+      <w:r>
+        <w:rPr>
+          <w:rFonts w:ascii="Times New Roman" w:eastAsia="Times New Roman" w:hAnsi="Times New Roman" w:cs="Times New Roman"/>
+          <w:kern w:val="0"/>
+          <w:lang w:eastAsia="en-GB"/>
+          <w14:ligatures w14:val="none"/>
+        </w:rPr>
+        <w:t xml:space="preserve"> (Figure 1)</w:t>
+      </w:r>
+      <w:r>
+        <w:rPr>
+          <w:rFonts w:ascii="Times New Roman" w:eastAsia="Times New Roman" w:hAnsi="Times New Roman" w:cs="Times New Roman"/>
+          <w:kern w:val="0"/>
+          <w:lang w:eastAsia="en-GB"/>
+          <w14:ligatures w14:val="none"/>
+        </w:rPr>
+        <w:t>, improving clinical metadata completeness from ~50% to &gt;80% across key categories</w:t>
+      </w:r>
+      <w:r>
+        <w:rPr>
+          <w:rFonts w:ascii="Times New Roman" w:eastAsia="Times New Roman" w:hAnsi="Times New Roman" w:cs="Times New Roman"/>
+          <w:kern w:val="0"/>
+          <w:lang w:eastAsia="en-GB"/>
+          <w14:ligatures w14:val="none"/>
+        </w:rPr>
+        <w:t xml:space="preserve"> (Figure 2)</w:t>
+      </w:r>
+      <w:r>
+        <w:rPr>
+          <w:rFonts w:ascii="Times New Roman" w:eastAsia="Times New Roman" w:hAnsi="Times New Roman" w:cs="Times New Roman"/>
+          <w:kern w:val="0"/>
+          <w:lang w:eastAsia="en-GB"/>
+          <w14:ligatures w14:val="none"/>
+        </w:rPr>
+        <w:t>. Exploratory analyses using Kleborate confirm broad global distribution, frequent capsular locus swapping, and routine exchange of exceptionally large genomic sections</w:t>
+      </w:r>
+      <w:r>
+        <w:rPr>
+          <w:rFonts w:ascii="Times New Roman" w:eastAsia="Times New Roman" w:hAnsi="Times New Roman" w:cs="Times New Roman"/>
+          <w:kern w:val="0"/>
+          <w:lang w:eastAsia="en-GB"/>
+          <w14:ligatures w14:val="none"/>
+        </w:rPr>
+        <w:t xml:space="preserve"> (Figure 3 and 4)</w:t>
+      </w:r>
+      <w:r>
+        <w:rPr>
+          <w:rFonts w:ascii="Times New Roman" w:eastAsia="Times New Roman" w:hAnsi="Times New Roman" w:cs="Times New Roman"/>
+          <w:kern w:val="0"/>
+          <w:lang w:eastAsia="en-GB"/>
+          <w14:ligatures w14:val="none"/>
+        </w:rPr>
+        <w:t xml:space="preserve"> — validating dataset quality and confirming the viability of high-resolution evolutionary modelling at this scale.</w:t>
+      </w:r>
+    </w:p>
+    <w:p>
+      <w:pPr>
+        <w:spacing w:before="100" w:beforeAutospacing="1" w:after="100" w:afterAutospacing="1"/>
+        <w:rPr>
+          <w:rFonts w:ascii="Times New Roman" w:eastAsia="Times New Roman" w:hAnsi="Times New Roman" w:cs="Times New Roman"/>
+          <w:kern w:val="0"/>
+          <w:lang w:eastAsia="en-GB"/>
+          <w14:ligatures w14:val="none"/>
+        </w:rPr>
+      </w:pPr>
+      <w:r>
+        <w:rPr>
+          <w:rFonts w:ascii="Times New Roman" w:eastAsia="Times New Roman" w:hAnsi="Times New Roman" w:cs="Times New Roman"/>
+          <w:i/>
+          <w:iCs/>
+          <w:kern w:val="0"/>
+          <w:lang w:eastAsia="en-GB"/>
+          <w14:ligatures w14:val="none"/>
+        </w:rPr>
+        <w:t>~60 words</w:t>
+      </w:r>
+    </w:p>
+    <w:p>
+      <w:pPr>
+        <w:spacing w:before="100" w:beforeAutospacing="1" w:after="100" w:afterAutospacing="1"/>
+        <w:outlineLvl w:val="1"/>
+        <w:rPr>
+          <w:rFonts w:ascii="Times New Roman" w:eastAsia="Times New Roman" w:hAnsi="Times New Roman" w:cs="Times New Roman"/>
+          <w:b/>
+          <w:bCs/>
+          <w:kern w:val="0"/>
+          <w:sz w:val="28"/>
+          <w:szCs w:val="28"/>
+          <w:lang w:eastAsia="en-GB"/>
+          <w14:ligatures w14:val="none"/>
+        </w:rPr>
+      </w:pPr>
+      <w:r>
+        <w:rPr>
+          <w:rFonts w:ascii="Times New Roman" w:eastAsia="Times New Roman" w:hAnsi="Times New Roman" w:cs="Times New Roman"/>
+          <w:b/>
+          <w:bCs/>
+          <w:kern w:val="0"/>
+          <w:sz w:val="28"/>
+          <w:szCs w:val="28"/>
+          <w:lang w:eastAsia="en-GB"/>
+          <w14:ligatures w14:val="none"/>
+        </w:rPr>
+        <w:t>Research Plan</w:t>
+      </w:r>
+    </w:p>
+    <w:p>
+      <w:pPr>
+        <w:spacing w:before="100" w:beforeAutospacing="1" w:after="100" w:afterAutospacing="1"/>
+        <w:rPr>
+          <w:rFonts w:ascii="Times New Roman" w:eastAsia="Times New Roman" w:hAnsi="Times New Roman" w:cs="Times New Roman"/>
+          <w:kern w:val="0"/>
+          <w:lang w:eastAsia="en-GB"/>
+          <w14:ligatures w14:val="none"/>
+        </w:rPr>
+      </w:pPr>
+      <w:r>
+        <w:rPr>
+          <w:rFonts w:ascii="Times New Roman" w:eastAsia="Times New Roman" w:hAnsi="Times New Roman" w:cs="Times New Roman"/>
+          <w:kern w:val="0"/>
+          <w:lang w:eastAsia="en-GB"/>
+          <w14:ligatures w14:val="none"/>
+        </w:rPr>
+        <w:lastRenderedPageBreak/>
+        <w:t>Working within our world-leading bioinformatics team (Weimann</w:t>
+      </w:r>
+      <w:r>
+        <w:rPr>
+          <w:rFonts w:ascii="Times New Roman" w:eastAsia="Times New Roman" w:hAnsi="Times New Roman" w:cs="Times New Roman"/>
+          <w:kern w:val="0"/>
+          <w:lang w:eastAsia="en-GB"/>
+          <w14:ligatures w14:val="none"/>
+        </w:rPr>
+        <w:t xml:space="preserve"> (ref)</w:t>
+      </w:r>
+      <w:r>
+        <w:rPr>
+          <w:rFonts w:ascii="Times New Roman" w:eastAsia="Times New Roman" w:hAnsi="Times New Roman" w:cs="Times New Roman"/>
+          <w:kern w:val="0"/>
+          <w:lang w:eastAsia="en-GB"/>
+          <w14:ligatures w14:val="none"/>
+        </w:rPr>
+        <w:t>, Dinan</w:t>
+      </w:r>
+      <w:r>
+        <w:rPr>
+          <w:rFonts w:ascii="Times New Roman" w:eastAsia="Times New Roman" w:hAnsi="Times New Roman" w:cs="Times New Roman"/>
+          <w:kern w:val="0"/>
+          <w:lang w:eastAsia="en-GB"/>
+          <w14:ligatures w14:val="none"/>
+        </w:rPr>
+        <w:t xml:space="preserve"> (ref)</w:t>
+      </w:r>
+      <w:r>
+        <w:rPr>
+          <w:rFonts w:ascii="Times New Roman" w:eastAsia="Times New Roman" w:hAnsi="Times New Roman" w:cs="Times New Roman"/>
+          <w:kern w:val="0"/>
+          <w:lang w:eastAsia="en-GB"/>
+          <w14:ligatures w14:val="none"/>
+        </w:rPr>
+        <w:t>, Figueroa</w:t>
+      </w:r>
+      <w:r>
+        <w:rPr>
+          <w:rFonts w:ascii="Times New Roman" w:eastAsia="Times New Roman" w:hAnsi="Times New Roman" w:cs="Times New Roman"/>
+          <w:kern w:val="0"/>
+          <w:lang w:eastAsia="en-GB"/>
+          <w14:ligatures w14:val="none"/>
+        </w:rPr>
+        <w:t xml:space="preserve"> (ref)</w:t>
+      </w:r>
+      <w:r>
+        <w:rPr>
+          <w:rFonts w:ascii="Times New Roman" w:eastAsia="Times New Roman" w:hAnsi="Times New Roman" w:cs="Times New Roman"/>
+          <w:kern w:val="0"/>
+          <w:lang w:eastAsia="en-GB"/>
+          <w14:ligatures w14:val="none"/>
+        </w:rPr>
+        <w:t>, Ruis</w:t>
+      </w:r>
+      <w:r>
+        <w:rPr>
+          <w:rFonts w:ascii="Times New Roman" w:eastAsia="Times New Roman" w:hAnsi="Times New Roman" w:cs="Times New Roman"/>
+          <w:kern w:val="0"/>
+          <w:lang w:eastAsia="en-GB"/>
+          <w14:ligatures w14:val="none"/>
+        </w:rPr>
+        <w:t xml:space="preserve"> (ref)</w:t>
+      </w:r>
+      <w:r>
+        <w:rPr>
+          <w:rFonts w:ascii="Times New Roman" w:eastAsia="Times New Roman" w:hAnsi="Times New Roman" w:cs="Times New Roman"/>
+          <w:kern w:val="0"/>
+          <w:lang w:eastAsia="en-GB"/>
+          <w14:ligatures w14:val="none"/>
+        </w:rPr>
+        <w:t>, Bruchmann</w:t>
+      </w:r>
+      <w:r>
+        <w:rPr>
+          <w:rFonts w:ascii="Times New Roman" w:eastAsia="Times New Roman" w:hAnsi="Times New Roman" w:cs="Times New Roman"/>
+          <w:kern w:val="0"/>
+          <w:lang w:eastAsia="en-GB"/>
+          <w14:ligatures w14:val="none"/>
+        </w:rPr>
+        <w:t xml:space="preserve"> (ref)</w:t>
+      </w:r>
+      <w:r>
+        <w:rPr>
+          <w:rFonts w:ascii="Times New Roman" w:eastAsia="Times New Roman" w:hAnsi="Times New Roman" w:cs="Times New Roman"/>
+          <w:kern w:val="0"/>
+          <w:lang w:eastAsia="en-GB"/>
+          <w14:ligatures w14:val="none"/>
+        </w:rPr>
+        <w:t>, Wiatrak</w:t>
+      </w:r>
+      <w:r>
+        <w:rPr>
+          <w:rFonts w:ascii="Times New Roman" w:eastAsia="Times New Roman" w:hAnsi="Times New Roman" w:cs="Times New Roman"/>
+          <w:kern w:val="0"/>
+          <w:lang w:eastAsia="en-GB"/>
+          <w14:ligatures w14:val="none"/>
+        </w:rPr>
+        <w:t xml:space="preserve"> (ref, in submission)</w:t>
+      </w:r>
+      <w:r>
+        <w:rPr>
+          <w:rFonts w:ascii="Times New Roman" w:eastAsia="Times New Roman" w:hAnsi="Times New Roman" w:cs="Times New Roman"/>
+          <w:kern w:val="0"/>
+          <w:lang w:eastAsia="en-GB"/>
+          <w14:ligatures w14:val="none"/>
+        </w:rPr>
+        <w:t xml:space="preserve">), the group effort will deliver: high-resolution </w:t>
+      </w:r>
+      <w:r>
+        <w:rPr>
+          <w:rFonts w:ascii="Times New Roman" w:eastAsia="Times New Roman" w:hAnsi="Times New Roman" w:cs="Times New Roman"/>
+          <w:b/>
+          <w:bCs/>
+          <w:kern w:val="0"/>
+          <w:lang w:eastAsia="en-GB"/>
+          <w14:ligatures w14:val="none"/>
+        </w:rPr>
+        <w:t>core genome phylogenies</w:t>
+      </w:r>
+      <w:r>
+        <w:rPr>
+          <w:rFonts w:ascii="Times New Roman" w:eastAsia="Times New Roman" w:hAnsi="Times New Roman" w:cs="Times New Roman"/>
+          <w:kern w:val="0"/>
+          <w:lang w:eastAsia="en-GB"/>
+          <w14:ligatures w14:val="none"/>
+        </w:rPr>
+        <w:t xml:space="preserve"> with Bayesian temporal reconstruction to date the emergence and global spread of epidemic lineages; scalable </w:t>
+      </w:r>
+      <w:r>
+        <w:rPr>
+          <w:rFonts w:ascii="Times New Roman" w:eastAsia="Times New Roman" w:hAnsi="Times New Roman" w:cs="Times New Roman"/>
+          <w:b/>
+          <w:bCs/>
+          <w:kern w:val="0"/>
+          <w:lang w:eastAsia="en-GB"/>
+          <w14:ligatures w14:val="none"/>
+        </w:rPr>
+        <w:t>pangenome analysis</w:t>
+      </w:r>
+      <w:r>
+        <w:rPr>
+          <w:rFonts w:ascii="Times New Roman" w:eastAsia="Times New Roman" w:hAnsi="Times New Roman" w:cs="Times New Roman"/>
+          <w:kern w:val="0"/>
+          <w:lang w:eastAsia="en-GB"/>
+          <w14:ligatures w14:val="none"/>
+        </w:rPr>
+        <w:t xml:space="preserve"> extending Panaroo to this unprecedented dataset in collaboration with the Lee lab and Tonkin-Hill; and </w:t>
+      </w:r>
+      <w:r>
+        <w:rPr>
+          <w:rFonts w:ascii="Times New Roman" w:eastAsia="Times New Roman" w:hAnsi="Times New Roman" w:cs="Times New Roman"/>
+          <w:b/>
+          <w:bCs/>
+          <w:kern w:val="0"/>
+          <w:lang w:eastAsia="en-GB"/>
+          <w14:ligatures w14:val="none"/>
+        </w:rPr>
+        <w:t>vertical pathoadaptation mapping</w:t>
+      </w:r>
+      <w:r>
+        <w:rPr>
+          <w:rFonts w:ascii="Times New Roman" w:eastAsia="Times New Roman" w:hAnsi="Times New Roman" w:cs="Times New Roman"/>
+          <w:kern w:val="0"/>
+          <w:lang w:eastAsia="en-GB"/>
+          <w14:ligatures w14:val="none"/>
+        </w:rPr>
+        <w:t xml:space="preserve"> using Poisson-based mutational burden tests and PySeer to identify convergent regulatory and gene-content hotspots.</w:t>
+      </w:r>
+    </w:p>
+    <w:p>
+      <w:pPr>
+        <w:spacing w:before="100" w:beforeAutospacing="1" w:after="100" w:afterAutospacing="1"/>
+        <w:rPr>
+          <w:rFonts w:ascii="Times New Roman" w:eastAsia="Times New Roman" w:hAnsi="Times New Roman" w:cs="Times New Roman"/>
+          <w:kern w:val="0"/>
+          <w:lang w:eastAsia="en-GB"/>
+          <w14:ligatures w14:val="none"/>
+        </w:rPr>
+      </w:pPr>
+      <w:r>
+        <w:rPr>
+          <w:rFonts w:ascii="Times New Roman" w:eastAsia="Times New Roman" w:hAnsi="Times New Roman" w:cs="Times New Roman"/>
+          <w:kern w:val="0"/>
+          <w:lang w:eastAsia="en-GB"/>
+          <w14:ligatures w14:val="none"/>
+        </w:rPr>
+        <w:t xml:space="preserve">My specific scientific leadership will focus on </w:t>
+      </w:r>
+      <w:r>
+        <w:rPr>
+          <w:rFonts w:ascii="Times New Roman" w:eastAsia="Times New Roman" w:hAnsi="Times New Roman" w:cs="Times New Roman"/>
+          <w:b/>
+          <w:bCs/>
+          <w:kern w:val="0"/>
+          <w:lang w:eastAsia="en-GB"/>
+          <w14:ligatures w14:val="none"/>
+        </w:rPr>
+        <w:t>horizontal pathoadaptation</w:t>
+      </w:r>
+      <w:r>
+        <w:rPr>
+          <w:rFonts w:ascii="Times New Roman" w:eastAsia="Times New Roman" w:hAnsi="Times New Roman" w:cs="Times New Roman"/>
+          <w:kern w:val="0"/>
+          <w:lang w:eastAsia="en-GB"/>
+          <w14:ligatures w14:val="none"/>
+        </w:rPr>
+        <w:t>. I will use ISEScan and MGEfinder to comprehensively characterise insertion sequences, transposons, and MGEs genome-wide; map these onto the Panaroo pangenome graph to resolve dynamic accessory genome structure; and reconstruct how specific plasmid backbones have fused and acquired AMR and virulence cassettes over time. Critically, I will integrate this horizontal variation against our enriched clinical metadata to determine the precise contributions of MGEs and plasmids to AMR phenotype, virulence, and invasive disease — isolating horizontal from vertical evolutionary mechanisms and identifying the specific fitness advantages conferred by each.</w:t>
+      </w:r>
+    </w:p>
+    <w:p>
+      <w:pPr>
+        <w:spacing w:before="100" w:beforeAutospacing="1" w:after="100" w:afterAutospacing="1"/>
+        <w:rPr>
+          <w:rFonts w:ascii="Times New Roman" w:eastAsia="Times New Roman" w:hAnsi="Times New Roman" w:cs="Times New Roman"/>
+          <w:kern w:val="0"/>
+          <w:lang w:eastAsia="en-GB"/>
+          <w14:ligatures w14:val="none"/>
+        </w:rPr>
+      </w:pPr>
+      <w:r>
+        <w:rPr>
+          <w:rFonts w:ascii="Times New Roman" w:eastAsia="Times New Roman" w:hAnsi="Times New Roman" w:cs="Times New Roman"/>
+          <w:i/>
+          <w:iCs/>
+          <w:kern w:val="0"/>
+          <w:lang w:eastAsia="en-GB"/>
+          <w14:ligatures w14:val="none"/>
+        </w:rPr>
+        <w:t>~190 words</w:t>
+      </w:r>
+    </w:p>
+    <w:p>
+      <w:pPr>
+        <w:spacing w:before="100" w:beforeAutospacing="1" w:after="100" w:afterAutospacing="1"/>
+        <w:outlineLvl w:val="1"/>
+        <w:rPr>
+          <w:rFonts w:ascii="Times New Roman" w:eastAsia="Times New Roman" w:hAnsi="Times New Roman" w:cs="Times New Roman"/>
+          <w:b/>
+          <w:bCs/>
+          <w:strike/>
+          <w:color w:val="BFBFBF" w:themeColor="background1" w:themeShade="BF"/>
+          <w:kern w:val="0"/>
+          <w:sz w:val="28"/>
+          <w:szCs w:val="28"/>
+          <w:lang w:eastAsia="en-GB"/>
+          <w14:ligatures w14:val="none"/>
+        </w:rPr>
+      </w:pPr>
+      <w:r>
+        <w:rPr>
+          <w:rFonts w:ascii="Times New Roman" w:eastAsia="Times New Roman" w:hAnsi="Times New Roman" w:cs="Times New Roman"/>
+          <w:b/>
+          <w:bCs/>
+          <w:strike/>
+          <w:color w:val="BFBFBF" w:themeColor="background1" w:themeShade="BF"/>
+          <w:kern w:val="0"/>
+          <w:sz w:val="28"/>
+          <w:szCs w:val="28"/>
+          <w:lang w:eastAsia="en-GB"/>
+          <w14:ligatures w14:val="none"/>
+        </w:rPr>
+        <w:t>Expected Outcomes</w:t>
+      </w:r>
+    </w:p>
+    <w:p>
+      <w:pPr>
+        <w:spacing w:before="100" w:beforeAutospacing="1" w:after="100" w:afterAutospacing="1"/>
+        <w:rPr>
+          <w:rFonts w:ascii="Times New Roman" w:eastAsia="Times New Roman" w:hAnsi="Times New Roman" w:cs="Times New Roman"/>
+          <w:strike/>
+          <w:color w:val="BFBFBF" w:themeColor="background1" w:themeShade="BF"/>
+          <w:kern w:val="0"/>
+          <w:lang w:eastAsia="en-GB"/>
+          <w14:ligatures w14:val="none"/>
+        </w:rPr>
+      </w:pPr>
+      <w:r>
+        <w:rPr>
+          <w:rFonts w:ascii="Times New Roman" w:eastAsia="Times New Roman" w:hAnsi="Times New Roman" w:cs="Times New Roman"/>
+          <w:strike/>
+          <w:color w:val="BFBFBF" w:themeColor="background1" w:themeShade="BF"/>
+          <w:kern w:val="0"/>
+          <w:lang w:eastAsia="en-GB"/>
+          <w14:ligatures w14:val="none"/>
+        </w:rPr>
+        <w:t xml:space="preserve">A high-resolution reconstruction of </w:t>
+      </w:r>
+      <w:r>
+        <w:rPr>
+          <w:rFonts w:ascii="Times New Roman" w:eastAsia="Times New Roman" w:hAnsi="Times New Roman" w:cs="Times New Roman"/>
+          <w:i/>
+          <w:iCs/>
+          <w:strike/>
+          <w:color w:val="BFBFBF" w:themeColor="background1" w:themeShade="BF"/>
+          <w:kern w:val="0"/>
+          <w:lang w:eastAsia="en-GB"/>
+          <w14:ligatures w14:val="none"/>
+        </w:rPr>
+        <w:t>K. pneumoniae</w:t>
+      </w:r>
+      <w:r>
+        <w:rPr>
+          <w:rFonts w:ascii="Times New Roman" w:eastAsia="Times New Roman" w:hAnsi="Times New Roman" w:cs="Times New Roman"/>
+          <w:strike/>
+          <w:color w:val="BFBFBF" w:themeColor="background1" w:themeShade="BF"/>
+          <w:kern w:val="0"/>
+          <w:lang w:eastAsia="en-GB"/>
+          <w14:ligatures w14:val="none"/>
+        </w:rPr>
+        <w:t xml:space="preserve"> global emergence and pathoadaptation; a systematic characterisation of plasmid diversity and domestication across 80,000 genomes; and mechanistic identification of the horizontal genetic events driving AMR and invasive disease — providing the evolutionary foundation for WP2's predictive models.</w:t>
+      </w:r>
+    </w:p>
+    <w:p>
+      <w:pPr>
+        <w:spacing w:before="100" w:beforeAutospacing="1" w:after="100" w:afterAutospacing="1"/>
+        <w:rPr>
+          <w:rFonts w:ascii="Times New Roman" w:eastAsia="Times New Roman" w:hAnsi="Times New Roman" w:cs="Times New Roman"/>
+          <w:strike/>
+          <w:color w:val="BFBFBF" w:themeColor="background1" w:themeShade="BF"/>
+          <w:kern w:val="0"/>
+          <w:lang w:eastAsia="en-GB"/>
+          <w14:ligatures w14:val="none"/>
+        </w:rPr>
+      </w:pPr>
+      <w:r>
+        <w:rPr>
+          <w:rFonts w:ascii="Times New Roman" w:eastAsia="Times New Roman" w:hAnsi="Times New Roman" w:cs="Times New Roman"/>
+          <w:i/>
+          <w:iCs/>
+          <w:strike/>
+          <w:color w:val="BFBFBF" w:themeColor="background1" w:themeShade="BF"/>
+          <w:kern w:val="0"/>
+          <w:lang w:eastAsia="en-GB"/>
+          <w14:ligatures w14:val="none"/>
+        </w:rPr>
+        <w:t>~45 words</w:t>
+      </w:r>
+    </w:p>
+    <w:p>
+      <w:pPr>
+        <w:rPr>
+          <w:rFonts w:ascii="Times New Roman" w:eastAsia="Times New Roman" w:hAnsi="Times New Roman" w:cs="Times New Roman"/>
+          <w:kern w:val="0"/>
+          <w:lang w:eastAsia="en-GB"/>
+          <w14:ligatures w14:val="none"/>
+        </w:rPr>
+      </w:pPr>
+      <w:r>
+        <w:rPr>
+          <w:rFonts w:ascii="Times New Roman" w:eastAsia="Times New Roman" w:hAnsi="Times New Roman" w:cs="Times New Roman"/>
+          <w:noProof/>
+          <w:kern w:val="0"/>
+          <w:lang w:eastAsia="en-GB"/>
+        </w:rPr>
+        <w:pict w14:anchorId="16DF3DC9">
+          <v:rect id="_x0000_i1034" alt="" style="width:451.3pt;height:.05pt;mso-width-percent:0;mso-height-percent:0;mso-width-percent:0;mso-height-percent:0" o:hralign="center" o:hrstd="t" o:hr="t" fillcolor="#a0a0a0" stroked="f"/>
+        </w:pict>
+      </w:r>
+    </w:p>
+    <w:p>
+      <w:pPr>
+        <w:spacing w:before="100" w:beforeAutospacing="1" w:after="100" w:afterAutospacing="1"/>
+        <w:rPr>
+          <w:rFonts w:ascii="Times New Roman" w:eastAsia="Times New Roman" w:hAnsi="Times New Roman" w:cs="Times New Roman"/>
+          <w:kern w:val="0"/>
+          <w:lang w:eastAsia="en-GB"/>
+          <w14:ligatures w14:val="none"/>
+        </w:rPr>
+      </w:pPr>
+      <w:r>
+        <w:rPr>
+          <w:rFonts w:ascii="Times New Roman" w:eastAsia="Times New Roman" w:hAnsi="Times New Roman" w:cs="Times New Roman"/>
+          <w:b/>
+          <w:bCs/>
+          <w:kern w:val="0"/>
+          <w:lang w:eastAsia="en-GB"/>
+          <w14:ligatures w14:val="none"/>
+        </w:rPr>
+        <w:t>WP1 total: ~495 words</w:t>
+      </w:r>
+    </w:p>
+    <w:p>
+      <w:pPr>
+        <w:rPr>
+          <w:rFonts w:ascii="Times New Roman" w:eastAsia="Times New Roman" w:hAnsi="Times New Roman" w:cs="Times New Roman"/>
+          <w:kern w:val="0"/>
+          <w:lang w:eastAsia="en-GB"/>
+          <w14:ligatures w14:val="none"/>
+        </w:rPr>
+      </w:pPr>
+      <w:r>
+        <w:rPr>
+          <w:rFonts w:ascii="Times New Roman" w:eastAsia="Times New Roman" w:hAnsi="Times New Roman" w:cs="Times New Roman"/>
+          <w:kern w:val="0"/>
+          <w:lang w:eastAsia="en-GB"/>
+          <w14:ligatures w14:val="none"/>
+        </w:rPr>
+        <w:br w:type="page"/>
+      </w:r>
+    </w:p>
+    <w:p>
+      <w:pPr>
+        <w:rPr>
+          <w:rFonts w:ascii="Times New Roman" w:eastAsia="Times New Roman" w:hAnsi="Times New Roman" w:cs="Times New Roman"/>
+          <w:kern w:val="0"/>
+          <w:lang w:eastAsia="en-GB"/>
+          <w14:ligatures w14:val="none"/>
+        </w:rPr>
+      </w:pPr>
+      <w:r>
+        <w:rPr>
+          <w:rFonts w:ascii="Times New Roman" w:eastAsia="Times New Roman" w:hAnsi="Times New Roman" w:cs="Times New Roman"/>
+          <w:noProof/>
+          <w:kern w:val="0"/>
+          <w:lang w:eastAsia="en-GB"/>
+        </w:rPr>
+        <w:lastRenderedPageBreak/>
+        <w:pict w14:anchorId="68B15AF8">
+          <v:rect id="_x0000_i1033" alt="" style="width:451.3pt;height:.05pt;mso-width-percent:0;mso-height-percent:0;mso-width-percent:0;mso-height-percent:0" o:hralign="center" o:hrstd="t" o:hr="t" fillcolor="#a0a0a0" stroked="f"/>
+        </w:pict>
+      </w:r>
+    </w:p>
+    <w:p>
+      <w:pPr>
+        <w:spacing w:before="100" w:beforeAutospacing="1" w:after="100" w:afterAutospacing="1"/>
+        <w:outlineLvl w:val="1"/>
+        <w:rPr>
+          <w:rFonts w:ascii="Times New Roman" w:eastAsia="Times New Roman" w:hAnsi="Times New Roman" w:cs="Times New Roman"/>
+          <w:b/>
+          <w:bCs/>
+          <w:kern w:val="0"/>
+          <w:sz w:val="36"/>
+          <w:szCs w:val="36"/>
+          <w:lang w:eastAsia="en-GB"/>
+          <w14:ligatures w14:val="none"/>
+        </w:rPr>
+      </w:pPr>
+      <w:r>
+        <w:rPr>
+          <w:rFonts w:ascii="Times New Roman" w:eastAsia="Times New Roman" w:hAnsi="Times New Roman" w:cs="Times New Roman"/>
+          <w:b/>
+          <w:bCs/>
+          <w:kern w:val="0"/>
+          <w:sz w:val="36"/>
+          <w:szCs w:val="36"/>
+          <w:lang w:eastAsia="en-GB"/>
+          <w14:ligatures w14:val="none"/>
+        </w:rPr>
+        <w:t xml:space="preserve">WP2: Genome-to-Phenotype Prediction in </w:t>
+      </w:r>
+      <w:r>
+        <w:rPr>
+          <w:rFonts w:ascii="Times New Roman" w:eastAsia="Times New Roman" w:hAnsi="Times New Roman" w:cs="Times New Roman"/>
+          <w:b/>
+          <w:bCs/>
+          <w:i/>
+          <w:iCs/>
+          <w:kern w:val="0"/>
+          <w:sz w:val="36"/>
+          <w:szCs w:val="36"/>
+          <w:lang w:eastAsia="en-GB"/>
+          <w14:ligatures w14:val="none"/>
+        </w:rPr>
+        <w:t>Klebsiella</w:t>
+      </w:r>
+      <w:r>
+        <w:rPr>
+          <w:rFonts w:ascii="Times New Roman" w:eastAsia="Times New Roman" w:hAnsi="Times New Roman" w:cs="Times New Roman"/>
+          <w:b/>
+          <w:bCs/>
+          <w:kern w:val="0"/>
+          <w:sz w:val="36"/>
+          <w:szCs w:val="36"/>
+          <w:lang w:eastAsia="en-GB"/>
+          <w14:ligatures w14:val="none"/>
+        </w:rPr>
+        <w:t xml:space="preserve"> and </w:t>
+      </w:r>
+      <w:r>
+        <w:rPr>
+          <w:rFonts w:ascii="Times New Roman" w:eastAsia="Times New Roman" w:hAnsi="Times New Roman" w:cs="Times New Roman"/>
+          <w:b/>
+          <w:bCs/>
+          <w:i/>
+          <w:iCs/>
+          <w:kern w:val="0"/>
+          <w:sz w:val="36"/>
+          <w:szCs w:val="36"/>
+          <w:lang w:eastAsia="en-GB"/>
+          <w14:ligatures w14:val="none"/>
+        </w:rPr>
+        <w:t>Pseudomonas aeruginosa</w:t>
+      </w:r>
+    </w:p>
+    <w:p>
+      <w:pPr>
+        <w:spacing w:before="100" w:beforeAutospacing="1" w:after="100" w:afterAutospacing="1"/>
+        <w:rPr>
+          <w:rFonts w:ascii="Times New Roman" w:eastAsia="Times New Roman" w:hAnsi="Times New Roman" w:cs="Times New Roman"/>
+          <w:kern w:val="0"/>
+          <w:lang w:eastAsia="en-GB"/>
+          <w14:ligatures w14:val="none"/>
+        </w:rPr>
+      </w:pPr>
+      <w:r>
+        <w:rPr>
+          <w:rFonts w:ascii="Times New Roman" w:eastAsia="Times New Roman" w:hAnsi="Times New Roman" w:cs="Times New Roman"/>
+          <w:b/>
+          <w:bCs/>
+          <w:kern w:val="0"/>
+          <w:lang w:eastAsia="en-GB"/>
+          <w14:ligatures w14:val="none"/>
+        </w:rPr>
+        <w:t>Objective:</w:t>
+      </w:r>
+      <w:r>
+        <w:rPr>
+          <w:rFonts w:ascii="Times New Roman" w:eastAsia="Times New Roman" w:hAnsi="Times New Roman" w:cs="Times New Roman"/>
+          <w:kern w:val="0"/>
+          <w:lang w:eastAsia="en-GB"/>
+          <w14:ligatures w14:val="none"/>
+        </w:rPr>
+        <w:t xml:space="preserve"> To develop and validate machine learning models that predict clinically critical phenotypes — antimicrobial resistance and invasive disease propensity — directly from whole genome sequence, and to characterise how mobile genetic elements are represented within genome-level embedding spaces.</w:t>
+      </w:r>
+    </w:p>
+    <w:p>
+      <w:pPr>
+        <w:spacing w:before="100" w:beforeAutospacing="1" w:after="100" w:afterAutospacing="1"/>
+        <w:outlineLvl w:val="1"/>
+        <w:rPr>
+          <w:rFonts w:ascii="Times New Roman" w:eastAsia="Times New Roman" w:hAnsi="Times New Roman" w:cs="Times New Roman"/>
+          <w:b/>
+          <w:bCs/>
+          <w:kern w:val="0"/>
+          <w:sz w:val="28"/>
+          <w:szCs w:val="28"/>
+          <w:lang w:eastAsia="en-GB"/>
+          <w14:ligatures w14:val="none"/>
+        </w:rPr>
+      </w:pPr>
+      <w:r>
+        <w:rPr>
+          <w:rFonts w:ascii="Times New Roman" w:eastAsia="Times New Roman" w:hAnsi="Times New Roman" w:cs="Times New Roman"/>
+          <w:b/>
+          <w:bCs/>
+          <w:kern w:val="0"/>
+          <w:sz w:val="28"/>
+          <w:szCs w:val="28"/>
+          <w:lang w:eastAsia="en-GB"/>
+          <w14:ligatures w14:val="none"/>
+        </w:rPr>
+        <w:t>Background</w:t>
+      </w:r>
+    </w:p>
+    <w:p>
+      <w:pPr>
+        <w:spacing w:before="100" w:beforeAutospacing="1" w:after="100" w:afterAutospacing="1"/>
+        <w:rPr>
+          <w:rFonts w:ascii="Times New Roman" w:eastAsia="Times New Roman" w:hAnsi="Times New Roman" w:cs="Times New Roman"/>
+          <w:kern w:val="0"/>
+          <w:lang w:eastAsia="en-GB"/>
+          <w14:ligatures w14:val="none"/>
+        </w:rPr>
+      </w:pPr>
+      <w:r>
+        <w:rPr>
+          <w:rFonts w:ascii="Times New Roman" w:eastAsia="Times New Roman" w:hAnsi="Times New Roman" w:cs="Times New Roman"/>
+          <w:kern w:val="0"/>
+          <w:lang w:eastAsia="en-GB"/>
+          <w14:ligatures w14:val="none"/>
+        </w:rPr>
+        <w:t>Translating bacterial genomes into phenotypic predictions has advanced through curated resistance gene catalogues (CARD, AMRFinderPlus) and bacterial GWAS, but these annotation-dependent approaches are blind to novel or understudied resistance determinants. Bacformer — a whole-genome transformer pretrained on 1.3 million bacterial genomes that models genomes as sequences of contextualised protein embeddings — predicts AMR with AUROC &gt;0.97 and identifies causal genetic determinants without prior annotation, representing a step change in genome-to-phenotype inference (Wiatrak, Abelson et al., in submission). A central ambition of this WP is to determine whether phenotypic AST can be replaced or substantially reduced in large-scale research workflows where WGS is already being performed.</w:t>
+      </w:r>
+    </w:p>
+    <w:p>
+      <w:pPr>
+        <w:spacing w:before="100" w:beforeAutospacing="1" w:after="100" w:afterAutospacing="1"/>
+        <w:rPr>
+          <w:rFonts w:ascii="Times New Roman" w:eastAsia="Times New Roman" w:hAnsi="Times New Roman" w:cs="Times New Roman"/>
+          <w:kern w:val="0"/>
+          <w:lang w:eastAsia="en-GB"/>
+          <w14:ligatures w14:val="none"/>
+        </w:rPr>
+      </w:pPr>
+      <w:r>
+        <w:rPr>
+          <w:rFonts w:ascii="Times New Roman" w:eastAsia="Times New Roman" w:hAnsi="Times New Roman" w:cs="Times New Roman"/>
+          <w:i/>
+          <w:iCs/>
+          <w:kern w:val="0"/>
+          <w:lang w:eastAsia="en-GB"/>
+          <w14:ligatures w14:val="none"/>
+        </w:rPr>
+        <w:t>~120 words</w:t>
+      </w:r>
+    </w:p>
+    <w:p>
+      <w:pPr>
+        <w:spacing w:before="100" w:beforeAutospacing="1" w:after="100" w:afterAutospacing="1"/>
+        <w:outlineLvl w:val="1"/>
+        <w:rPr>
+          <w:rFonts w:ascii="Times New Roman" w:eastAsia="Times New Roman" w:hAnsi="Times New Roman" w:cs="Times New Roman"/>
+          <w:b/>
+          <w:bCs/>
+          <w:kern w:val="0"/>
+          <w:sz w:val="28"/>
+          <w:szCs w:val="28"/>
+          <w:lang w:eastAsia="en-GB"/>
+          <w14:ligatures w14:val="none"/>
+        </w:rPr>
+      </w:pPr>
+      <w:r>
+        <w:rPr>
+          <w:rFonts w:ascii="Times New Roman" w:eastAsia="Times New Roman" w:hAnsi="Times New Roman" w:cs="Times New Roman"/>
+          <w:b/>
+          <w:bCs/>
+          <w:kern w:val="0"/>
+          <w:sz w:val="28"/>
+          <w:szCs w:val="28"/>
+          <w:lang w:eastAsia="en-GB"/>
+          <w14:ligatures w14:val="none"/>
+        </w:rPr>
+        <w:t>Preliminary Data</w:t>
+      </w:r>
+    </w:p>
+    <w:p>
+      <w:pPr>
+        <w:spacing w:before="100" w:beforeAutospacing="1" w:after="100" w:afterAutospacing="1"/>
+        <w:rPr>
+          <w:rFonts w:ascii="Times New Roman" w:eastAsia="Times New Roman" w:hAnsi="Times New Roman" w:cs="Times New Roman"/>
+          <w:kern w:val="0"/>
+          <w:lang w:eastAsia="en-GB"/>
+          <w14:ligatures w14:val="none"/>
+        </w:rPr>
+      </w:pPr>
+      <w:r>
+        <w:rPr>
+          <w:rFonts w:ascii="Times New Roman" w:eastAsia="Times New Roman" w:hAnsi="Times New Roman" w:cs="Times New Roman"/>
+          <w:kern w:val="0"/>
+          <w:lang w:eastAsia="en-GB"/>
+          <w14:ligatures w14:val="none"/>
+        </w:rPr>
+        <w:t xml:space="preserve">I have trained XGBoost models on AMRFinderPlus gene presence/absence profiles across </w:t>
+      </w:r>
+      <w:r>
+        <w:rPr>
+          <w:rFonts w:ascii="Times New Roman" w:eastAsia="Times New Roman" w:hAnsi="Times New Roman" w:cs="Times New Roman"/>
+          <w:i/>
+          <w:iCs/>
+          <w:kern w:val="0"/>
+          <w:lang w:eastAsia="en-GB"/>
+          <w14:ligatures w14:val="none"/>
+        </w:rPr>
+        <w:t>Klebsiella</w:t>
+      </w:r>
+      <w:r>
+        <w:rPr>
+          <w:rFonts w:ascii="Times New Roman" w:eastAsia="Times New Roman" w:hAnsi="Times New Roman" w:cs="Times New Roman"/>
+          <w:kern w:val="0"/>
+          <w:lang w:eastAsia="en-GB"/>
+          <w14:ligatures w14:val="none"/>
+        </w:rPr>
+        <w:t xml:space="preserve"> (n=1,200) and </w:t>
+      </w:r>
+      <w:r>
+        <w:rPr>
+          <w:rFonts w:ascii="Times New Roman" w:eastAsia="Times New Roman" w:hAnsi="Times New Roman" w:cs="Times New Roman"/>
+          <w:i/>
+          <w:iCs/>
+          <w:kern w:val="0"/>
+          <w:lang w:eastAsia="en-GB"/>
+          <w14:ligatures w14:val="none"/>
+        </w:rPr>
+        <w:t>P. aeruginosa</w:t>
+      </w:r>
+      <w:r>
+        <w:rPr>
+          <w:rFonts w:ascii="Times New Roman" w:eastAsia="Times New Roman" w:hAnsi="Times New Roman" w:cs="Times New Roman"/>
+          <w:kern w:val="0"/>
+          <w:lang w:eastAsia="en-GB"/>
+          <w14:ligatures w14:val="none"/>
+        </w:rPr>
+        <w:t xml:space="preserve"> (n=450), achieving AUROC 0.80–0.99 across antibiotics in both species — demonstrating that even modest training sets support high-accuracy resistance prediction. Initial fine-tuned Bacformer embeddings achieve AUROC &gt;0.97 in preliminary analyses. These results, generated with our ML team (Wiatrak, Weimann), substantially de-risk the central aims and provide a strong platform for scaling to the full dataset, including a high-powered EBI dataset of &gt;7,000 isolates with phenotypic AST results across 23 antibiotics.</w:t>
+      </w:r>
+    </w:p>
+    <w:p>
+      <w:pPr>
+        <w:spacing w:before="100" w:beforeAutospacing="1" w:after="100" w:afterAutospacing="1"/>
+        <w:rPr>
+          <w:rFonts w:ascii="Times New Roman" w:eastAsia="Times New Roman" w:hAnsi="Times New Roman" w:cs="Times New Roman"/>
+          <w:kern w:val="0"/>
+          <w:lang w:eastAsia="en-GB"/>
+          <w14:ligatures w14:val="none"/>
+        </w:rPr>
+      </w:pPr>
+      <w:r>
+        <w:rPr>
+          <w:rFonts w:ascii="Times New Roman" w:eastAsia="Times New Roman" w:hAnsi="Times New Roman" w:cs="Times New Roman"/>
+          <w:i/>
+          <w:iCs/>
+          <w:kern w:val="0"/>
+          <w:lang w:eastAsia="en-GB"/>
+          <w14:ligatures w14:val="none"/>
+        </w:rPr>
+        <w:t>~95 words</w:t>
+      </w:r>
+    </w:p>
+    <w:p>
+      <w:pPr>
+        <w:spacing w:before="100" w:beforeAutospacing="1" w:after="100" w:afterAutospacing="1"/>
+        <w:outlineLvl w:val="1"/>
+        <w:rPr>
+          <w:rFonts w:ascii="Times New Roman" w:eastAsia="Times New Roman" w:hAnsi="Times New Roman" w:cs="Times New Roman"/>
+          <w:b/>
+          <w:bCs/>
+          <w:kern w:val="0"/>
+          <w:sz w:val="28"/>
+          <w:szCs w:val="28"/>
+          <w:lang w:eastAsia="en-GB"/>
+          <w14:ligatures w14:val="none"/>
+        </w:rPr>
+      </w:pPr>
+      <w:r>
+        <w:rPr>
+          <w:rFonts w:ascii="Times New Roman" w:eastAsia="Times New Roman" w:hAnsi="Times New Roman" w:cs="Times New Roman"/>
+          <w:b/>
+          <w:bCs/>
+          <w:kern w:val="0"/>
+          <w:sz w:val="28"/>
+          <w:szCs w:val="28"/>
+          <w:lang w:eastAsia="en-GB"/>
+          <w14:ligatures w14:val="none"/>
+        </w:rPr>
+        <w:t>Research Plan</w:t>
+      </w:r>
+    </w:p>
+    <w:p>
+      <w:pPr>
+        <w:spacing w:before="100" w:beforeAutospacing="1" w:after="100" w:afterAutospacing="1"/>
+        <w:rPr>
+          <w:rFonts w:ascii="Times New Roman" w:eastAsia="Times New Roman" w:hAnsi="Times New Roman" w:cs="Times New Roman"/>
+          <w:kern w:val="0"/>
+          <w:lang w:eastAsia="en-GB"/>
+          <w14:ligatures w14:val="none"/>
+        </w:rPr>
+      </w:pPr>
+      <w:r>
+        <w:rPr>
+          <w:rFonts w:ascii="Times New Roman" w:eastAsia="Times New Roman" w:hAnsi="Times New Roman" w:cs="Times New Roman"/>
+          <w:b/>
+          <w:bCs/>
+          <w:kern w:val="0"/>
+          <w:lang w:eastAsia="en-GB"/>
+          <w14:ligatures w14:val="none"/>
+        </w:rPr>
+        <w:t>a) AMR Prediction.</w:t>
+      </w:r>
+      <w:r>
+        <w:rPr>
+          <w:rFonts w:ascii="Times New Roman" w:eastAsia="Times New Roman" w:hAnsi="Times New Roman" w:cs="Times New Roman"/>
+          <w:kern w:val="0"/>
+          <w:lang w:eastAsia="en-GB"/>
+          <w14:ligatures w14:val="none"/>
+        </w:rPr>
+        <w:t xml:space="preserve"> I will pursue three complementary modelling strategies. First, fine-tuning Bacformer with a linear head trained on whole-genome embeddings, capturing epistatic and regulatory interactions invisible to gene catalogue approaches. Second, XGBoost on AMRFinderPlus profiles as a rigorous interpretable baseline, enabling direct quantitative comparison of annotation-dependent versus annotation-free approaches. Third — most innovatively — a hybrid architecture augmenting each protein embedding with AMRFinderPlus annotations, testing whether prior biological knowledge can enrich deep </w:t>
+      </w:r>
+      <w:r>
+        <w:rPr>
+          <w:rFonts w:ascii="Times New Roman" w:eastAsia="Times New Roman" w:hAnsi="Times New Roman" w:cs="Times New Roman"/>
+          <w:kern w:val="0"/>
+          <w:lang w:eastAsia="en-GB"/>
+          <w14:ligatures w14:val="none"/>
+        </w:rPr>
+        <w:lastRenderedPageBreak/>
+        <w:t xml:space="preserve">learning representations and improve generalisation to novel resistance determinants. All models will be extended to </w:t>
+      </w:r>
+      <w:r>
+        <w:rPr>
+          <w:rFonts w:ascii="Times New Roman" w:eastAsia="Times New Roman" w:hAnsi="Times New Roman" w:cs="Times New Roman"/>
+          <w:i/>
+          <w:iCs/>
+          <w:kern w:val="0"/>
+          <w:lang w:eastAsia="en-GB"/>
+          <w14:ligatures w14:val="none"/>
+        </w:rPr>
+        <w:t>P. aeruginosa</w:t>
+      </w:r>
+      <w:r>
+        <w:rPr>
+          <w:rFonts w:ascii="Times New Roman" w:eastAsia="Times New Roman" w:hAnsi="Times New Roman" w:cs="Times New Roman"/>
+          <w:kern w:val="0"/>
+          <w:lang w:eastAsia="en-GB"/>
+          <w14:ligatures w14:val="none"/>
+        </w:rPr>
+        <w:t xml:space="preserve"> for systematic cross-species comparison.</w:t>
+      </w:r>
+    </w:p>
+    <w:p>
+      <w:pPr>
+        <w:spacing w:before="100" w:beforeAutospacing="1" w:after="100" w:afterAutospacing="1"/>
+        <w:rPr>
+          <w:rFonts w:ascii="Times New Roman" w:eastAsia="Times New Roman" w:hAnsi="Times New Roman" w:cs="Times New Roman"/>
+          <w:kern w:val="0"/>
+          <w:lang w:eastAsia="en-GB"/>
+          <w14:ligatures w14:val="none"/>
+        </w:rPr>
+      </w:pPr>
+      <w:r>
+        <w:rPr>
+          <w:rFonts w:ascii="Times New Roman" w:eastAsia="Times New Roman" w:hAnsi="Times New Roman" w:cs="Times New Roman"/>
+          <w:b/>
+          <w:bCs/>
+          <w:kern w:val="0"/>
+          <w:lang w:eastAsia="en-GB"/>
+          <w14:ligatures w14:val="none"/>
+        </w:rPr>
+        <w:t>b) Invasive Disease Prediction.</w:t>
+      </w:r>
+      <w:r>
+        <w:rPr>
+          <w:rFonts w:ascii="Times New Roman" w:eastAsia="Times New Roman" w:hAnsi="Times New Roman" w:cs="Times New Roman"/>
+          <w:kern w:val="0"/>
+          <w:lang w:eastAsia="en-GB"/>
+          <w14:ligatures w14:val="none"/>
+        </w:rPr>
+        <w:t xml:space="preserve"> Using isolation source as a proxy, I have assembled a </w:t>
+      </w:r>
+      <w:r>
+        <w:rPr>
+          <w:rFonts w:ascii="Times New Roman" w:eastAsia="Times New Roman" w:hAnsi="Times New Roman" w:cs="Times New Roman"/>
+          <w:i/>
+          <w:iCs/>
+          <w:kern w:val="0"/>
+          <w:lang w:eastAsia="en-GB"/>
+          <w14:ligatures w14:val="none"/>
+        </w:rPr>
+        <w:t>Klebsiella</w:t>
+      </w:r>
+      <w:r>
+        <w:rPr>
+          <w:rFonts w:ascii="Times New Roman" w:eastAsia="Times New Roman" w:hAnsi="Times New Roman" w:cs="Times New Roman"/>
+          <w:kern w:val="0"/>
+          <w:lang w:eastAsia="en-GB"/>
+          <w14:ligatures w14:val="none"/>
+        </w:rPr>
+        <w:t xml:space="preserve"> dataset stratified by blood versus stool isolation. Initial Bacformer predictions yield AUROC 0.65 — above chance but indicating a more complex, multifactorial phenotype than resistance. To improve this, I will: run PySeer GWAS to identify capsule loci and plasmid-borne virulence genes from WP1 as additional features; train XGBoost on Bacformer embeddings as a non-linear alternative; and extend to multi-class modelling across respiratory, urine, wound, and abscess sources. A next-generation hybrid protein and DNA language model (PLM+DNALM, available June 2026) will be fine-tuned to test whether non-coding genomic context — regulatory elements and intergenic regions absent from current Bacformer input — resolves the performance deficit.</w:t>
+      </w:r>
+    </w:p>
+    <w:p>
+      <w:pPr>
+        <w:spacing w:before="100" w:beforeAutospacing="1" w:after="100" w:afterAutospacing="1"/>
+        <w:rPr>
+          <w:rFonts w:ascii="Times New Roman" w:eastAsia="Times New Roman" w:hAnsi="Times New Roman" w:cs="Times New Roman"/>
+          <w:kern w:val="0"/>
+          <w:lang w:eastAsia="en-GB"/>
+          <w14:ligatures w14:val="none"/>
+        </w:rPr>
+      </w:pPr>
+      <w:r>
+        <w:rPr>
+          <w:rFonts w:ascii="Times New Roman" w:eastAsia="Times New Roman" w:hAnsi="Times New Roman" w:cs="Times New Roman"/>
+          <w:b/>
+          <w:bCs/>
+          <w:kern w:val="0"/>
+          <w:lang w:eastAsia="en-GB"/>
+          <w14:ligatures w14:val="none"/>
+        </w:rPr>
+        <w:t>c) Plasmid Representation.</w:t>
+      </w:r>
+      <w:r>
+        <w:rPr>
+          <w:rFonts w:ascii="Times New Roman" w:eastAsia="Times New Roman" w:hAnsi="Times New Roman" w:cs="Times New Roman"/>
+          <w:kern w:val="0"/>
+          <w:lang w:eastAsia="en-GB"/>
+          <w14:ligatures w14:val="none"/>
+        </w:rPr>
+        <w:t xml:space="preserve"> Plasmids present a fundamental architectural challenge: as mobile elements transferring between distantly related bacteria, it is unclear whether Bacformer captures their cross-lineage contribution to resistance dissemination. I will embed </w:t>
+      </w:r>
+      <w:r>
+        <w:rPr>
+          <w:rFonts w:ascii="Times New Roman" w:eastAsia="Times New Roman" w:hAnsi="Times New Roman" w:cs="Times New Roman"/>
+          <w:i/>
+          <w:iCs/>
+          <w:kern w:val="0"/>
+          <w:lang w:eastAsia="en-GB"/>
+          <w14:ligatures w14:val="none"/>
+        </w:rPr>
+        <w:t>Klebsiella</w:t>
+      </w:r>
+      <w:r>
+        <w:rPr>
+          <w:rFonts w:ascii="Times New Roman" w:eastAsia="Times New Roman" w:hAnsi="Times New Roman" w:cs="Times New Roman"/>
+          <w:kern w:val="0"/>
+          <w:lang w:eastAsia="en-GB"/>
+          <w14:ligatures w14:val="none"/>
+        </w:rPr>
+        <w:t xml:space="preserve"> genomes stratified by plasmid content from WP1 and examine whether bacteria sharing a plasmid cluster together in embedding space irrespective of chromosomal background. Failure to cluster would identify a significant model limitation and directly motivate architectural modifications — such as plasmid-specific positional encoding or separate plasmid/chromosome training streams — fed back into ongoing Bacformer development.</w:t>
+      </w:r>
+    </w:p>
+    <w:p>
+      <w:pPr>
+        <w:spacing w:before="100" w:beforeAutospacing="1" w:after="100" w:afterAutospacing="1"/>
+        <w:rPr>
+          <w:rFonts w:ascii="Times New Roman" w:eastAsia="Times New Roman" w:hAnsi="Times New Roman" w:cs="Times New Roman"/>
+          <w:kern w:val="0"/>
+          <w:lang w:eastAsia="en-GB"/>
+          <w14:ligatures w14:val="none"/>
+        </w:rPr>
+      </w:pPr>
+      <w:r>
+        <w:rPr>
+          <w:rFonts w:ascii="Times New Roman" w:eastAsia="Times New Roman" w:hAnsi="Times New Roman" w:cs="Times New Roman"/>
+          <w:i/>
+          <w:iCs/>
+          <w:kern w:val="0"/>
+          <w:lang w:eastAsia="en-GB"/>
+          <w14:ligatures w14:val="none"/>
+        </w:rPr>
+        <w:t>~280 words</w:t>
+      </w:r>
+    </w:p>
+    <w:p>
+      <w:pPr>
+        <w:spacing w:before="100" w:beforeAutospacing="1" w:after="100" w:afterAutospacing="1"/>
+        <w:outlineLvl w:val="1"/>
+        <w:rPr>
+          <w:rFonts w:ascii="Times New Roman" w:eastAsia="Times New Roman" w:hAnsi="Times New Roman" w:cs="Times New Roman"/>
+          <w:b/>
+          <w:bCs/>
+          <w:strike/>
+          <w:color w:val="BFBFBF" w:themeColor="background1" w:themeShade="BF"/>
+          <w:kern w:val="0"/>
+          <w:sz w:val="28"/>
+          <w:szCs w:val="28"/>
+          <w:lang w:eastAsia="en-GB"/>
+          <w14:ligatures w14:val="none"/>
+        </w:rPr>
+      </w:pPr>
+      <w:r>
+        <w:rPr>
+          <w:rFonts w:ascii="Times New Roman" w:eastAsia="Times New Roman" w:hAnsi="Times New Roman" w:cs="Times New Roman"/>
+          <w:b/>
+          <w:bCs/>
+          <w:strike/>
+          <w:color w:val="BFBFBF" w:themeColor="background1" w:themeShade="BF"/>
+          <w:kern w:val="0"/>
+          <w:sz w:val="28"/>
+          <w:szCs w:val="28"/>
+          <w:lang w:eastAsia="en-GB"/>
+          <w14:ligatures w14:val="none"/>
+        </w:rPr>
+        <w:t>Expected Outcomes</w:t>
+      </w:r>
+    </w:p>
+    <w:p>
+      <w:pPr>
+        <w:spacing w:before="100" w:beforeAutospacing="1" w:after="100" w:afterAutospacing="1"/>
+        <w:rPr>
+          <w:rFonts w:ascii="Times New Roman" w:eastAsia="Times New Roman" w:hAnsi="Times New Roman" w:cs="Times New Roman"/>
+          <w:strike/>
+          <w:color w:val="BFBFBF" w:themeColor="background1" w:themeShade="BF"/>
+          <w:kern w:val="0"/>
+          <w:lang w:eastAsia="en-GB"/>
+          <w14:ligatures w14:val="none"/>
+        </w:rPr>
+      </w:pPr>
+      <w:r>
+        <w:rPr>
+          <w:rFonts w:ascii="Times New Roman" w:eastAsia="Times New Roman" w:hAnsi="Times New Roman" w:cs="Times New Roman"/>
+          <w:strike/>
+          <w:color w:val="BFBFBF" w:themeColor="background1" w:themeShade="BF"/>
+          <w:kern w:val="0"/>
+          <w:lang w:eastAsia="en-GB"/>
+          <w14:ligatures w14:val="none"/>
+        </w:rPr>
+        <w:t xml:space="preserve">Validated AMR prediction models for </w:t>
+      </w:r>
+      <w:r>
+        <w:rPr>
+          <w:rFonts w:ascii="Times New Roman" w:eastAsia="Times New Roman" w:hAnsi="Times New Roman" w:cs="Times New Roman"/>
+          <w:i/>
+          <w:iCs/>
+          <w:strike/>
+          <w:color w:val="BFBFBF" w:themeColor="background1" w:themeShade="BF"/>
+          <w:kern w:val="0"/>
+          <w:lang w:eastAsia="en-GB"/>
+          <w14:ligatures w14:val="none"/>
+        </w:rPr>
+        <w:t>Klebsiella</w:t>
+      </w:r>
+      <w:r>
+        <w:rPr>
+          <w:rFonts w:ascii="Times New Roman" w:eastAsia="Times New Roman" w:hAnsi="Times New Roman" w:cs="Times New Roman"/>
+          <w:strike/>
+          <w:color w:val="BFBFBF" w:themeColor="background1" w:themeShade="BF"/>
+          <w:kern w:val="0"/>
+          <w:lang w:eastAsia="en-GB"/>
+          <w14:ligatures w14:val="none"/>
+        </w:rPr>
+        <w:t xml:space="preserve"> and </w:t>
+      </w:r>
+      <w:r>
+        <w:rPr>
+          <w:rFonts w:ascii="Times New Roman" w:eastAsia="Times New Roman" w:hAnsi="Times New Roman" w:cs="Times New Roman"/>
+          <w:i/>
+          <w:iCs/>
+          <w:strike/>
+          <w:color w:val="BFBFBF" w:themeColor="background1" w:themeShade="BF"/>
+          <w:kern w:val="0"/>
+          <w:lang w:eastAsia="en-GB"/>
+          <w14:ligatures w14:val="none"/>
+        </w:rPr>
+        <w:t>P. aeruginosa</w:t>
+      </w:r>
+      <w:r>
+        <w:rPr>
+          <w:rFonts w:ascii="Times New Roman" w:eastAsia="Times New Roman" w:hAnsi="Times New Roman" w:cs="Times New Roman"/>
+          <w:strike/>
+          <w:color w:val="BFBFBF" w:themeColor="background1" w:themeShade="BF"/>
+          <w:kern w:val="0"/>
+          <w:lang w:eastAsia="en-GB"/>
+          <w14:ligatures w14:val="none"/>
+        </w:rPr>
+        <w:t xml:space="preserve"> at AUROC &gt;0.95; quantified comparison of annotation-dependent, deep learning, and hybrid strategies; a multi-label genomic predictor of </w:t>
+      </w:r>
+      <w:r>
+        <w:rPr>
+          <w:rFonts w:ascii="Times New Roman" w:eastAsia="Times New Roman" w:hAnsi="Times New Roman" w:cs="Times New Roman"/>
+          <w:i/>
+          <w:iCs/>
+          <w:strike/>
+          <w:color w:val="BFBFBF" w:themeColor="background1" w:themeShade="BF"/>
+          <w:kern w:val="0"/>
+          <w:lang w:eastAsia="en-GB"/>
+          <w14:ligatures w14:val="none"/>
+        </w:rPr>
+        <w:t>Klebsiella</w:t>
+      </w:r>
+      <w:r>
+        <w:rPr>
+          <w:rFonts w:ascii="Times New Roman" w:eastAsia="Times New Roman" w:hAnsi="Times New Roman" w:cs="Times New Roman"/>
+          <w:strike/>
+          <w:color w:val="BFBFBF" w:themeColor="background1" w:themeShade="BF"/>
+          <w:kern w:val="0"/>
+          <w:lang w:eastAsia="en-GB"/>
+          <w14:ligatures w14:val="none"/>
+        </w:rPr>
+        <w:t xml:space="preserve"> tissue tropism; and a mechanistic characterisation of plasmid representation in Bacformer with a principled framework for architectural improvement — directly informing WP3's clinical prediction models.</w:t>
+      </w:r>
+    </w:p>
+    <w:p>
+      <w:pPr>
+        <w:spacing w:before="100" w:beforeAutospacing="1" w:after="100" w:afterAutospacing="1"/>
+        <w:rPr>
+          <w:rFonts w:ascii="Times New Roman" w:eastAsia="Times New Roman" w:hAnsi="Times New Roman" w:cs="Times New Roman"/>
+          <w:kern w:val="0"/>
+          <w:lang w:eastAsia="en-GB"/>
+          <w14:ligatures w14:val="none"/>
+        </w:rPr>
+      </w:pPr>
+      <w:r>
+        <w:rPr>
+          <w:rFonts w:ascii="Times New Roman" w:eastAsia="Times New Roman" w:hAnsi="Times New Roman" w:cs="Times New Roman"/>
+          <w:i/>
+          <w:iCs/>
+          <w:kern w:val="0"/>
+          <w:lang w:eastAsia="en-GB"/>
+          <w14:ligatures w14:val="none"/>
+        </w:rPr>
+        <w:t>~55 words</w:t>
+      </w:r>
+    </w:p>
+    <w:p>
+      <w:pPr>
+        <w:rPr>
+          <w:rFonts w:ascii="Times New Roman" w:eastAsia="Times New Roman" w:hAnsi="Times New Roman" w:cs="Times New Roman"/>
+          <w:kern w:val="0"/>
+          <w:lang w:eastAsia="en-GB"/>
+          <w14:ligatures w14:val="none"/>
+        </w:rPr>
+      </w:pPr>
+      <w:r>
+        <w:rPr>
+          <w:rFonts w:ascii="Times New Roman" w:eastAsia="Times New Roman" w:hAnsi="Times New Roman" w:cs="Times New Roman"/>
+          <w:noProof/>
+          <w:kern w:val="0"/>
+          <w:lang w:eastAsia="en-GB"/>
+        </w:rPr>
+        <w:pict w14:anchorId="26FC2797">
+          <v:rect id="_x0000_i1032" alt="" style="width:451.3pt;height:.05pt;mso-width-percent:0;mso-height-percent:0;mso-width-percent:0;mso-height-percent:0" o:hralign="center" o:hrstd="t" o:hr="t" fillcolor="#a0a0a0" stroked="f"/>
+        </w:pict>
+      </w:r>
+    </w:p>
+    <w:p>
+      <w:pPr>
+        <w:spacing w:before="100" w:beforeAutospacing="1" w:after="100" w:afterAutospacing="1"/>
+        <w:rPr>
+          <w:rFonts w:ascii="Times New Roman" w:eastAsia="Times New Roman" w:hAnsi="Times New Roman" w:cs="Times New Roman"/>
+          <w:kern w:val="0"/>
+          <w:lang w:eastAsia="en-GB"/>
+          <w14:ligatures w14:val="none"/>
+        </w:rPr>
+      </w:pPr>
+      <w:r>
+        <w:rPr>
+          <w:rFonts w:ascii="Times New Roman" w:eastAsia="Times New Roman" w:hAnsi="Times New Roman" w:cs="Times New Roman"/>
+          <w:b/>
+          <w:bCs/>
+          <w:kern w:val="0"/>
+          <w:lang w:eastAsia="en-GB"/>
+          <w14:ligatures w14:val="none"/>
+        </w:rPr>
+        <w:t>WP2 total: ~550 words</w:t>
+      </w:r>
+      <w:r>
+        <w:rPr>
+          <w:rFonts w:ascii="Times New Roman" w:eastAsia="Times New Roman" w:hAnsi="Times New Roman" w:cs="Times New Roman"/>
+          <w:kern w:val="0"/>
+          <w:lang w:eastAsia="en-GB"/>
+          <w14:ligatures w14:val="none"/>
+        </w:rPr>
+        <w:t xml:space="preserve"> — marginally over target but carrying three distinct sub-aims</w:t>
+      </w:r>
+    </w:p>
+    <w:p>
+      <w:pPr>
+        <w:rPr>
+          <w:rFonts w:ascii="Times New Roman" w:eastAsia="Times New Roman" w:hAnsi="Times New Roman" w:cs="Times New Roman"/>
+          <w:kern w:val="0"/>
+          <w:lang w:eastAsia="en-GB"/>
+          <w14:ligatures w14:val="none"/>
+        </w:rPr>
+      </w:pPr>
+      <w:r>
+        <w:rPr>
+          <w:rFonts w:ascii="Times New Roman" w:eastAsia="Times New Roman" w:hAnsi="Times New Roman" w:cs="Times New Roman"/>
+          <w:kern w:val="0"/>
+          <w:lang w:eastAsia="en-GB"/>
+          <w14:ligatures w14:val="none"/>
+        </w:rPr>
+        <w:br w:type="page"/>
+      </w:r>
+    </w:p>
+    <w:p>
+      <w:pPr>
+        <w:rPr>
+          <w:rFonts w:ascii="Times New Roman" w:eastAsia="Times New Roman" w:hAnsi="Times New Roman" w:cs="Times New Roman"/>
+          <w:kern w:val="0"/>
+          <w:lang w:eastAsia="en-GB"/>
+          <w14:ligatures w14:val="none"/>
+        </w:rPr>
+      </w:pPr>
+      <w:r>
+        <w:rPr>
+          <w:rFonts w:ascii="Times New Roman" w:eastAsia="Times New Roman" w:hAnsi="Times New Roman" w:cs="Times New Roman"/>
+          <w:noProof/>
+          <w:kern w:val="0"/>
+          <w:lang w:eastAsia="en-GB"/>
+        </w:rPr>
+        <w:lastRenderedPageBreak/>
+        <w:pict w14:anchorId="0EF8EA5A">
+          <v:rect id="_x0000_i1031" alt="" style="width:451.3pt;height:.05pt;mso-width-percent:0;mso-height-percent:0;mso-width-percent:0;mso-height-percent:0" o:hralign="center" o:hrstd="t" o:hr="t" fillcolor="#a0a0a0" stroked="f"/>
+        </w:pict>
+      </w:r>
+    </w:p>
+    <w:p>
+      <w:pPr>
+        <w:spacing w:before="100" w:beforeAutospacing="1" w:after="100" w:afterAutospacing="1"/>
+        <w:outlineLvl w:val="1"/>
+        <w:rPr>
+          <w:rFonts w:ascii="Times New Roman" w:eastAsia="Times New Roman" w:hAnsi="Times New Roman" w:cs="Times New Roman"/>
+          <w:b/>
+          <w:bCs/>
+          <w:kern w:val="0"/>
+          <w:sz w:val="36"/>
+          <w:szCs w:val="36"/>
+          <w:lang w:eastAsia="en-GB"/>
+          <w14:ligatures w14:val="none"/>
+        </w:rPr>
+      </w:pPr>
+      <w:r>
+        <w:rPr>
+          <w:rFonts w:ascii="Times New Roman" w:eastAsia="Times New Roman" w:hAnsi="Times New Roman" w:cs="Times New Roman"/>
+          <w:b/>
+          <w:bCs/>
+          <w:kern w:val="0"/>
+          <w:sz w:val="36"/>
+          <w:szCs w:val="36"/>
+          <w:lang w:eastAsia="en-GB"/>
+          <w14:ligatures w14:val="none"/>
+        </w:rPr>
+        <w:t>WP3: Clinical Antibiotic Prediction in Chronic Lung Infection</w:t>
+      </w:r>
+    </w:p>
+    <w:p>
+      <w:pPr>
+        <w:spacing w:before="100" w:beforeAutospacing="1" w:after="100" w:afterAutospacing="1"/>
+        <w:rPr>
+          <w:rFonts w:ascii="Times New Roman" w:eastAsia="Times New Roman" w:hAnsi="Times New Roman" w:cs="Times New Roman"/>
+          <w:kern w:val="0"/>
+          <w:lang w:eastAsia="en-GB"/>
+          <w14:ligatures w14:val="none"/>
+        </w:rPr>
+      </w:pPr>
+      <w:r>
+        <w:rPr>
+          <w:rFonts w:ascii="Times New Roman" w:eastAsia="Times New Roman" w:hAnsi="Times New Roman" w:cs="Times New Roman"/>
+          <w:b/>
+          <w:bCs/>
+          <w:kern w:val="0"/>
+          <w:lang w:eastAsia="en-GB"/>
+          <w14:ligatures w14:val="none"/>
+        </w:rPr>
+        <w:t>Objective:</w:t>
+      </w:r>
+      <w:r>
+        <w:rPr>
+          <w:rFonts w:ascii="Times New Roman" w:eastAsia="Times New Roman" w:hAnsi="Times New Roman" w:cs="Times New Roman"/>
+          <w:kern w:val="0"/>
+          <w:lang w:eastAsia="en-GB"/>
+          <w14:ligatures w14:val="none"/>
+        </w:rPr>
+        <w:t xml:space="preserve"> To determine whether whole genome sequence data, integrated with longitudinal clinical metadata, can predict antibiotic treatment efficacy in chronic respiratory infection — moving beyond the fundamental limitations of standard culture and AST — and to characterise the microbial and genomic mechanisms underlying treatment failure.</w:t>
+      </w:r>
+    </w:p>
+    <w:p>
+      <w:pPr>
+        <w:spacing w:before="100" w:beforeAutospacing="1" w:after="100" w:afterAutospacing="1"/>
+        <w:outlineLvl w:val="1"/>
+        <w:rPr>
+          <w:rFonts w:ascii="Times New Roman" w:eastAsia="Times New Roman" w:hAnsi="Times New Roman" w:cs="Times New Roman"/>
+          <w:b/>
+          <w:bCs/>
+          <w:kern w:val="0"/>
+          <w:sz w:val="36"/>
+          <w:szCs w:val="36"/>
+          <w:lang w:eastAsia="en-GB"/>
+          <w14:ligatures w14:val="none"/>
+        </w:rPr>
+      </w:pPr>
+      <w:r>
+        <w:rPr>
+          <w:rFonts w:ascii="Times New Roman" w:eastAsia="Times New Roman" w:hAnsi="Times New Roman" w:cs="Times New Roman"/>
+          <w:b/>
+          <w:bCs/>
+          <w:kern w:val="0"/>
+          <w:sz w:val="36"/>
+          <w:szCs w:val="36"/>
+          <w:lang w:eastAsia="en-GB"/>
+          <w14:ligatures w14:val="none"/>
+        </w:rPr>
+        <w:t>Background</w:t>
+      </w:r>
+    </w:p>
+    <w:p>
+      <w:pPr>
+        <w:spacing w:before="100" w:beforeAutospacing="1" w:after="100" w:afterAutospacing="1"/>
+        <w:rPr>
+          <w:rFonts w:ascii="Times New Roman" w:eastAsia="Times New Roman" w:hAnsi="Times New Roman" w:cs="Times New Roman"/>
+          <w:kern w:val="0"/>
+          <w:lang w:eastAsia="en-GB"/>
+          <w14:ligatures w14:val="none"/>
+        </w:rPr>
+      </w:pPr>
+      <w:r>
+        <w:rPr>
+          <w:rFonts w:ascii="Times New Roman" w:eastAsia="Times New Roman" w:hAnsi="Times New Roman" w:cs="Times New Roman"/>
+          <w:kern w:val="0"/>
+          <w:lang w:eastAsia="en-GB"/>
+          <w14:ligatures w14:val="none"/>
+        </w:rPr>
+        <w:t>Standard AST performs remarkably poorly as a predictor of clinical outcome in chronic lung infection. In P. aeruginosa pulmonary exacerbations, treatment succeeds at approximately the same rate (~60%) regardless of whether the isolate is classified as susceptible or resistant in vitro (Somayaji et al., J Cyst Fibros 2019; Aaron et al., JAMA 2005). Longitudinal sputum antibiograms remain stable within individuals over time, entirely decoupled from the variable success or failure of specific treatment episodes (Fodor et al., PLoS One 2012; Zhao et al., Microbiome 2012). A landmark review in the Journal of Clinical Microbiology concluded that while a “susceptible” result has high positive predictive value, a “resistant” classification predicts treatment failure in fewer than 35% of cases — meaning clinicians still lack true resistance tests (Doern &amp; Brecher, 2011).</w:t>
+      </w:r>
+    </w:p>
+    <w:p>
+      <w:pPr>
+        <w:spacing w:before="100" w:beforeAutospacing="1" w:after="100" w:afterAutospacing="1"/>
+        <w:rPr>
+          <w:rFonts w:ascii="Times New Roman" w:eastAsia="Times New Roman" w:hAnsi="Times New Roman" w:cs="Times New Roman"/>
+          <w:kern w:val="0"/>
+          <w:lang w:eastAsia="en-GB"/>
+          <w14:ligatures w14:val="none"/>
+        </w:rPr>
+      </w:pPr>
+      <w:r>
+        <w:rPr>
+          <w:rFonts w:ascii="Times New Roman" w:eastAsia="Times New Roman" w:hAnsi="Times New Roman" w:cs="Times New Roman"/>
+          <w:kern w:val="0"/>
+          <w:lang w:eastAsia="en-GB"/>
+          <w14:ligatures w14:val="none"/>
+        </w:rPr>
+        <w:t>These failures are not unique to the lung. They reflect a broader problem in non–free-floating infections — abscesses, closed spaces, pus-filled cavities, and chronically infected tissues — where bacteria reside in structured, polymicrobial, often microaerobic environments rather than planktonic broth. MIC values for P. aeruginosa tested in artificial sputum medium under microaerophilic conditions can exceed standard aerobic planktonic values by over 128-fold (Haaber et al., J Antimicrob Chemother 2012), and intra-sample polyclonality means a single colony pick is frequently unrepresentative of the infecting population (Bos et al., Microbiol Spectr 2023). Developing bespoke AST systems for every site and disease state is practically infeasible; instead, the lung offers an ideal, data-rich test bed for approaches that use bacterial genomes and clinical metadata to predict treatment outcomes directly. Success here would provide a generalisable framework for non-planktonic infections across medicine, extending beyond the relatively simple, free-floating urinary tract infections where genomic prediction has already been demonstrated (Stracy et al., Science 2022).</w:t>
+      </w:r>
+    </w:p>
+    <w:p>
+      <w:pPr>
+        <w:spacing w:before="100" w:beforeAutospacing="1" w:after="100" w:afterAutospacing="1"/>
+        <w:rPr>
+          <w:rFonts w:ascii="Times New Roman" w:eastAsia="Times New Roman" w:hAnsi="Times New Roman" w:cs="Times New Roman"/>
+          <w:kern w:val="0"/>
+          <w:lang w:eastAsia="en-GB"/>
+          <w14:ligatures w14:val="none"/>
+        </w:rPr>
+      </w:pPr>
+      <w:r>
+        <w:rPr>
+          <w:rFonts w:ascii="Times New Roman" w:eastAsia="Times New Roman" w:hAnsi="Times New Roman" w:cs="Times New Roman"/>
+          <w:i/>
+          <w:iCs/>
+          <w:kern w:val="0"/>
+          <w:lang w:eastAsia="en-GB"/>
+          <w14:ligatures w14:val="none"/>
+        </w:rPr>
+        <w:t>~175 words</w:t>
+      </w:r>
+    </w:p>
+    <w:p>
+      <w:pPr>
+        <w:spacing w:before="100" w:beforeAutospacing="1" w:after="100" w:afterAutospacing="1"/>
+        <w:outlineLvl w:val="1"/>
+        <w:rPr>
+          <w:rFonts w:ascii="Times New Roman" w:eastAsia="Times New Roman" w:hAnsi="Times New Roman" w:cs="Times New Roman"/>
+          <w:b/>
+          <w:bCs/>
+          <w:kern w:val="0"/>
+          <w:sz w:val="36"/>
+          <w:szCs w:val="36"/>
+          <w:lang w:eastAsia="en-GB"/>
+          <w14:ligatures w14:val="none"/>
+        </w:rPr>
+      </w:pPr>
+      <w:r>
+        <w:rPr>
+          <w:rFonts w:ascii="Times New Roman" w:eastAsia="Times New Roman" w:hAnsi="Times New Roman" w:cs="Times New Roman"/>
+          <w:b/>
+          <w:bCs/>
+          <w:kern w:val="0"/>
+          <w:sz w:val="36"/>
+          <w:szCs w:val="36"/>
+          <w:lang w:eastAsia="en-GB"/>
+          <w14:ligatures w14:val="none"/>
+        </w:rPr>
+        <w:t>The SputaGen Cohort</w:t>
+      </w:r>
+    </w:p>
+    <w:p>
+      <w:pPr>
+        <w:spacing w:before="100" w:beforeAutospacing="1" w:after="100" w:afterAutospacing="1"/>
+        <w:rPr>
+          <w:rFonts w:ascii="Times New Roman" w:eastAsia="Times New Roman" w:hAnsi="Times New Roman" w:cs="Times New Roman"/>
+          <w:kern w:val="0"/>
+          <w:lang w:eastAsia="en-GB"/>
+          <w14:ligatures w14:val="none"/>
+        </w:rPr>
+      </w:pPr>
+      <w:r>
+        <w:rPr>
+          <w:rFonts w:ascii="Times New Roman" w:eastAsia="Times New Roman" w:hAnsi="Times New Roman" w:cs="Times New Roman"/>
+          <w:kern w:val="0"/>
+          <w:lang w:eastAsia="en-GB"/>
+          <w14:ligatures w14:val="none"/>
+        </w:rPr>
+        <w:t>The Floto Laboratory and Cambridge Centre for Lung Infection have established a prospective cohort specifically designed to address this challenge. The SputaGen study — which I designed and lead as Principal Investigator — has collected 642 intravenous antibiotic courses (1,341 individual antibiotics) from patients with chronic lung infection, with standardised sputum samples collected before, during, and after each course, yielding a biobank of 1,273 longitudinally linked samples. This dense, longitudinal resource is largely unique internationally.</w:t>
+      </w:r>
+    </w:p>
+    <w:p>
+      <w:pPr>
+        <w:spacing w:before="100" w:beforeAutospacing="1" w:after="100" w:afterAutospacing="1"/>
+        <w:rPr>
+          <w:rFonts w:ascii="Times New Roman" w:eastAsia="Times New Roman" w:hAnsi="Times New Roman" w:cs="Times New Roman"/>
+          <w:kern w:val="0"/>
+          <w:lang w:eastAsia="en-GB"/>
+          <w14:ligatures w14:val="none"/>
+        </w:rPr>
+      </w:pPr>
+      <w:r>
+        <w:rPr>
+          <w:rFonts w:ascii="Times New Roman" w:eastAsia="Times New Roman" w:hAnsi="Times New Roman" w:cs="Times New Roman"/>
+          <w:i/>
+          <w:iCs/>
+          <w:kern w:val="0"/>
+          <w:lang w:eastAsia="en-GB"/>
+          <w14:ligatures w14:val="none"/>
+        </w:rPr>
+        <w:lastRenderedPageBreak/>
+        <w:t>~80 words</w:t>
+      </w:r>
+    </w:p>
+    <w:p>
+      <w:pPr>
+        <w:spacing w:before="100" w:beforeAutospacing="1" w:after="100" w:afterAutospacing="1"/>
+        <w:outlineLvl w:val="1"/>
+        <w:rPr>
+          <w:rFonts w:ascii="Times New Roman" w:eastAsia="Times New Roman" w:hAnsi="Times New Roman" w:cs="Times New Roman"/>
+          <w:b/>
+          <w:bCs/>
+          <w:kern w:val="0"/>
+          <w:sz w:val="36"/>
+          <w:szCs w:val="36"/>
+          <w:lang w:eastAsia="en-GB"/>
+          <w14:ligatures w14:val="none"/>
+        </w:rPr>
+      </w:pPr>
+      <w:r>
+        <w:rPr>
+          <w:rFonts w:ascii="Times New Roman" w:eastAsia="Times New Roman" w:hAnsi="Times New Roman" w:cs="Times New Roman"/>
+          <w:b/>
+          <w:bCs/>
+          <w:kern w:val="0"/>
+          <w:sz w:val="36"/>
+          <w:szCs w:val="36"/>
+          <w:lang w:eastAsia="en-GB"/>
+          <w14:ligatures w14:val="none"/>
+        </w:rPr>
+        <w:t>Research Plan</w:t>
+      </w:r>
+    </w:p>
+    <w:p>
+      <w:pPr>
+        <w:spacing w:before="100" w:beforeAutospacing="1" w:after="100" w:afterAutospacing="1"/>
+        <w:rPr>
+          <w:rFonts w:ascii="Times New Roman" w:eastAsia="Times New Roman" w:hAnsi="Times New Roman" w:cs="Times New Roman"/>
+          <w:kern w:val="0"/>
+          <w:lang w:eastAsia="en-GB"/>
+          <w14:ligatures w14:val="none"/>
+        </w:rPr>
+      </w:pPr>
+      <w:r>
+        <w:rPr>
+          <w:rFonts w:ascii="Times New Roman" w:eastAsia="Times New Roman" w:hAnsi="Times New Roman" w:cs="Times New Roman"/>
+          <w:b/>
+          <w:bCs/>
+          <w:kern w:val="0"/>
+          <w:lang w:eastAsia="en-GB"/>
+          <w14:ligatures w14:val="none"/>
+        </w:rPr>
+        <w:t>a) AST versus Outcomes.</w:t>
+      </w:r>
+      <w:r>
+        <w:rPr>
+          <w:rFonts w:ascii="Times New Roman" w:eastAsia="Times New Roman" w:hAnsi="Times New Roman" w:cs="Times New Roman"/>
+          <w:kern w:val="0"/>
+          <w:lang w:eastAsia="en-GB"/>
+          <w14:ligatures w14:val="none"/>
+        </w:rPr>
+        <w:t xml:space="preserve"> I will systematically correlate historical AST results with clinical outcomes across four domains: global clinical change score, validated symptom questionnaire, Chronic Airway Assessment Test (CAAT) score, and time to next treatment course. Subgroup analyses will stratify by disease (CF, non-CF bronchiectasis), antibiotic class, and pathogen. This will produce the first robust prospective analysis of AST predictive value in chronic lung infection.</w:t>
+      </w:r>
+    </w:p>
+    <w:p>
+      <w:pPr>
+        <w:spacing w:before="100" w:beforeAutospacing="1" w:after="100" w:afterAutospacing="1"/>
+        <w:rPr>
+          <w:rFonts w:ascii="Times New Roman" w:eastAsia="Times New Roman" w:hAnsi="Times New Roman" w:cs="Times New Roman"/>
+          <w:kern w:val="0"/>
+          <w:lang w:eastAsia="en-GB"/>
+          <w14:ligatures w14:val="none"/>
+        </w:rPr>
+      </w:pPr>
+      <w:r>
+        <w:rPr>
+          <w:rFonts w:ascii="Times New Roman" w:eastAsia="Times New Roman" w:hAnsi="Times New Roman" w:cs="Times New Roman"/>
+          <w:b/>
+          <w:bCs/>
+          <w:kern w:val="0"/>
+          <w:lang w:eastAsia="en-GB"/>
+          <w14:ligatures w14:val="none"/>
+        </w:rPr>
+        <w:t>b) Strain Dynamics.</w:t>
+      </w:r>
+      <w:r>
+        <w:rPr>
+          <w:rFonts w:ascii="Times New Roman" w:eastAsia="Times New Roman" w:hAnsi="Times New Roman" w:cs="Times New Roman"/>
+          <w:kern w:val="0"/>
+          <w:lang w:eastAsia="en-GB"/>
+          <w14:ligatures w14:val="none"/>
+        </w:rPr>
+        <w:t xml:space="preserve"> Informed by Kishony and colleagues' demonstration that strain switching underlies resistance emergence and treatment failure, I will implement an integrated pipeline: 16S rRNA metagenomic sequencing to characterise community diversity and stability; culture-based isolation of individual </w:t>
+      </w:r>
+      <w:r>
+        <w:rPr>
+          <w:rFonts w:ascii="Times New Roman" w:eastAsia="Times New Roman" w:hAnsi="Times New Roman" w:cs="Times New Roman"/>
+          <w:i/>
+          <w:iCs/>
+          <w:kern w:val="0"/>
+          <w:lang w:eastAsia="en-GB"/>
+          <w14:ligatures w14:val="none"/>
+        </w:rPr>
+        <w:t>P. aeruginosa</w:t>
+      </w:r>
+      <w:r>
+        <w:rPr>
+          <w:rFonts w:ascii="Times New Roman" w:eastAsia="Times New Roman" w:hAnsi="Times New Roman" w:cs="Times New Roman"/>
+          <w:kern w:val="0"/>
+          <w:lang w:eastAsia="en-GB"/>
+          <w14:ligatures w14:val="none"/>
+        </w:rPr>
+        <w:t xml:space="preserve"> lineages using Bryant lab RNA guide protocols; WGS of multiple distinct lineages per patient per timepoint alongside parallel metagenomic sweeps to capture polyclonal diversity; and SNP distance-based strain switching analysis across timepoints. MGE and plasmid characterisation tools from WP1 will be applied to interpret genomic changes in this clinical context.</w:t>
+      </w:r>
+    </w:p>
+    <w:p>
+      <w:pPr>
+        <w:spacing w:before="100" w:beforeAutospacing="1" w:after="100" w:afterAutospacing="1"/>
+        <w:rPr>
+          <w:rFonts w:ascii="Times New Roman" w:eastAsia="Times New Roman" w:hAnsi="Times New Roman" w:cs="Times New Roman"/>
+          <w:kern w:val="0"/>
+          <w:lang w:eastAsia="en-GB"/>
+          <w14:ligatures w14:val="none"/>
+        </w:rPr>
+      </w:pPr>
+      <w:r>
+        <w:rPr>
+          <w:rFonts w:ascii="pplxSerif" w:hAnsi="pplxSerif"/>
+        </w:rPr>
+        <w:t>Critically, RNA guide-based lineage typing to identify co-infecting </w:t>
+      </w:r>
+      <w:r>
+        <w:rPr>
+          <w:rStyle w:val="Emphasis"/>
+          <w:rFonts w:ascii="pplxSerif" w:hAnsi="pplxSerif"/>
+          <w:bdr w:val="single" w:sz="2" w:space="0" w:color="auto" w:frame="1"/>
+        </w:rPr>
+        <w:t>P. aeruginosa</w:t>
+      </w:r>
+      <w:r>
+        <w:rPr>
+          <w:rFonts w:ascii="pplxSerif" w:hAnsi="pplxSerif"/>
+        </w:rPr>
+        <w:t> lineages and track key accessory genes has already been developed and validated by the Bryant laboratory (Wellcome Sanger Institute</w:t>
+      </w:r>
+      <w:r>
+        <w:rPr>
+          <w:rFonts w:ascii="pplxSerif" w:hAnsi="pplxSerif"/>
+        </w:rPr>
+        <w:t xml:space="preserve"> Partner</w:t>
+      </w:r>
+      <w:r>
+        <w:rPr>
+          <w:rFonts w:ascii="pplxSerif" w:hAnsi="pplxSerif"/>
+        </w:rPr>
+        <w:t>) on prospectively collected SputaGen samples, demonstrating that distinct lineages can be reliably resolved from clinical sputum using custom RNA guides. This substantially de-risks the strain identification pipeline and provides a validated protocol ready for scaled deployment.</w:t>
+      </w:r>
+    </w:p>
+    <w:p>
+      <w:pPr>
+        <w:spacing w:before="100" w:beforeAutospacing="1" w:after="100" w:afterAutospacing="1"/>
+        <w:rPr>
+          <w:rFonts w:ascii="Times New Roman" w:eastAsia="Times New Roman" w:hAnsi="Times New Roman" w:cs="Times New Roman"/>
+          <w:kern w:val="0"/>
+          <w:lang w:eastAsia="en-GB"/>
+          <w14:ligatures w14:val="none"/>
+        </w:rPr>
+      </w:pPr>
+      <w:r>
+        <w:rPr>
+          <w:rFonts w:ascii="Times New Roman" w:eastAsia="Times New Roman" w:hAnsi="Times New Roman" w:cs="Times New Roman"/>
+          <w:b/>
+          <w:bCs/>
+          <w:kern w:val="0"/>
+          <w:lang w:eastAsia="en-GB"/>
+          <w14:ligatures w14:val="none"/>
+        </w:rPr>
+        <w:t>c) Genomic Outcome Prediction.</w:t>
+      </w:r>
+      <w:r>
+        <w:rPr>
+          <w:rFonts w:ascii="Times New Roman" w:eastAsia="Times New Roman" w:hAnsi="Times New Roman" w:cs="Times New Roman"/>
+          <w:kern w:val="0"/>
+          <w:lang w:eastAsia="en-GB"/>
+          <w14:ligatures w14:val="none"/>
+        </w:rPr>
+        <w:t xml:space="preserve"> Having established AST-outcome relationships and strain dynamics, I will develop machine learning models integrating genomic features (AMRFinderPlus profiles, plasmid/MGE content, Bacformer embeddings from WP2), clinical metadata (antibiotic history, BSI severity, underlying disease, comorbidities), and community structure (species abundance and alpha diversity from 16S and metagenomic profiling) to predict treatment efficacy directly — bypassing AST as an intermediate proxy. This mirrors the Stracy et al. framework but in a far more complex, polymicrobial, chronic infection setting. </w:t>
+      </w:r>
+    </w:p>
+    <w:p>
+      <w:pPr>
+        <w:spacing w:before="100" w:beforeAutospacing="1" w:after="100" w:afterAutospacing="1"/>
+        <w:rPr>
+          <w:rFonts w:ascii="Times New Roman" w:eastAsia="Times New Roman" w:hAnsi="Times New Roman" w:cs="Times New Roman"/>
+          <w:kern w:val="0"/>
+          <w:lang w:eastAsia="en-GB"/>
+          <w14:ligatures w14:val="none"/>
+        </w:rPr>
+      </w:pPr>
+      <w:r>
+        <w:rPr>
+          <w:rFonts w:ascii="Times New Roman" w:eastAsia="Times New Roman" w:hAnsi="Times New Roman" w:cs="Times New Roman"/>
+          <w:kern w:val="0"/>
+          <w:lang w:eastAsia="en-GB"/>
+          <w14:ligatures w14:val="none"/>
+        </w:rPr>
+        <w:t xml:space="preserve">We have deliberately designed an initial pathway around single testable hypotheses — particularly strain switching — acknowledging that </w:t>
+      </w:r>
+      <w:r>
+        <w:rPr>
+          <w:rFonts w:ascii="Times New Roman" w:eastAsia="Times New Roman" w:hAnsi="Times New Roman" w:cs="Times New Roman"/>
+          <w:kern w:val="0"/>
+          <w:lang w:eastAsia="en-GB"/>
+          <w14:ligatures w14:val="none"/>
+        </w:rPr>
+        <w:t xml:space="preserve">this rich prospective data set will allow </w:t>
+      </w:r>
+      <w:r>
+        <w:rPr>
+          <w:rFonts w:ascii="Times New Roman" w:eastAsia="Times New Roman" w:hAnsi="Times New Roman" w:cs="Times New Roman"/>
+          <w:kern w:val="0"/>
+          <w:lang w:eastAsia="en-GB"/>
+          <w14:ligatures w14:val="none"/>
+        </w:rPr>
+        <w:t xml:space="preserve">further features such as persister cell biology (Boeck et al., </w:t>
+      </w:r>
+      <w:r>
+        <w:rPr>
+          <w:rFonts w:ascii="Times New Roman" w:eastAsia="Times New Roman" w:hAnsi="Times New Roman" w:cs="Times New Roman"/>
+          <w:i/>
+          <w:iCs/>
+          <w:kern w:val="0"/>
+          <w:lang w:eastAsia="en-GB"/>
+          <w14:ligatures w14:val="none"/>
+        </w:rPr>
+        <w:t>Nat Microbiol</w:t>
+      </w:r>
+      <w:r>
+        <w:rPr>
+          <w:rFonts w:ascii="Times New Roman" w:eastAsia="Times New Roman" w:hAnsi="Times New Roman" w:cs="Times New Roman"/>
+          <w:kern w:val="0"/>
+          <w:lang w:eastAsia="en-GB"/>
+          <w14:ligatures w14:val="none"/>
+        </w:rPr>
+        <w:t xml:space="preserve"> 2022; Liu et al.) </w:t>
+      </w:r>
+      <w:r>
+        <w:rPr>
+          <w:rFonts w:ascii="Times New Roman" w:eastAsia="Times New Roman" w:hAnsi="Times New Roman" w:cs="Times New Roman"/>
+          <w:kern w:val="0"/>
+          <w:lang w:eastAsia="en-GB"/>
+          <w14:ligatures w14:val="none"/>
+        </w:rPr>
+        <w:t xml:space="preserve">to be </w:t>
+      </w:r>
+      <w:r>
+        <w:rPr>
+          <w:rFonts w:ascii="Times New Roman" w:eastAsia="Times New Roman" w:hAnsi="Times New Roman" w:cs="Times New Roman"/>
+          <w:kern w:val="0"/>
+          <w:lang w:eastAsia="en-GB"/>
+          <w14:ligatures w14:val="none"/>
+        </w:rPr>
+        <w:t xml:space="preserve">rigorously tested </w:t>
+      </w:r>
+      <w:r>
+        <w:rPr>
+          <w:rFonts w:ascii="Times New Roman" w:eastAsia="Times New Roman" w:hAnsi="Times New Roman" w:cs="Times New Roman"/>
+          <w:kern w:val="0"/>
+          <w:lang w:eastAsia="en-GB"/>
+          <w14:ligatures w14:val="none"/>
+        </w:rPr>
+        <w:t xml:space="preserve">in due course and build upon the rigorous and structured data and predictive framework this project establishes. </w:t>
+      </w:r>
+    </w:p>
+    <w:p>
+      <w:pPr>
+        <w:spacing w:before="100" w:beforeAutospacing="1" w:after="100" w:afterAutospacing="1"/>
+        <w:rPr>
+          <w:rFonts w:ascii="Times New Roman" w:eastAsia="Times New Roman" w:hAnsi="Times New Roman" w:cs="Times New Roman"/>
+          <w:kern w:val="0"/>
+          <w:lang w:eastAsia="en-GB"/>
+          <w14:ligatures w14:val="none"/>
+        </w:rPr>
+      </w:pPr>
+      <w:r>
+        <w:rPr>
+          <w:rFonts w:ascii="Times New Roman" w:eastAsia="Times New Roman" w:hAnsi="Times New Roman" w:cs="Times New Roman"/>
+          <w:i/>
+          <w:iCs/>
+          <w:kern w:val="0"/>
+          <w:lang w:eastAsia="en-GB"/>
+          <w14:ligatures w14:val="none"/>
+        </w:rPr>
+        <w:t>~270 words</w:t>
+      </w:r>
+    </w:p>
+    <w:p>
+      <w:pPr>
+        <w:spacing w:before="100" w:beforeAutospacing="1" w:after="100" w:afterAutospacing="1"/>
+        <w:outlineLvl w:val="1"/>
+        <w:rPr>
+          <w:rFonts w:ascii="Times New Roman" w:eastAsia="Times New Roman" w:hAnsi="Times New Roman" w:cs="Times New Roman"/>
+          <w:b/>
+          <w:bCs/>
+          <w:kern w:val="0"/>
+          <w:sz w:val="36"/>
+          <w:szCs w:val="36"/>
+          <w:lang w:eastAsia="en-GB"/>
+          <w14:ligatures w14:val="none"/>
+        </w:rPr>
+      </w:pPr>
+      <w:r>
+        <w:rPr>
+          <w:rFonts w:ascii="Times New Roman" w:eastAsia="Times New Roman" w:hAnsi="Times New Roman" w:cs="Times New Roman"/>
+          <w:b/>
+          <w:bCs/>
+          <w:kern w:val="0"/>
+          <w:sz w:val="36"/>
+          <w:szCs w:val="36"/>
+          <w:lang w:eastAsia="en-GB"/>
+          <w14:ligatures w14:val="none"/>
+        </w:rPr>
+        <w:t>Expected Outcomes</w:t>
+      </w:r>
+    </w:p>
+    <w:p>
+      <w:pPr>
+        <w:spacing w:before="100" w:beforeAutospacing="1" w:after="100" w:afterAutospacing="1"/>
+        <w:rPr>
+          <w:rFonts w:ascii="Times New Roman" w:eastAsia="Times New Roman" w:hAnsi="Times New Roman" w:cs="Times New Roman"/>
+          <w:kern w:val="0"/>
+          <w:lang w:eastAsia="en-GB"/>
+          <w14:ligatures w14:val="none"/>
+        </w:rPr>
+      </w:pPr>
+      <w:r>
+        <w:rPr>
+          <w:rFonts w:ascii="Times New Roman" w:eastAsia="Times New Roman" w:hAnsi="Times New Roman" w:cs="Times New Roman"/>
+          <w:kern w:val="0"/>
+          <w:lang w:eastAsia="en-GB"/>
+          <w14:ligatures w14:val="none"/>
+        </w:rPr>
+        <w:t xml:space="preserve">The first well-powered prospective quantification of AST predictive value in chronic lung infection; characterisation of strain dynamics and polyclonality as drivers of treatment failure; and proof-of-concept machine learning models integrating pathogen genomics, </w:t>
+      </w:r>
+      <w:r>
+        <w:rPr>
+          <w:rFonts w:ascii="Times New Roman" w:eastAsia="Times New Roman" w:hAnsi="Times New Roman" w:cs="Times New Roman"/>
+          <w:kern w:val="0"/>
+          <w:lang w:eastAsia="en-GB"/>
+          <w14:ligatures w14:val="none"/>
+        </w:rPr>
+        <w:lastRenderedPageBreak/>
+        <w:t>community structure, and clinical metadata for antibiotic outcome prediction — an initial framework for genomics-guided stewardship in chronic respiratory disease.</w:t>
+      </w:r>
+    </w:p>
+    <w:p>
+      <w:pPr>
+        <w:spacing w:before="100" w:beforeAutospacing="1" w:after="100" w:afterAutospacing="1"/>
+        <w:rPr>
+          <w:rFonts w:ascii="Times New Roman" w:eastAsia="Times New Roman" w:hAnsi="Times New Roman" w:cs="Times New Roman"/>
+          <w:kern w:val="0"/>
+          <w:lang w:eastAsia="en-GB"/>
+          <w14:ligatures w14:val="none"/>
+        </w:rPr>
+      </w:pPr>
+      <w:r>
+        <w:rPr>
+          <w:rFonts w:ascii="Times New Roman" w:eastAsia="Times New Roman" w:hAnsi="Times New Roman" w:cs="Times New Roman"/>
+          <w:i/>
+          <w:iCs/>
+          <w:kern w:val="0"/>
+          <w:lang w:eastAsia="en-GB"/>
+          <w14:ligatures w14:val="none"/>
+        </w:rPr>
+        <w:t>~55 words</w:t>
+      </w:r>
+    </w:p>
+    <w:p>
+      <w:pPr>
+        <w:rPr>
+          <w:rFonts w:ascii="Times New Roman" w:eastAsia="Times New Roman" w:hAnsi="Times New Roman" w:cs="Times New Roman"/>
+          <w:kern w:val="0"/>
+          <w:lang w:eastAsia="en-GB"/>
+          <w14:ligatures w14:val="none"/>
+        </w:rPr>
+      </w:pPr>
+      <w:r>
+        <w:rPr>
+          <w:rFonts w:ascii="Times New Roman" w:eastAsia="Times New Roman" w:hAnsi="Times New Roman" w:cs="Times New Roman"/>
+          <w:noProof/>
+          <w:kern w:val="0"/>
+          <w:lang w:eastAsia="en-GB"/>
+        </w:rPr>
+        <w:pict w14:anchorId="55C49C7F">
+          <v:rect id="_x0000_i1030" alt="" style="width:451.3pt;height:.05pt;mso-width-percent:0;mso-height-percent:0;mso-width-percent:0;mso-height-percent:0" o:hralign="center" o:hrstd="t" o:hr="t" fillcolor="#a0a0a0" stroked="f"/>
+        </w:pict>
+      </w:r>
+    </w:p>
+    <w:p>
+      <w:pPr>
+        <w:spacing w:before="100" w:beforeAutospacing="1" w:after="100" w:afterAutospacing="1"/>
+        <w:rPr>
+          <w:rFonts w:ascii="Times New Roman" w:eastAsia="Times New Roman" w:hAnsi="Times New Roman" w:cs="Times New Roman"/>
+          <w:kern w:val="0"/>
+          <w:lang w:eastAsia="en-GB"/>
+          <w14:ligatures w14:val="none"/>
+        </w:rPr>
+      </w:pPr>
+      <w:r>
+        <w:rPr>
+          <w:rFonts w:ascii="Times New Roman" w:eastAsia="Times New Roman" w:hAnsi="Times New Roman" w:cs="Times New Roman"/>
+          <w:b/>
+          <w:bCs/>
+          <w:kern w:val="0"/>
+          <w:lang w:eastAsia="en-GB"/>
+          <w14:ligatures w14:val="none"/>
+        </w:rPr>
+        <w:t>WP3 total: ~580 words</w:t>
+      </w:r>
+    </w:p>
+    <w:p>
+      <w:pPr>
+        <w:rPr>
+          <w:rFonts w:ascii="Times New Roman" w:eastAsia="Times New Roman" w:hAnsi="Times New Roman" w:cs="Times New Roman"/>
+          <w:kern w:val="0"/>
+          <w:lang w:eastAsia="en-GB"/>
+          <w14:ligatures w14:val="none"/>
+        </w:rPr>
+      </w:pPr>
+      <w:r>
+        <w:rPr>
+          <w:rFonts w:ascii="Times New Roman" w:eastAsia="Times New Roman" w:hAnsi="Times New Roman" w:cs="Times New Roman"/>
+          <w:kern w:val="0"/>
+          <w:lang w:eastAsia="en-GB"/>
+          <w14:ligatures w14:val="none"/>
+        </w:rPr>
+        <w:br w:type="page"/>
+      </w:r>
+    </w:p>
+    <w:p>
+      <w:pPr>
+        <w:spacing w:before="100" w:beforeAutospacing="1" w:after="100" w:afterAutospacing="1"/>
+        <w:rPr>
+          <w:rFonts w:ascii="Times New Roman" w:eastAsia="Times New Roman" w:hAnsi="Times New Roman" w:cs="Times New Roman"/>
+          <w:kern w:val="0"/>
+          <w:lang w:eastAsia="en-GB"/>
+          <w14:ligatures w14:val="none"/>
+        </w:rPr>
+      </w:pPr>
+    </w:p>
+    <w:p>
+      <w:pPr>
+        <w:spacing w:before="100" w:beforeAutospacing="1" w:after="100" w:afterAutospacing="1"/>
+        <w:rPr>
+          <w:rFonts w:ascii="Times New Roman" w:eastAsia="Times New Roman" w:hAnsi="Times New Roman" w:cs="Times New Roman"/>
+          <w:kern w:val="0"/>
+          <w:lang w:eastAsia="en-GB"/>
+          <w14:ligatures w14:val="none"/>
+        </w:rPr>
+      </w:pPr>
+      <w:r>
+        <w:rPr>
+          <w:rFonts w:ascii="Times New Roman" w:eastAsia="Times New Roman" w:hAnsi="Times New Roman" w:cs="Times New Roman"/>
+          <w:kern w:val="0"/>
+          <w:lang w:eastAsia="en-GB"/>
+          <w14:ligatures w14:val="none"/>
+        </w:rPr>
+        <w:t>Working from your notes and the existing document. I'll add the RNA guide point as a brief insert into WP3b first, then write the closing section — since it genuinely belongs to the methodology there, but gets reinforced as a de-risking point in Feasibility.</w:t>
+      </w:r>
+    </w:p>
+    <w:p>
+      <w:pPr>
+        <w:rPr>
+          <w:rFonts w:ascii="Times New Roman" w:eastAsia="Times New Roman" w:hAnsi="Times New Roman" w:cs="Times New Roman"/>
+          <w:kern w:val="0"/>
+          <w:lang w:eastAsia="en-GB"/>
+          <w14:ligatures w14:val="none"/>
+        </w:rPr>
+      </w:pPr>
+      <w:r>
+        <w:rPr>
+          <w:rFonts w:ascii="Times New Roman" w:eastAsia="Times New Roman" w:hAnsi="Times New Roman" w:cs="Times New Roman"/>
+          <w:noProof/>
+          <w:kern w:val="0"/>
+          <w:lang w:eastAsia="en-GB"/>
+        </w:rPr>
+        <w:pict w14:anchorId="7C1487C0">
+          <v:rect id="_x0000_i1029" alt="" style="width:451.3pt;height:.05pt;mso-width-percent:0;mso-height-percent:0;mso-width-percent:0;mso-height-percent:0" o:hralign="center" o:hrstd="t" o:hr="t" fillcolor="#a0a0a0" stroked="f"/>
+        </w:pict>
+      </w:r>
+    </w:p>
+    <w:p>
+      <w:pPr>
+        <w:spacing w:before="100" w:beforeAutospacing="1" w:after="100" w:afterAutospacing="1"/>
+        <w:outlineLvl w:val="1"/>
+        <w:rPr>
+          <w:rFonts w:ascii="Times New Roman" w:eastAsia="Times New Roman" w:hAnsi="Times New Roman" w:cs="Times New Roman"/>
+          <w:b/>
+          <w:bCs/>
+          <w:kern w:val="0"/>
+          <w:sz w:val="36"/>
+          <w:szCs w:val="36"/>
+          <w:lang w:eastAsia="en-GB"/>
+          <w14:ligatures w14:val="none"/>
+        </w:rPr>
+      </w:pPr>
+      <w:r>
+        <w:rPr>
+          <w:rFonts w:ascii="Times New Roman" w:eastAsia="Times New Roman" w:hAnsi="Times New Roman" w:cs="Times New Roman"/>
+          <w:b/>
+          <w:bCs/>
+          <w:kern w:val="0"/>
+          <w:sz w:val="36"/>
+          <w:szCs w:val="36"/>
+          <w:lang w:eastAsia="en-GB"/>
+          <w14:ligatures w14:val="none"/>
+        </w:rPr>
+        <w:t xml:space="preserve">WP3b Addition </w:t>
+      </w:r>
+      <w:r>
+        <w:rPr>
+          <w:rFonts w:ascii="Times New Roman" w:eastAsia="Times New Roman" w:hAnsi="Times New Roman" w:cs="Times New Roman"/>
+          <w:b/>
+          <w:bCs/>
+          <w:i/>
+          <w:iCs/>
+          <w:kern w:val="0"/>
+          <w:sz w:val="36"/>
+          <w:szCs w:val="36"/>
+          <w:lang w:eastAsia="en-GB"/>
+          <w14:ligatures w14:val="none"/>
+        </w:rPr>
+        <w:t>(insert after "SNP distance-based strain switching analysis across timepoints")</w:t>
+      </w:r>
+    </w:p>
+    <w:p>
+      <w:pPr>
+        <w:spacing w:before="100" w:beforeAutospacing="1" w:after="100" w:afterAutospacing="1"/>
+        <w:rPr>
+          <w:rFonts w:ascii="Times New Roman" w:eastAsia="Times New Roman" w:hAnsi="Times New Roman" w:cs="Times New Roman"/>
+          <w:kern w:val="0"/>
+          <w:lang w:eastAsia="en-GB"/>
+          <w14:ligatures w14:val="none"/>
+        </w:rPr>
+      </w:pPr>
+      <w:r>
+        <w:rPr>
+          <w:rFonts w:ascii="Times New Roman" w:eastAsia="Times New Roman" w:hAnsi="Times New Roman" w:cs="Times New Roman"/>
+          <w:kern w:val="0"/>
+          <w:lang w:eastAsia="en-GB"/>
+          <w14:ligatures w14:val="none"/>
+        </w:rPr>
+        <w:t xml:space="preserve">Critically, RNA guide-based lineage typing to identify co-infecting </w:t>
+      </w:r>
+      <w:r>
+        <w:rPr>
+          <w:rFonts w:ascii="Times New Roman" w:eastAsia="Times New Roman" w:hAnsi="Times New Roman" w:cs="Times New Roman"/>
+          <w:i/>
+          <w:iCs/>
+          <w:kern w:val="0"/>
+          <w:lang w:eastAsia="en-GB"/>
+          <w14:ligatures w14:val="none"/>
+        </w:rPr>
+        <w:t>P. aeruginosa</w:t>
+      </w:r>
+      <w:r>
+        <w:rPr>
+          <w:rFonts w:ascii="Times New Roman" w:eastAsia="Times New Roman" w:hAnsi="Times New Roman" w:cs="Times New Roman"/>
+          <w:kern w:val="0"/>
+          <w:lang w:eastAsia="en-GB"/>
+          <w14:ligatures w14:val="none"/>
+        </w:rPr>
+        <w:t xml:space="preserve"> lineages and track key accessory genes has already been developed and validated by the Bryant laboratory (Wellcome Sanger Institute) on prospectively collected SputaGen samples, demonstrating that distinct lineages can be reliably resolved from clinical sputum using custom RNA guides. This substantially de-risks the strain identification pipeline and provides a validated protocol ready for scaled deployment.</w:t>
+      </w:r>
+    </w:p>
+    <w:p>
+      <w:pPr>
+        <w:spacing w:before="100" w:beforeAutospacing="1" w:after="100" w:afterAutospacing="1"/>
+        <w:rPr>
+          <w:rFonts w:ascii="Times New Roman" w:eastAsia="Times New Roman" w:hAnsi="Times New Roman" w:cs="Times New Roman"/>
+          <w:kern w:val="0"/>
+          <w:lang w:eastAsia="en-GB"/>
+          <w14:ligatures w14:val="none"/>
+        </w:rPr>
+      </w:pPr>
+      <w:r>
+        <w:rPr>
+          <w:rFonts w:ascii="Times New Roman" w:eastAsia="Times New Roman" w:hAnsi="Times New Roman" w:cs="Times New Roman"/>
+          <w:i/>
+          <w:iCs/>
+          <w:kern w:val="0"/>
+          <w:lang w:eastAsia="en-GB"/>
+          <w14:ligatures w14:val="none"/>
+        </w:rPr>
+        <w:t>~65 words</w:t>
+      </w:r>
+    </w:p>
+    <w:p>
+      <w:pPr>
+        <w:rPr>
+          <w:rFonts w:ascii="Times New Roman" w:eastAsia="Times New Roman" w:hAnsi="Times New Roman" w:cs="Times New Roman"/>
+          <w:kern w:val="0"/>
+          <w:lang w:eastAsia="en-GB"/>
+          <w14:ligatures w14:val="none"/>
+        </w:rPr>
+      </w:pPr>
+      <w:r>
+        <w:rPr>
+          <w:rFonts w:ascii="Times New Roman" w:eastAsia="Times New Roman" w:hAnsi="Times New Roman" w:cs="Times New Roman"/>
+          <w:noProof/>
+          <w:kern w:val="0"/>
+          <w:lang w:eastAsia="en-GB"/>
+        </w:rPr>
+        <w:pict w14:anchorId="68F1DFEA">
+          <v:rect id="_x0000_i1028" alt="" style="width:451.3pt;height:.05pt;mso-width-percent:0;mso-height-percent:0;mso-width-percent:0;mso-height-percent:0" o:hralign="center" o:hrstd="t" o:hr="t" fillcolor="#a0a0a0" stroked="f"/>
+        </w:pict>
+      </w:r>
+    </w:p>
+    <w:p>
+      <w:pPr>
+        <w:spacing w:before="100" w:beforeAutospacing="1" w:after="100" w:afterAutospacing="1"/>
+        <w:outlineLvl w:val="1"/>
+        <w:rPr>
+          <w:rFonts w:ascii="Times New Roman" w:eastAsia="Times New Roman" w:hAnsi="Times New Roman" w:cs="Times New Roman"/>
+          <w:b/>
+          <w:bCs/>
+          <w:kern w:val="0"/>
+          <w:sz w:val="36"/>
+          <w:szCs w:val="36"/>
+          <w:lang w:eastAsia="en-GB"/>
+          <w14:ligatures w14:val="none"/>
+        </w:rPr>
+      </w:pPr>
+      <w:r>
+        <w:rPr>
+          <w:rFonts w:ascii="Times New Roman" w:eastAsia="Times New Roman" w:hAnsi="Times New Roman" w:cs="Times New Roman"/>
+          <w:b/>
+          <w:bCs/>
+          <w:kern w:val="0"/>
+          <w:sz w:val="36"/>
+          <w:szCs w:val="36"/>
+          <w:lang w:eastAsia="en-GB"/>
+          <w14:ligatures w14:val="none"/>
+        </w:rPr>
+        <w:t>Feasibility, Risks, and Timeline</w:t>
+      </w:r>
+    </w:p>
+    <w:p>
+      <w:pPr>
+        <w:spacing w:before="100" w:beforeAutospacing="1" w:after="100" w:afterAutospacing="1"/>
+        <w:rPr>
+          <w:rFonts w:ascii="Times New Roman" w:eastAsia="Times New Roman" w:hAnsi="Times New Roman" w:cs="Times New Roman"/>
+          <w:kern w:val="0"/>
+          <w:lang w:eastAsia="en-GB"/>
+          <w14:ligatures w14:val="none"/>
+        </w:rPr>
+      </w:pPr>
+      <w:r>
+        <w:rPr>
+          <w:rFonts w:ascii="Times New Roman" w:eastAsia="Times New Roman" w:hAnsi="Times New Roman" w:cs="Times New Roman"/>
+          <w:kern w:val="0"/>
+          <w:lang w:eastAsia="en-GB"/>
+          <w14:ligatures w14:val="none"/>
+        </w:rPr>
+        <w:t>The three work packages are deliberately structured to be orthogonal and independently deliverable, minimising cross-WP dependencies and ensuring substantive output even if one arm encounters delays.</w:t>
+      </w:r>
+    </w:p>
+    <w:p>
+      <w:pPr>
+        <w:spacing w:before="100" w:beforeAutospacing="1" w:after="100" w:afterAutospacing="1"/>
+        <w:rPr>
+          <w:rFonts w:ascii="Times New Roman" w:eastAsia="Times New Roman" w:hAnsi="Times New Roman" w:cs="Times New Roman"/>
+          <w:kern w:val="0"/>
+          <w:lang w:eastAsia="en-GB"/>
+          <w14:ligatures w14:val="none"/>
+        </w:rPr>
+      </w:pPr>
+      <w:r>
+        <w:rPr>
+          <w:rFonts w:ascii="Times New Roman" w:eastAsia="Times New Roman" w:hAnsi="Times New Roman" w:cs="Times New Roman"/>
+          <w:b/>
+          <w:bCs/>
+          <w:kern w:val="0"/>
+          <w:lang w:eastAsia="en-GB"/>
+          <w14:ligatures w14:val="none"/>
+        </w:rPr>
+        <w:t>WP1</w:t>
+      </w:r>
+      <w:r>
+        <w:rPr>
+          <w:rFonts w:ascii="Times New Roman" w:eastAsia="Times New Roman" w:hAnsi="Times New Roman" w:cs="Times New Roman"/>
+          <w:kern w:val="0"/>
+          <w:lang w:eastAsia="en-GB"/>
+          <w14:ligatures w14:val="none"/>
+        </w:rPr>
+        <w:t xml:space="preserve"> is the most advanced and lowest risk. Metadata curation began in December 2025 and has already raised completeness from ~50% to &gt;80%. Pangenome construction, reference genome identification, and accessory genome clustering are underway now; MGE and plasmid characterisation will follow, with the full evolutionary analysis concluding by February 2027. The primary technical risk — managing pangenome scale across 80,000+ genomes — is directly mitigated by our collaborative extension of Panaroo with the Lee lab and Tonkin-Hill, and by a custom scalable variant-calling pipeline already in development.</w:t>
+      </w:r>
+    </w:p>
+    <w:p>
+      <w:pPr>
+        <w:spacing w:before="100" w:beforeAutospacing="1" w:after="100" w:afterAutospacing="1"/>
+        <w:rPr>
+          <w:rFonts w:ascii="Times New Roman" w:eastAsia="Times New Roman" w:hAnsi="Times New Roman" w:cs="Times New Roman"/>
+          <w:kern w:val="0"/>
+          <w:lang w:eastAsia="en-GB"/>
+          <w14:ligatures w14:val="none"/>
+        </w:rPr>
+      </w:pPr>
+      <w:r>
+        <w:rPr>
+          <w:rFonts w:ascii="Times New Roman" w:eastAsia="Times New Roman" w:hAnsi="Times New Roman" w:cs="Times New Roman"/>
+          <w:b/>
+          <w:bCs/>
+          <w:kern w:val="0"/>
+          <w:lang w:eastAsia="en-GB"/>
+          <w14:ligatures w14:val="none"/>
+        </w:rPr>
+        <w:t>WP2</w:t>
+      </w:r>
+      <w:r>
+        <w:rPr>
+          <w:rFonts w:ascii="Times New Roman" w:eastAsia="Times New Roman" w:hAnsi="Times New Roman" w:cs="Times New Roman"/>
+          <w:kern w:val="0"/>
+          <w:lang w:eastAsia="en-GB"/>
+          <w14:ligatures w14:val="none"/>
+        </w:rPr>
+        <w:t xml:space="preserve"> builds directly on preliminary results that already substantially de-risk its central claims: XGBoost models achieve AUROC 0.80–0.99 and Bacformer fine-tuning achieves AUROC &gt;0.97 on early datasets. Full-scale AMR prediction analysis will run February–September 2027, timed to leverage the completed WP1 pangenome and MGE outputs. The modest initial AUROC for invasive disease prediction (0.65) is acknowledged; the iterative modelling strategy — integrating WP1 accessory genome features, non-linear XGBoost heads, and the PLM+DNALM hybrid model available June 2026 — provides a principled, staged improvement pathway with clear intermediate checkpoints.</w:t>
+      </w:r>
+    </w:p>
+    <w:p>
+      <w:pPr>
+        <w:spacing w:before="100" w:beforeAutospacing="1" w:after="100" w:afterAutospacing="1"/>
+        <w:rPr>
+          <w:rFonts w:ascii="Times New Roman" w:eastAsia="Times New Roman" w:hAnsi="Times New Roman" w:cs="Times New Roman"/>
+          <w:kern w:val="0"/>
+          <w:lang w:eastAsia="en-GB"/>
+          <w14:ligatures w14:val="none"/>
+        </w:rPr>
+      </w:pPr>
+      <w:r>
+        <w:rPr>
+          <w:rFonts w:ascii="Times New Roman" w:eastAsia="Times New Roman" w:hAnsi="Times New Roman" w:cs="Times New Roman"/>
+          <w:b/>
+          <w:bCs/>
+          <w:kern w:val="0"/>
+          <w:lang w:eastAsia="en-GB"/>
+          <w14:ligatures w14:val="none"/>
+        </w:rPr>
+        <w:t>WP3</w:t>
+      </w:r>
+      <w:r>
+        <w:rPr>
+          <w:rFonts w:ascii="Times New Roman" w:eastAsia="Times New Roman" w:hAnsi="Times New Roman" w:cs="Times New Roman"/>
+          <w:kern w:val="0"/>
+          <w:lang w:eastAsia="en-GB"/>
+          <w14:ligatures w14:val="none"/>
+        </w:rPr>
+        <w:t xml:space="preserve"> carries the greatest operational complexity and has been designed with an explicitly iterative, gated structure to manage this. A culture and clinical data review in December 2026 will identify the highest-quality samples and confirm which antibiotic courses have sufficient </w:t>
+      </w:r>
+      <w:r>
+        <w:rPr>
+          <w:rFonts w:ascii="Times New Roman" w:eastAsia="Times New Roman" w:hAnsi="Times New Roman" w:cs="Times New Roman"/>
+          <w:kern w:val="0"/>
+          <w:lang w:eastAsia="en-GB"/>
+          <w14:ligatures w14:val="none"/>
+        </w:rPr>
+        <w:lastRenderedPageBreak/>
+        <w:t>longitudinal coverage for analysis — allowing us to prioritise before committing sequencing resource. RNA guide-based lineage typing will begin in early 2027 on this prioritised subset, with WGS starting March 2027 and initial genomic data available by June 2027. Machine learning integration of clinical outcomes will run September 2027–March 2029, building iteratively from the simplest testable hypothesis — strain switching as a predictor of treatment failure — before incorporating community structure and full multi-feature models. This staged approach means the pipeline is producing and testing outputs throughout, rather than deferring all analytical work to a single endpoint. Write-up and dissemination will run March–October 2029. Full timings are shown in the GANTT chart.</w:t>
+      </w:r>
+    </w:p>
+    <w:p>
+      <w:pPr>
+        <w:spacing w:before="100" w:beforeAutospacing="1" w:after="100" w:afterAutospacing="1"/>
+        <w:rPr>
+          <w:rFonts w:ascii="Times New Roman" w:eastAsia="Times New Roman" w:hAnsi="Times New Roman" w:cs="Times New Roman"/>
+          <w:kern w:val="0"/>
+          <w:lang w:eastAsia="en-GB"/>
+          <w14:ligatures w14:val="none"/>
+        </w:rPr>
+      </w:pPr>
+      <w:r>
+        <w:rPr>
+          <w:rFonts w:ascii="Times New Roman" w:eastAsia="Times New Roman" w:hAnsi="Times New Roman" w:cs="Times New Roman"/>
+          <w:kern w:val="0"/>
+          <w:lang w:eastAsia="en-GB"/>
+          <w14:ligatures w14:val="none"/>
+        </w:rPr>
+        <w:t>The most significant residual risk across the fellowship is clinical outcome data quality and completeness in WP3. This is mitigated by: my dual role as clinical PI and SputaGen Principal Investigator, providing direct oversight of data collection; the prospective study design with standardised outcome measures; and the early December 2026 data review, which will identify and address gaps before sequencing begins.</w:t>
+      </w:r>
+    </w:p>
+    <w:p>
+      <w:pPr>
+        <w:spacing w:before="100" w:beforeAutospacing="1" w:after="100" w:afterAutospacing="1"/>
+        <w:rPr>
+          <w:rFonts w:ascii="Times New Roman" w:eastAsia="Times New Roman" w:hAnsi="Times New Roman" w:cs="Times New Roman"/>
+          <w:kern w:val="0"/>
+          <w:lang w:eastAsia="en-GB"/>
+          <w14:ligatures w14:val="none"/>
+        </w:rPr>
+      </w:pPr>
+      <w:r>
+        <w:rPr>
+          <w:rFonts w:ascii="Times New Roman" w:eastAsia="Times New Roman" w:hAnsi="Times New Roman" w:cs="Times New Roman"/>
+          <w:i/>
+          <w:iCs/>
+          <w:kern w:val="0"/>
+          <w:lang w:eastAsia="en-GB"/>
+          <w14:ligatures w14:val="none"/>
+        </w:rPr>
+        <w:t>~390 words</w:t>
+      </w:r>
+    </w:p>
+    <w:p>
+      <w:pPr>
+        <w:rPr>
+          <w:rFonts w:ascii="Times New Roman" w:eastAsia="Times New Roman" w:hAnsi="Times New Roman" w:cs="Times New Roman"/>
+          <w:kern w:val="0"/>
+          <w:lang w:eastAsia="en-GB"/>
+          <w14:ligatures w14:val="none"/>
+        </w:rPr>
+      </w:pPr>
+      <w:r>
+        <w:rPr>
+          <w:rFonts w:ascii="Times New Roman" w:eastAsia="Times New Roman" w:hAnsi="Times New Roman" w:cs="Times New Roman"/>
+          <w:noProof/>
+          <w:kern w:val="0"/>
+          <w:lang w:eastAsia="en-GB"/>
+        </w:rPr>
+        <w:pict w14:anchorId="60F61175">
+          <v:rect id="_x0000_i1027" alt="" style="width:451.3pt;height:.05pt;mso-width-percent:0;mso-height-percent:0;mso-width-percent:0;mso-height-percent:0" o:hralign="center" o:hrstd="t" o:hr="t" fillcolor="#a0a0a0" stroked="f"/>
+        </w:pict>
+      </w:r>
+    </w:p>
+    <w:p>
+      <w:pPr>
+        <w:spacing w:before="100" w:beforeAutospacing="1" w:after="100" w:afterAutospacing="1"/>
+        <w:outlineLvl w:val="1"/>
+        <w:rPr>
+          <w:rFonts w:ascii="Times New Roman" w:eastAsia="Times New Roman" w:hAnsi="Times New Roman" w:cs="Times New Roman"/>
+          <w:b/>
+          <w:bCs/>
+          <w:kern w:val="0"/>
+          <w:sz w:val="36"/>
+          <w:szCs w:val="36"/>
+          <w:lang w:eastAsia="en-GB"/>
+          <w14:ligatures w14:val="none"/>
+        </w:rPr>
+      </w:pPr>
+      <w:r>
+        <w:rPr>
+          <w:rFonts w:ascii="Times New Roman" w:eastAsia="Times New Roman" w:hAnsi="Times New Roman" w:cs="Times New Roman"/>
+          <w:b/>
+          <w:bCs/>
+          <w:kern w:val="0"/>
+          <w:sz w:val="36"/>
+          <w:szCs w:val="36"/>
+          <w:lang w:eastAsia="en-GB"/>
+          <w14:ligatures w14:val="none"/>
+        </w:rPr>
+        <w:t>Outcomes for the Field</w:t>
+      </w:r>
+    </w:p>
+    <w:p>
+      <w:pPr>
+        <w:spacing w:before="100" w:beforeAutospacing="1" w:after="100" w:afterAutospacing="1"/>
+        <w:rPr>
+          <w:rFonts w:ascii="Times New Roman" w:eastAsia="Times New Roman" w:hAnsi="Times New Roman" w:cs="Times New Roman"/>
+          <w:kern w:val="0"/>
+          <w:lang w:eastAsia="en-GB"/>
+          <w14:ligatures w14:val="none"/>
+        </w:rPr>
+      </w:pPr>
+      <w:r>
+        <w:rPr>
+          <w:rFonts w:ascii="Times New Roman" w:eastAsia="Times New Roman" w:hAnsi="Times New Roman" w:cs="Times New Roman"/>
+          <w:kern w:val="0"/>
+          <w:lang w:eastAsia="en-GB"/>
+          <w14:ligatures w14:val="none"/>
+        </w:rPr>
+        <w:t>This fellowship will deliver:</w:t>
+      </w:r>
+    </w:p>
+    <w:p>
+      <w:pPr>
+        <w:numPr>
+          <w:ilvl w:val="0"/>
+          <w:numId w:val="2"/>
+        </w:numPr>
+        <w:spacing w:before="100" w:beforeAutospacing="1" w:after="100" w:afterAutospacing="1"/>
+        <w:rPr>
+          <w:rFonts w:ascii="Times New Roman" w:eastAsia="Times New Roman" w:hAnsi="Times New Roman" w:cs="Times New Roman"/>
+          <w:kern w:val="0"/>
+          <w:lang w:eastAsia="en-GB"/>
+          <w14:ligatures w14:val="none"/>
+        </w:rPr>
+      </w:pPr>
+      <w:r>
+        <w:rPr>
+          <w:rFonts w:ascii="Times New Roman" w:eastAsia="Times New Roman" w:hAnsi="Times New Roman" w:cs="Times New Roman"/>
+          <w:kern w:val="0"/>
+          <w:lang w:eastAsia="en-GB"/>
+          <w14:ligatures w14:val="none"/>
+        </w:rPr>
+        <w:t xml:space="preserve">A high-resolution reconstruction of </w:t>
+      </w:r>
+      <w:r>
+        <w:rPr>
+          <w:rFonts w:ascii="Times New Roman" w:eastAsia="Times New Roman" w:hAnsi="Times New Roman" w:cs="Times New Roman"/>
+          <w:i/>
+          <w:iCs/>
+          <w:kern w:val="0"/>
+          <w:lang w:eastAsia="en-GB"/>
+          <w14:ligatures w14:val="none"/>
+        </w:rPr>
+        <w:t>K. pneumoniae</w:t>
+      </w:r>
+      <w:r>
+        <w:rPr>
+          <w:rFonts w:ascii="Times New Roman" w:eastAsia="Times New Roman" w:hAnsi="Times New Roman" w:cs="Times New Roman"/>
+          <w:kern w:val="0"/>
+          <w:lang w:eastAsia="en-GB"/>
+          <w14:ligatures w14:val="none"/>
+        </w:rPr>
+        <w:t xml:space="preserve"> global emergence and horizontal pathoadaptation, establishing a new standard for population-scale plasmid and MGE analysis</w:t>
+      </w:r>
+    </w:p>
+    <w:p>
+      <w:pPr>
+        <w:numPr>
+          <w:ilvl w:val="0"/>
+          <w:numId w:val="2"/>
+        </w:numPr>
+        <w:spacing w:before="100" w:beforeAutospacing="1" w:after="100" w:afterAutospacing="1"/>
+        <w:rPr>
+          <w:rFonts w:ascii="Times New Roman" w:eastAsia="Times New Roman" w:hAnsi="Times New Roman" w:cs="Times New Roman"/>
+          <w:kern w:val="0"/>
+          <w:lang w:eastAsia="en-GB"/>
+          <w14:ligatures w14:val="none"/>
+        </w:rPr>
+      </w:pPr>
+      <w:r>
+        <w:rPr>
+          <w:rFonts w:ascii="Times New Roman" w:eastAsia="Times New Roman" w:hAnsi="Times New Roman" w:cs="Times New Roman"/>
+          <w:kern w:val="0"/>
+          <w:lang w:eastAsia="en-GB"/>
+          <w14:ligatures w14:val="none"/>
+        </w:rPr>
+        <w:t>Validated, scalable AMR and invasive disease prediction models across two major pathogens, with direct evidence on whether WGS can replace phenotypic AST in research workflows</w:t>
+      </w:r>
+    </w:p>
+    <w:p>
+      <w:pPr>
+        <w:numPr>
+          <w:ilvl w:val="0"/>
+          <w:numId w:val="2"/>
+        </w:numPr>
+        <w:spacing w:before="100" w:beforeAutospacing="1" w:after="100" w:afterAutospacing="1"/>
+        <w:rPr>
+          <w:rFonts w:ascii="Times New Roman" w:eastAsia="Times New Roman" w:hAnsi="Times New Roman" w:cs="Times New Roman"/>
+          <w:kern w:val="0"/>
+          <w:lang w:eastAsia="en-GB"/>
+          <w14:ligatures w14:val="none"/>
+        </w:rPr>
+      </w:pPr>
+      <w:r>
+        <w:rPr>
+          <w:rFonts w:ascii="Times New Roman" w:eastAsia="Times New Roman" w:hAnsi="Times New Roman" w:cs="Times New Roman"/>
+          <w:kern w:val="0"/>
+          <w:lang w:eastAsia="en-GB"/>
+          <w14:ligatures w14:val="none"/>
+        </w:rPr>
+        <w:t>Architectural insights into Bacformer's capacity to represent mobile genetic elements, with direct contribution to next-generation bacterial foundation model development</w:t>
+      </w:r>
+    </w:p>
+    <w:p>
+      <w:pPr>
+        <w:numPr>
+          <w:ilvl w:val="0"/>
+          <w:numId w:val="2"/>
+        </w:numPr>
+        <w:spacing w:before="100" w:beforeAutospacing="1" w:after="100" w:afterAutospacing="1"/>
+        <w:rPr>
+          <w:rFonts w:ascii="Times New Roman" w:eastAsia="Times New Roman" w:hAnsi="Times New Roman" w:cs="Times New Roman"/>
+          <w:kern w:val="0"/>
+          <w:lang w:eastAsia="en-GB"/>
+          <w14:ligatures w14:val="none"/>
+        </w:rPr>
+      </w:pPr>
+      <w:r>
+        <w:rPr>
+          <w:rFonts w:ascii="Times New Roman" w:eastAsia="Times New Roman" w:hAnsi="Times New Roman" w:cs="Times New Roman"/>
+          <w:kern w:val="0"/>
+          <w:lang w:eastAsia="en-GB"/>
+          <w14:ligatures w14:val="none"/>
+        </w:rPr>
+        <w:t>The first prospective, well-powered quantification of AST predictive value in chronic lung infection, and proof-of-concept genomics-guided antibiotic outcome prediction in this setting</w:t>
+      </w:r>
+    </w:p>
+    <w:p>
+      <w:pPr>
+        <w:spacing w:before="100" w:beforeAutospacing="1" w:after="100" w:afterAutospacing="1"/>
+        <w:rPr>
+          <w:rFonts w:ascii="Times New Roman" w:eastAsia="Times New Roman" w:hAnsi="Times New Roman" w:cs="Times New Roman"/>
+          <w:kern w:val="0"/>
+          <w:lang w:eastAsia="en-GB"/>
+          <w14:ligatures w14:val="none"/>
+        </w:rPr>
+      </w:pPr>
+      <w:r>
+        <w:rPr>
+          <w:rFonts w:ascii="Times New Roman" w:eastAsia="Times New Roman" w:hAnsi="Times New Roman" w:cs="Times New Roman"/>
+          <w:i/>
+          <w:iCs/>
+          <w:kern w:val="0"/>
+          <w:lang w:eastAsia="en-GB"/>
+          <w14:ligatures w14:val="none"/>
+        </w:rPr>
+        <w:t>~95 words</w:t>
+      </w:r>
+    </w:p>
+    <w:p>
+      <w:pPr>
+        <w:rPr>
+          <w:rFonts w:ascii="Times New Roman" w:eastAsia="Times New Roman" w:hAnsi="Times New Roman" w:cs="Times New Roman"/>
+          <w:kern w:val="0"/>
+          <w:lang w:eastAsia="en-GB"/>
+          <w14:ligatures w14:val="none"/>
+        </w:rPr>
+      </w:pPr>
+      <w:r>
+        <w:rPr>
+          <w:rFonts w:ascii="Times New Roman" w:eastAsia="Times New Roman" w:hAnsi="Times New Roman" w:cs="Times New Roman"/>
+          <w:noProof/>
+          <w:kern w:val="0"/>
+          <w:lang w:eastAsia="en-GB"/>
+        </w:rPr>
+        <w:pict w14:anchorId="4CE24D6E">
+          <v:rect id="_x0000_i1026" alt="" style="width:451.3pt;height:.05pt;mso-width-percent:0;mso-height-percent:0;mso-width-percent:0;mso-height-percent:0" o:hralign="center" o:hrstd="t" o:hr="t" fillcolor="#a0a0a0" stroked="f"/>
+        </w:pict>
+      </w:r>
+    </w:p>
+    <w:p>
+      <w:pPr>
+        <w:spacing w:before="100" w:beforeAutospacing="1" w:after="100" w:afterAutospacing="1"/>
+        <w:rPr>
+          <w:rFonts w:ascii="Times New Roman" w:eastAsia="Times New Roman" w:hAnsi="Times New Roman" w:cs="Times New Roman"/>
+          <w:kern w:val="0"/>
+          <w:lang w:eastAsia="en-GB"/>
+          <w14:ligatures w14:val="none"/>
+        </w:rPr>
+      </w:pPr>
+      <w:r>
+        <w:rPr>
+          <w:rFonts w:ascii="Times New Roman" w:eastAsia="Times New Roman" w:hAnsi="Times New Roman" w:cs="Times New Roman"/>
+          <w:b/>
+          <w:bCs/>
+          <w:kern w:val="0"/>
+          <w:lang w:eastAsia="en-GB"/>
+          <w14:ligatures w14:val="none"/>
+        </w:rPr>
+        <w:t>Closing section total: ~550 words</w:t>
+      </w:r>
+    </w:p>
+    <w:p>
+      <w:pPr>
+        <w:rPr>
+          <w:rFonts w:ascii="Times New Roman" w:eastAsia="Times New Roman" w:hAnsi="Times New Roman" w:cs="Times New Roman"/>
+          <w:kern w:val="0"/>
+          <w:lang w:eastAsia="en-GB"/>
+          <w14:ligatures w14:val="none"/>
+        </w:rPr>
+      </w:pPr>
+      <w:r>
+        <w:rPr>
+          <w:rFonts w:ascii="Times New Roman" w:eastAsia="Times New Roman" w:hAnsi="Times New Roman" w:cs="Times New Roman"/>
+          <w:kern w:val="0"/>
+          <w:lang w:eastAsia="en-GB"/>
+          <w14:ligatures w14:val="none"/>
+        </w:rPr>
+        <w:br w:type="page"/>
+      </w:r>
+    </w:p>
+    <w:p>
+      <w:pPr>
+        <w:rPr>
+          <w:rFonts w:ascii="Times New Roman" w:eastAsia="Times New Roman" w:hAnsi="Times New Roman" w:cs="Times New Roman"/>
+          <w:kern w:val="0"/>
+          <w:lang w:eastAsia="en-GB"/>
+          <w14:ligatures w14:val="none"/>
+        </w:rPr>
+      </w:pPr>
+      <w:r>
+        <w:rPr>
+          <w:rFonts w:ascii="Times New Roman" w:eastAsia="Times New Roman" w:hAnsi="Times New Roman" w:cs="Times New Roman"/>
+          <w:noProof/>
+          <w:kern w:val="0"/>
+          <w:lang w:eastAsia="en-GB"/>
+        </w:rPr>
+        <w:lastRenderedPageBreak/>
+        <w:pict w14:anchorId="5CCF1AF1">
+          <v:rect id="_x0000_i1025" alt="" style="width:451.3pt;height:.05pt;mso-width-percent:0;mso-height-percent:0;mso-width-percent:0;mso-height-percent:0" o:hralign="center" o:hrstd="t" o:hr="t" fillcolor="#a0a0a0" stroked="f"/>
+        </w:pict>
+      </w:r>
+    </w:p>
+    <w:p>
+      <w:pPr>
+        <w:spacing w:before="100" w:beforeAutospacing="1" w:after="100" w:afterAutospacing="1"/>
+        <w:outlineLvl w:val="1"/>
+        <w:rPr>
+          <w:rFonts w:ascii="Times New Roman" w:eastAsia="Times New Roman" w:hAnsi="Times New Roman" w:cs="Times New Roman"/>
+          <w:b/>
+          <w:bCs/>
+          <w:kern w:val="0"/>
+          <w:sz w:val="36"/>
+          <w:szCs w:val="36"/>
+          <w:lang w:eastAsia="en-GB"/>
+          <w14:ligatures w14:val="none"/>
+        </w:rPr>
+      </w:pPr>
+      <w:r>
+        <w:rPr>
+          <w:rFonts w:ascii="Times New Roman" w:eastAsia="Times New Roman" w:hAnsi="Times New Roman" w:cs="Times New Roman"/>
+          <w:b/>
+          <w:bCs/>
+          <w:kern w:val="0"/>
+          <w:sz w:val="36"/>
+          <w:szCs w:val="36"/>
+          <w:lang w:eastAsia="en-GB"/>
+          <w14:ligatures w14:val="none"/>
+        </w:rPr>
+        <w:t>Full Draft Word Count</w:t>
+      </w:r>
+    </w:p>
+    <w:tbl>
+      <w:tblPr>
+        <w:tblW w:w="0" w:type="auto"/>
+        <w:tblCellSpacing w:w="15" w:type="dxa"/>
+        <w:tblCellMar>
+          <w:top w:w="15" w:type="dxa"/>
+          <w:left w:w="15" w:type="dxa"/>
+          <w:bottom w:w="15" w:type="dxa"/>
+          <w:right w:w="15" w:type="dxa"/>
+        </w:tblCellMar>
+        <w:tblLook w:val="04A0" w:firstRow="1" w:lastRow="0" w:firstColumn="1" w:lastColumn="0" w:noHBand="0" w:noVBand="1"/>
+      </w:tblPr>
+      <w:tblGrid>
+        <w:gridCol w:w="2915"/>
+        <w:gridCol w:w="769"/>
+      </w:tblGrid>
+      <w:tr>
+        <w:trPr>
+          <w:tblHeader/>
+          <w:tblCellSpacing w:w="15" w:type="dxa"/>
+        </w:trPr>
+        <w:tc>
+          <w:tcPr>
+            <w:tcW w:w="0" w:type="auto"/>
+            <w:vAlign w:val="center"/>
+            <w:hideMark/>
+          </w:tcPr>
+          <w:p>
+            <w:pPr>
+              <w:jc w:val="center"/>
+              <w:rPr>
+                <w:rFonts w:ascii="Times New Roman" w:eastAsia="Times New Roman" w:hAnsi="Times New Roman" w:cs="Times New Roman"/>
+                <w:b/>
+                <w:bCs/>
+                <w:kern w:val="0"/>
+                <w:lang w:eastAsia="en-GB"/>
+                <w14:ligatures w14:val="none"/>
+              </w:rPr>
+            </w:pPr>
+            <w:r>
+              <w:rPr>
+                <w:rFonts w:ascii="Times New Roman" w:eastAsia="Times New Roman" w:hAnsi="Times New Roman" w:cs="Times New Roman"/>
+                <w:b/>
+                <w:bCs/>
+                <w:kern w:val="0"/>
+                <w:lang w:eastAsia="en-GB"/>
+                <w14:ligatures w14:val="none"/>
+              </w:rPr>
+              <w:t>Section</w:t>
+            </w:r>
+          </w:p>
+        </w:tc>
+        <w:tc>
+          <w:tcPr>
+            <w:tcW w:w="0" w:type="auto"/>
+            <w:vAlign w:val="center"/>
+            <w:hideMark/>
+          </w:tcPr>
+          <w:p>
+            <w:pPr>
+              <w:jc w:val="center"/>
+              <w:rPr>
+                <w:rFonts w:ascii="Times New Roman" w:eastAsia="Times New Roman" w:hAnsi="Times New Roman" w:cs="Times New Roman"/>
+                <w:b/>
+                <w:bCs/>
+                <w:kern w:val="0"/>
+                <w:lang w:eastAsia="en-GB"/>
+                <w14:ligatures w14:val="none"/>
+              </w:rPr>
+            </w:pPr>
+            <w:r>
+              <w:rPr>
+                <w:rFonts w:ascii="Times New Roman" w:eastAsia="Times New Roman" w:hAnsi="Times New Roman" w:cs="Times New Roman"/>
+                <w:b/>
+                <w:bCs/>
+                <w:kern w:val="0"/>
+                <w:lang w:eastAsia="en-GB"/>
+                <w14:ligatures w14:val="none"/>
+              </w:rPr>
+              <w:t>Words</w:t>
+            </w:r>
+          </w:p>
+        </w:tc>
+      </w:tr>
+      <w:tr>
+        <w:trPr>
+          <w:tblCellSpacing w:w="15" w:type="dxa"/>
+        </w:trPr>
+        <w:tc>
+          <w:tcPr>
+            <w:tcW w:w="0" w:type="auto"/>
+            <w:vAlign w:val="center"/>
+            <w:hideMark/>
+          </w:tcPr>
+          <w:p>
+            <w:pPr>
+              <w:rPr>
+                <w:rFonts w:ascii="Times New Roman" w:eastAsia="Times New Roman" w:hAnsi="Times New Roman" w:cs="Times New Roman"/>
+                <w:kern w:val="0"/>
+                <w:lang w:eastAsia="en-GB"/>
+                <w14:ligatures w14:val="none"/>
+              </w:rPr>
+            </w:pPr>
+            <w:r>
+              <w:rPr>
+                <w:rFonts w:ascii="Times New Roman" w:eastAsia="Times New Roman" w:hAnsi="Times New Roman" w:cs="Times New Roman"/>
+                <w:kern w:val="0"/>
+                <w:lang w:eastAsia="en-GB"/>
+                <w14:ligatures w14:val="none"/>
+              </w:rPr>
+              <w:t>Motivation</w:t>
+            </w:r>
+          </w:p>
+        </w:tc>
+        <w:tc>
+          <w:tcPr>
+            <w:tcW w:w="0" w:type="auto"/>
+            <w:vAlign w:val="center"/>
+            <w:hideMark/>
+          </w:tcPr>
+          <w:p>
+            <w:pPr>
+              <w:rPr>
+                <w:rFonts w:ascii="Times New Roman" w:eastAsia="Times New Roman" w:hAnsi="Times New Roman" w:cs="Times New Roman"/>
+                <w:kern w:val="0"/>
+                <w:lang w:eastAsia="en-GB"/>
+                <w14:ligatures w14:val="none"/>
+              </w:rPr>
+            </w:pPr>
+            <w:r>
+              <w:rPr>
+                <w:rFonts w:ascii="Times New Roman" w:eastAsia="Times New Roman" w:hAnsi="Times New Roman" w:cs="Times New Roman"/>
+                <w:kern w:val="0"/>
+                <w:lang w:eastAsia="en-GB"/>
+                <w14:ligatures w14:val="none"/>
+              </w:rPr>
+              <w:t>~160</w:t>
+            </w:r>
+          </w:p>
+        </w:tc>
+      </w:tr>
+      <w:tr>
+        <w:trPr>
+          <w:tblCellSpacing w:w="15" w:type="dxa"/>
+        </w:trPr>
+        <w:tc>
+          <w:tcPr>
+            <w:tcW w:w="0" w:type="auto"/>
+            <w:vAlign w:val="center"/>
+            <w:hideMark/>
+          </w:tcPr>
+          <w:p>
+            <w:pPr>
+              <w:rPr>
+                <w:rFonts w:ascii="Times New Roman" w:eastAsia="Times New Roman" w:hAnsi="Times New Roman" w:cs="Times New Roman"/>
+                <w:kern w:val="0"/>
+                <w:lang w:eastAsia="en-GB"/>
+                <w14:ligatures w14:val="none"/>
+              </w:rPr>
+            </w:pPr>
+            <w:r>
+              <w:rPr>
+                <w:rFonts w:ascii="Times New Roman" w:eastAsia="Times New Roman" w:hAnsi="Times New Roman" w:cs="Times New Roman"/>
+                <w:kern w:val="0"/>
+                <w:lang w:eastAsia="en-GB"/>
+                <w14:ligatures w14:val="none"/>
+              </w:rPr>
+              <w:t>Aims</w:t>
+            </w:r>
+          </w:p>
+        </w:tc>
+        <w:tc>
+          <w:tcPr>
+            <w:tcW w:w="0" w:type="auto"/>
+            <w:vAlign w:val="center"/>
+            <w:hideMark/>
+          </w:tcPr>
+          <w:p>
+            <w:pPr>
+              <w:rPr>
+                <w:rFonts w:ascii="Times New Roman" w:eastAsia="Times New Roman" w:hAnsi="Times New Roman" w:cs="Times New Roman"/>
+                <w:kern w:val="0"/>
+                <w:lang w:eastAsia="en-GB"/>
+                <w14:ligatures w14:val="none"/>
+              </w:rPr>
+            </w:pPr>
+            <w:r>
+              <w:rPr>
+                <w:rFonts w:ascii="Times New Roman" w:eastAsia="Times New Roman" w:hAnsi="Times New Roman" w:cs="Times New Roman"/>
+                <w:kern w:val="0"/>
+                <w:lang w:eastAsia="en-GB"/>
+                <w14:ligatures w14:val="none"/>
+              </w:rPr>
+              <w:t>~110</w:t>
+            </w:r>
+          </w:p>
+        </w:tc>
+      </w:tr>
+      <w:tr>
+        <w:trPr>
+          <w:tblCellSpacing w:w="15" w:type="dxa"/>
+        </w:trPr>
+        <w:tc>
+          <w:tcPr>
+            <w:tcW w:w="0" w:type="auto"/>
+            <w:vAlign w:val="center"/>
+            <w:hideMark/>
+          </w:tcPr>
+          <w:p>
+            <w:pPr>
+              <w:rPr>
+                <w:rFonts w:ascii="Times New Roman" w:eastAsia="Times New Roman" w:hAnsi="Times New Roman" w:cs="Times New Roman"/>
+                <w:kern w:val="0"/>
+                <w:lang w:eastAsia="en-GB"/>
+                <w14:ligatures w14:val="none"/>
+              </w:rPr>
+            </w:pPr>
+            <w:r>
+              <w:rPr>
+                <w:rFonts w:ascii="Times New Roman" w:eastAsia="Times New Roman" w:hAnsi="Times New Roman" w:cs="Times New Roman"/>
+                <w:kern w:val="0"/>
+                <w:lang w:eastAsia="en-GB"/>
+                <w14:ligatures w14:val="none"/>
+              </w:rPr>
+              <w:t>WP1</w:t>
+            </w:r>
+          </w:p>
+        </w:tc>
+        <w:tc>
+          <w:tcPr>
+            <w:tcW w:w="0" w:type="auto"/>
+            <w:vAlign w:val="center"/>
+            <w:hideMark/>
+          </w:tcPr>
+          <w:p>
+            <w:pPr>
+              <w:rPr>
+                <w:rFonts w:ascii="Times New Roman" w:eastAsia="Times New Roman" w:hAnsi="Times New Roman" w:cs="Times New Roman"/>
+                <w:kern w:val="0"/>
+                <w:lang w:eastAsia="en-GB"/>
+                <w14:ligatures w14:val="none"/>
+              </w:rPr>
+            </w:pPr>
+            <w:r>
+              <w:rPr>
+                <w:rFonts w:ascii="Times New Roman" w:eastAsia="Times New Roman" w:hAnsi="Times New Roman" w:cs="Times New Roman"/>
+                <w:kern w:val="0"/>
+                <w:lang w:eastAsia="en-GB"/>
+                <w14:ligatures w14:val="none"/>
+              </w:rPr>
+              <w:t>~495</w:t>
+            </w:r>
+          </w:p>
+        </w:tc>
+      </w:tr>
+      <w:tr>
+        <w:trPr>
+          <w:tblCellSpacing w:w="15" w:type="dxa"/>
+        </w:trPr>
+        <w:tc>
+          <w:tcPr>
+            <w:tcW w:w="0" w:type="auto"/>
+            <w:vAlign w:val="center"/>
+            <w:hideMark/>
+          </w:tcPr>
+          <w:p>
+            <w:pPr>
+              <w:rPr>
+                <w:rFonts w:ascii="Times New Roman" w:eastAsia="Times New Roman" w:hAnsi="Times New Roman" w:cs="Times New Roman"/>
+                <w:kern w:val="0"/>
+                <w:lang w:eastAsia="en-GB"/>
+                <w14:ligatures w14:val="none"/>
+              </w:rPr>
+            </w:pPr>
+            <w:r>
+              <w:rPr>
+                <w:rFonts w:ascii="Times New Roman" w:eastAsia="Times New Roman" w:hAnsi="Times New Roman" w:cs="Times New Roman"/>
+                <w:kern w:val="0"/>
+                <w:lang w:eastAsia="en-GB"/>
+                <w14:ligatures w14:val="none"/>
+              </w:rPr>
+              <w:t>WP2</w:t>
+            </w:r>
+          </w:p>
+        </w:tc>
+        <w:tc>
+          <w:tcPr>
+            <w:tcW w:w="0" w:type="auto"/>
+            <w:vAlign w:val="center"/>
+            <w:hideMark/>
+          </w:tcPr>
+          <w:p>
+            <w:pPr>
+              <w:rPr>
+                <w:rFonts w:ascii="Times New Roman" w:eastAsia="Times New Roman" w:hAnsi="Times New Roman" w:cs="Times New Roman"/>
+                <w:kern w:val="0"/>
+                <w:lang w:eastAsia="en-GB"/>
+                <w14:ligatures w14:val="none"/>
+              </w:rPr>
+            </w:pPr>
+            <w:r>
+              <w:rPr>
+                <w:rFonts w:ascii="Times New Roman" w:eastAsia="Times New Roman" w:hAnsi="Times New Roman" w:cs="Times New Roman"/>
+                <w:kern w:val="0"/>
+                <w:lang w:eastAsia="en-GB"/>
+                <w14:ligatures w14:val="none"/>
+              </w:rPr>
+              <w:t>~550</w:t>
+            </w:r>
+          </w:p>
+        </w:tc>
+      </w:tr>
+      <w:tr>
+        <w:trPr>
+          <w:tblCellSpacing w:w="15" w:type="dxa"/>
+        </w:trPr>
+        <w:tc>
+          <w:tcPr>
+            <w:tcW w:w="0" w:type="auto"/>
+            <w:vAlign w:val="center"/>
+            <w:hideMark/>
+          </w:tcPr>
+          <w:p>
+            <w:pPr>
+              <w:rPr>
+                <w:rFonts w:ascii="Times New Roman" w:eastAsia="Times New Roman" w:hAnsi="Times New Roman" w:cs="Times New Roman"/>
+                <w:kern w:val="0"/>
+                <w:lang w:eastAsia="en-GB"/>
+                <w14:ligatures w14:val="none"/>
+              </w:rPr>
+            </w:pPr>
+            <w:r>
+              <w:rPr>
+                <w:rFonts w:ascii="Times New Roman" w:eastAsia="Times New Roman" w:hAnsi="Times New Roman" w:cs="Times New Roman"/>
+                <w:kern w:val="0"/>
+                <w:lang w:eastAsia="en-GB"/>
+                <w14:ligatures w14:val="none"/>
+              </w:rPr>
+              <w:t xml:space="preserve">WP3 </w:t>
+            </w:r>
+          </w:p>
+        </w:tc>
+        <w:tc>
+          <w:tcPr>
+            <w:tcW w:w="0" w:type="auto"/>
+            <w:vAlign w:val="center"/>
+            <w:hideMark/>
+          </w:tcPr>
+          <w:p>
+            <w:pPr>
+              <w:rPr>
+                <w:rFonts w:ascii="Times New Roman" w:eastAsia="Times New Roman" w:hAnsi="Times New Roman" w:cs="Times New Roman"/>
+                <w:kern w:val="0"/>
+                <w:lang w:eastAsia="en-GB"/>
+                <w14:ligatures w14:val="none"/>
+              </w:rPr>
+            </w:pPr>
+            <w:r>
+              <w:rPr>
+                <w:rFonts w:ascii="Times New Roman" w:eastAsia="Times New Roman" w:hAnsi="Times New Roman" w:cs="Times New Roman"/>
+                <w:kern w:val="0"/>
+                <w:lang w:eastAsia="en-GB"/>
+                <w14:ligatures w14:val="none"/>
+              </w:rPr>
+              <w:t>~645</w:t>
+            </w:r>
+          </w:p>
+        </w:tc>
+      </w:tr>
+      <w:tr>
+        <w:trPr>
+          <w:tblCellSpacing w:w="15" w:type="dxa"/>
+        </w:trPr>
+        <w:tc>
+          <w:tcPr>
+            <w:tcW w:w="0" w:type="auto"/>
+            <w:vAlign w:val="center"/>
+            <w:hideMark/>
+          </w:tcPr>
+          <w:p>
+            <w:pPr>
+              <w:rPr>
+                <w:rFonts w:ascii="Times New Roman" w:eastAsia="Times New Roman" w:hAnsi="Times New Roman" w:cs="Times New Roman"/>
+                <w:kern w:val="0"/>
+                <w:lang w:eastAsia="en-GB"/>
+                <w14:ligatures w14:val="none"/>
+              </w:rPr>
+            </w:pPr>
+            <w:r>
+              <w:rPr>
+                <w:rFonts w:ascii="Times New Roman" w:eastAsia="Times New Roman" w:hAnsi="Times New Roman" w:cs="Times New Roman"/>
+                <w:kern w:val="0"/>
+                <w:lang w:eastAsia="en-GB"/>
+                <w14:ligatures w14:val="none"/>
+              </w:rPr>
+              <w:t>Feasibility, Risks &amp; Timeline</w:t>
+            </w:r>
+          </w:p>
+        </w:tc>
+        <w:tc>
+          <w:tcPr>
+            <w:tcW w:w="0" w:type="auto"/>
+            <w:vAlign w:val="center"/>
+            <w:hideMark/>
+          </w:tcPr>
+          <w:p>
+            <w:pPr>
+              <w:rPr>
+                <w:rFonts w:ascii="Times New Roman" w:eastAsia="Times New Roman" w:hAnsi="Times New Roman" w:cs="Times New Roman"/>
+                <w:kern w:val="0"/>
+                <w:lang w:eastAsia="en-GB"/>
+                <w14:ligatures w14:val="none"/>
+              </w:rPr>
+            </w:pPr>
+            <w:r>
+              <w:rPr>
+                <w:rFonts w:ascii="Times New Roman" w:eastAsia="Times New Roman" w:hAnsi="Times New Roman" w:cs="Times New Roman"/>
+                <w:kern w:val="0"/>
+                <w:lang w:eastAsia="en-GB"/>
+                <w14:ligatures w14:val="none"/>
+              </w:rPr>
+              <w:t>~390</w:t>
+            </w:r>
+          </w:p>
+        </w:tc>
+      </w:tr>
+      <w:tr>
+        <w:trPr>
+          <w:tblCellSpacing w:w="15" w:type="dxa"/>
+        </w:trPr>
+        <w:tc>
+          <w:tcPr>
+            <w:tcW w:w="0" w:type="auto"/>
+            <w:vAlign w:val="center"/>
+            <w:hideMark/>
+          </w:tcPr>
+          <w:p>
+            <w:pPr>
+              <w:rPr>
+                <w:rFonts w:ascii="Times New Roman" w:eastAsia="Times New Roman" w:hAnsi="Times New Roman" w:cs="Times New Roman"/>
+                <w:kern w:val="0"/>
+                <w:lang w:eastAsia="en-GB"/>
+                <w14:ligatures w14:val="none"/>
+              </w:rPr>
+            </w:pPr>
+            <w:r>
+              <w:rPr>
+                <w:rFonts w:ascii="Times New Roman" w:eastAsia="Times New Roman" w:hAnsi="Times New Roman" w:cs="Times New Roman"/>
+                <w:kern w:val="0"/>
+                <w:lang w:eastAsia="en-GB"/>
+                <w14:ligatures w14:val="none"/>
+              </w:rPr>
+              <w:t>Outcomes</w:t>
+            </w:r>
+          </w:p>
+        </w:tc>
+        <w:tc>
+          <w:tcPr>
+            <w:tcW w:w="0" w:type="auto"/>
+            <w:vAlign w:val="center"/>
+            <w:hideMark/>
+          </w:tcPr>
+          <w:p>
+            <w:pPr>
+              <w:rPr>
+                <w:rFonts w:ascii="Times New Roman" w:eastAsia="Times New Roman" w:hAnsi="Times New Roman" w:cs="Times New Roman"/>
+                <w:kern w:val="0"/>
+                <w:lang w:eastAsia="en-GB"/>
+                <w14:ligatures w14:val="none"/>
+              </w:rPr>
+            </w:pPr>
+            <w:r>
+              <w:rPr>
+                <w:rFonts w:ascii="Times New Roman" w:eastAsia="Times New Roman" w:hAnsi="Times New Roman" w:cs="Times New Roman"/>
+                <w:kern w:val="0"/>
+                <w:lang w:eastAsia="en-GB"/>
+                <w14:ligatures w14:val="none"/>
+              </w:rPr>
+              <w:t>~95</w:t>
+            </w:r>
+          </w:p>
+        </w:tc>
+      </w:tr>
+      <w:tr>
+        <w:trPr>
+          <w:tblCellSpacing w:w="15" w:type="dxa"/>
+        </w:trPr>
+        <w:tc>
+          <w:tcPr>
+            <w:tcW w:w="0" w:type="auto"/>
+            <w:vAlign w:val="center"/>
+            <w:hideMark/>
+          </w:tcPr>
+          <w:p>
+            <w:pPr>
+              <w:rPr>
+                <w:rFonts w:ascii="Times New Roman" w:eastAsia="Times New Roman" w:hAnsi="Times New Roman" w:cs="Times New Roman"/>
+                <w:kern w:val="0"/>
+                <w:lang w:eastAsia="en-GB"/>
+                <w14:ligatures w14:val="none"/>
+              </w:rPr>
+            </w:pPr>
+            <w:r>
+              <w:rPr>
+                <w:rFonts w:ascii="Times New Roman" w:eastAsia="Times New Roman" w:hAnsi="Times New Roman" w:cs="Times New Roman"/>
+                <w:b/>
+                <w:bCs/>
+                <w:kern w:val="0"/>
+                <w:lang w:eastAsia="en-GB"/>
+                <w14:ligatures w14:val="none"/>
+              </w:rPr>
+              <w:t>Total</w:t>
+            </w:r>
+          </w:p>
+        </w:tc>
+        <w:tc>
+          <w:tcPr>
+            <w:tcW w:w="0" w:type="auto"/>
+            <w:vAlign w:val="center"/>
+            <w:hideMark/>
+          </w:tcPr>
+          <w:p>
+            <w:pPr>
+              <w:rPr>
+                <w:rFonts w:ascii="Times New Roman" w:eastAsia="Times New Roman" w:hAnsi="Times New Roman" w:cs="Times New Roman"/>
+                <w:kern w:val="0"/>
+                <w:lang w:eastAsia="en-GB"/>
+                <w14:ligatures w14:val="none"/>
+              </w:rPr>
+            </w:pPr>
+            <w:r>
+              <w:rPr>
+                <w:rFonts w:ascii="Times New Roman" w:eastAsia="Times New Roman" w:hAnsi="Times New Roman" w:cs="Times New Roman"/>
+                <w:b/>
+                <w:bCs/>
+                <w:kern w:val="0"/>
+                <w:lang w:eastAsia="en-GB"/>
+                <w14:ligatures w14:val="none"/>
+              </w:rPr>
+              <w:t>~2,445</w:t>
+            </w:r>
+          </w:p>
+        </w:tc>
+      </w:tr>
+    </w:tbl>
+    <w:p>
+      <w:pPr>
+        <w:spacing w:before="100" w:beforeAutospacing="1" w:after="100" w:afterAutospacing="1"/>
+        <w:rPr>
+          <w:rFonts w:ascii="Times New Roman" w:eastAsia="Times New Roman" w:hAnsi="Times New Roman" w:cs="Times New Roman"/>
+          <w:kern w:val="0"/>
+          <w:lang w:eastAsia="en-GB"/>
+          <w14:ligatures w14:val="none"/>
+        </w:rPr>
+      </w:pPr>
+      <w:r>
+        <w:rPr>
+          <w:rFonts w:ascii="Times New Roman" w:eastAsia="Times New Roman" w:hAnsi="Times New Roman" w:cs="Times New Roman"/>
+          <w:kern w:val="0"/>
+          <w:lang w:eastAsia="en-GB"/>
+          <w14:ligatures w14:val="none"/>
+        </w:rPr>
+        <w:t xml:space="preserve">We are approximately </w:t>
+      </w:r>
+      <w:r>
+        <w:rPr>
+          <w:rFonts w:ascii="Times New Roman" w:eastAsia="Times New Roman" w:hAnsi="Times New Roman" w:cs="Times New Roman"/>
+          <w:b/>
+          <w:bCs/>
+          <w:kern w:val="0"/>
+          <w:lang w:eastAsia="en-GB"/>
+          <w14:ligatures w14:val="none"/>
+        </w:rPr>
+        <w:t>445 words over</w:t>
+      </w:r>
+      <w:r>
+        <w:rPr>
+          <w:rFonts w:ascii="Times New Roman" w:eastAsia="Times New Roman" w:hAnsi="Times New Roman" w:cs="Times New Roman"/>
+          <w:kern w:val="0"/>
+          <w:lang w:eastAsia="en-GB"/>
+          <w14:ligatures w14:val="none"/>
+        </w:rPr>
+        <w:t>. The main candidates for trimming in the next pass are: WP2 Preliminary Data (~95 words, partially redundant with the Feasibility section), the WP3 background (could lose the MIC numbers detail), and the Expected Outcomes subsections within each WP (which partly duplicate the closing Outcomes). Shall I do that consolidation pass now?</w:t>
+      </w:r>
+    </w:p>
+    <w:p>
+      <w:pPr>
+        <w:rPr>
+          <w:rFonts w:ascii="Times New Roman" w:eastAsia="Times New Roman" w:hAnsi="Times New Roman" w:cs="Times New Roman"/>
+          <w:b/>
+          <w:bCs/>
+          <w:kern w:val="0"/>
+          <w:lang w:eastAsia="en-GB"/>
+          <w14:ligatures w14:val="none"/>
+        </w:rPr>
+      </w:pPr>
+    </w:p>
     <w:sectPr>
       <w:pgSz w:w="11906" w:h="16838"/>
       <w:pgMar w:top="1440" w:right="1440" w:bottom="1440" w:left="1440" w:header="708" w:footer="708" w:gutter="0"/>
@@ -11,6 +4299,279 @@
     </w:sectPr>
   </w:body>
 </w:document>
+</file>
+
+<file path=word/numbering.xml><?xml version="1.0" encoding="utf-8"?>
+<w:numbering xmlns:wpc="http://schemas.microsoft.com/office/word/2010/wordprocessingCanvas" xmlns:cx="http://schemas.microsoft.com/office/drawing/2014/chartex" xmlns:cx1="http://schemas.microsoft.com/office/drawing/2015/9/8/chartex" xmlns:cx2="http://schemas.microsoft.com/office/drawing/2015/10/21/chartex" xmlns:cx3="http://schemas.microsoft.com/office/drawing/2016/5/9/chartex" xmlns:cx4="http://schemas.microsoft.com/office/drawing/2016/5/10/chartex" xmlns:cx5="http://schemas.microsoft.com/office/drawing/2016/5/11/chartex" xmlns:cx6="http://schemas.microsoft.com/office/drawing/2016/5/12/chartex" xmlns:cx7="http://schemas.microsoft.com/office/drawing/2016/5/13/chartex" xmlns:cx8="http://schemas.microsoft.com/office/drawing/2016/5/14/chartex" xmlns:mc="http://schemas.openxmlformats.org/markup-compatibility/2006" xmlns:aink="http://schemas.microsoft.com/office/drawing/2016/ink" xmlns:am3d="http://schemas.microsoft.com/office/drawing/2017/model3d" xmlns:o="urn:schemas-microsoft-com:office:office" xmlns:oel="http://schemas.microsoft.com/office/2019/extlst" xmlns:r="http://schemas.openxmlformats.org/officeDocument/2006/relationships" xmlns:m="http://schemas.openxmlformats.org/officeDocument/2006/math" xmlns:v="urn:schemas-microsoft-com:vml" xmlns:wp14="http://schemas.microsoft.com/office/word/2010/wordprocessingDrawing" xmlns:wp="http://schemas.openxmlformats.org/drawingml/2006/wordprocessingDrawing" xmlns:w10="urn:schemas-microsoft-com:office:word" xmlns:w="http://schemas.openxmlformats.org/wordprocessingml/2006/main" xmlns:w14="http://schemas.microsoft.com/office/word/2010/wordml" xmlns:w15="http://schemas.microsoft.com/office/word/2012/wordml" xmlns:w16cex="http://schemas.microsoft.com/office/word/2018/wordml/cex" xmlns:w16cid="http://schemas.microsoft.com/office/word/2016/wordml/cid" xmlns:w16="http://schemas.microsoft.com/office/word/2018/wordml" xmlns:w16du="http://schemas.microsoft.com/office/word/2023/wordml/word16du" xmlns:w16sdtdh="http://schemas.microsoft.com/office/word/2020/wordml/sdtdatahash" xmlns:w16sdtfl="http://schemas.microsoft.com/office/word/2024/wordml/sdtformatlock" xmlns:w16se="http://schemas.microsoft.com/office/word/2015/wordml/symex" xmlns:wpg="http://schemas.microsoft.com/office/word/2010/wordprocessingGroup" xmlns:wpi="http://schemas.microsoft.com/office/word/2010/wordprocessingInk" xmlns:wne="http://schemas.microsoft.com/office/word/2006/wordml" xmlns:wps="http://schemas.microsoft.com/office/word/2010/wordprocessingShape" mc:Ignorable="w14 w15 w16se w16cid w16 w16cex w16sdtdh w16sdtfl w16du wp14">
+  <w:abstractNum w:abstractNumId="0" w15:restartNumberingAfterBreak="0">
+    <w:nsid w:val="2229250E"/>
+    <w:multiLevelType w:val="multilevel"/>
+    <w:tmpl w:val="7C76511A"/>
+    <w:lvl w:ilvl="0">
+      <w:start w:val="1"/>
+      <w:numFmt w:val="decimal"/>
+      <w:lvlText w:val="%1."/>
+      <w:lvlJc w:val="left"/>
+      <w:pPr>
+        <w:tabs>
+          <w:tab w:val="num" w:pos="720"/>
+        </w:tabs>
+        <w:ind w:left="720" w:hanging="360"/>
+      </w:pPr>
+    </w:lvl>
+    <w:lvl w:ilvl="1" w:tentative="1">
+      <w:start w:val="1"/>
+      <w:numFmt w:val="decimal"/>
+      <w:lvlText w:val="%2."/>
+      <w:lvlJc w:val="left"/>
+      <w:pPr>
+        <w:tabs>
+          <w:tab w:val="num" w:pos="1440"/>
+        </w:tabs>
+        <w:ind w:left="1440" w:hanging="360"/>
+      </w:pPr>
+    </w:lvl>
+    <w:lvl w:ilvl="2" w:tentative="1">
+      <w:start w:val="1"/>
+      <w:numFmt w:val="decimal"/>
+      <w:lvlText w:val="%3."/>
+      <w:lvlJc w:val="left"/>
+      <w:pPr>
+        <w:tabs>
+          <w:tab w:val="num" w:pos="2160"/>
+        </w:tabs>
+        <w:ind w:left="2160" w:hanging="360"/>
+      </w:pPr>
+    </w:lvl>
+    <w:lvl w:ilvl="3" w:tentative="1">
+      <w:start w:val="1"/>
+      <w:numFmt w:val="decimal"/>
+      <w:lvlText w:val="%4."/>
+      <w:lvlJc w:val="left"/>
+      <w:pPr>
+        <w:tabs>
+          <w:tab w:val="num" w:pos="2880"/>
+        </w:tabs>
+        <w:ind w:left="2880" w:hanging="360"/>
+      </w:pPr>
+    </w:lvl>
+    <w:lvl w:ilvl="4" w:tentative="1">
+      <w:start w:val="1"/>
+      <w:numFmt w:val="decimal"/>
+      <w:lvlText w:val="%5."/>
+      <w:lvlJc w:val="left"/>
+      <w:pPr>
+        <w:tabs>
+          <w:tab w:val="num" w:pos="3600"/>
+        </w:tabs>
+        <w:ind w:left="3600" w:hanging="360"/>
+      </w:pPr>
+    </w:lvl>
+    <w:lvl w:ilvl="5" w:tentative="1">
+      <w:start w:val="1"/>
+      <w:numFmt w:val="decimal"/>
+      <w:lvlText w:val="%6."/>
+      <w:lvlJc w:val="left"/>
+      <w:pPr>
+        <w:tabs>
+          <w:tab w:val="num" w:pos="4320"/>
+        </w:tabs>
+        <w:ind w:left="4320" w:hanging="360"/>
+      </w:pPr>
+    </w:lvl>
+    <w:lvl w:ilvl="6" w:tentative="1">
+      <w:start w:val="1"/>
+      <w:numFmt w:val="decimal"/>
+      <w:lvlText w:val="%7."/>
+      <w:lvlJc w:val="left"/>
+      <w:pPr>
+        <w:tabs>
+          <w:tab w:val="num" w:pos="5040"/>
+        </w:tabs>
+        <w:ind w:left="5040" w:hanging="360"/>
+      </w:pPr>
+    </w:lvl>
+    <w:lvl w:ilvl="7" w:tentative="1">
+      <w:start w:val="1"/>
+      <w:numFmt w:val="decimal"/>
+      <w:lvlText w:val="%8."/>
+      <w:lvlJc w:val="left"/>
+      <w:pPr>
+        <w:tabs>
+          <w:tab w:val="num" w:pos="5760"/>
+        </w:tabs>
+        <w:ind w:left="5760" w:hanging="360"/>
+      </w:pPr>
+    </w:lvl>
+    <w:lvl w:ilvl="8" w:tentative="1">
+      <w:start w:val="1"/>
+      <w:numFmt w:val="decimal"/>
+      <w:lvlText w:val="%9."/>
+      <w:lvlJc w:val="left"/>
+      <w:pPr>
+        <w:tabs>
+          <w:tab w:val="num" w:pos="6480"/>
+        </w:tabs>
+        <w:ind w:left="6480" w:hanging="360"/>
+      </w:pPr>
+    </w:lvl>
+  </w:abstractNum>
+  <w:abstractNum w:abstractNumId="1" w15:restartNumberingAfterBreak="0">
+    <w:nsid w:val="57162217"/>
+    <w:multiLevelType w:val="multilevel"/>
+    <w:tmpl w:val="2CC252B0"/>
+    <w:lvl w:ilvl="0">
+      <w:start w:val="1"/>
+      <w:numFmt w:val="bullet"/>
+      <w:lvlText w:val=""/>
+      <w:lvlJc w:val="left"/>
+      <w:pPr>
+        <w:tabs>
+          <w:tab w:val="num" w:pos="720"/>
+        </w:tabs>
+        <w:ind w:left="720" w:hanging="360"/>
+      </w:pPr>
+      <w:rPr>
+        <w:rFonts w:ascii="Symbol" w:hAnsi="Symbol" w:hint="default"/>
+        <w:sz w:val="20"/>
+      </w:rPr>
+    </w:lvl>
+    <w:lvl w:ilvl="1" w:tentative="1">
+      <w:start w:val="1"/>
+      <w:numFmt w:val="bullet"/>
+      <w:lvlText w:val="o"/>
+      <w:lvlJc w:val="left"/>
+      <w:pPr>
+        <w:tabs>
+          <w:tab w:val="num" w:pos="1440"/>
+        </w:tabs>
+        <w:ind w:left="1440" w:hanging="360"/>
+      </w:pPr>
+      <w:rPr>
+        <w:rFonts w:ascii="Courier New" w:hAnsi="Courier New" w:hint="default"/>
+        <w:sz w:val="20"/>
+      </w:rPr>
+    </w:lvl>
+    <w:lvl w:ilvl="2" w:tentative="1">
+      <w:start w:val="1"/>
+      <w:numFmt w:val="bullet"/>
+      <w:lvlText w:val=""/>
+      <w:lvlJc w:val="left"/>
+      <w:pPr>
+        <w:tabs>
+          <w:tab w:val="num" w:pos="2160"/>
+        </w:tabs>
+        <w:ind w:left="2160" w:hanging="360"/>
+      </w:pPr>
+      <w:rPr>
+        <w:rFonts w:ascii="Wingdings" w:hAnsi="Wingdings" w:hint="default"/>
+        <w:sz w:val="20"/>
+      </w:rPr>
+    </w:lvl>
+    <w:lvl w:ilvl="3" w:tentative="1">
+      <w:start w:val="1"/>
+      <w:numFmt w:val="bullet"/>
+      <w:lvlText w:val=""/>
+      <w:lvlJc w:val="left"/>
+      <w:pPr>
+        <w:tabs>
+          <w:tab w:val="num" w:pos="2880"/>
+        </w:tabs>
+        <w:ind w:left="2880" w:hanging="360"/>
+      </w:pPr>
+      <w:rPr>
+        <w:rFonts w:ascii="Wingdings" w:hAnsi="Wingdings" w:hint="default"/>
+        <w:sz w:val="20"/>
+      </w:rPr>
+    </w:lvl>
+    <w:lvl w:ilvl="4" w:tentative="1">
+      <w:start w:val="1"/>
+      <w:numFmt w:val="bullet"/>
+      <w:lvlText w:val=""/>
+      <w:lvlJc w:val="left"/>
+      <w:pPr>
+        <w:tabs>
+          <w:tab w:val="num" w:pos="3600"/>
+        </w:tabs>
+        <w:ind w:left="3600" w:hanging="360"/>
+      </w:pPr>
+      <w:rPr>
+        <w:rFonts w:ascii="Wingdings" w:hAnsi="Wingdings" w:hint="default"/>
+        <w:sz w:val="20"/>
+      </w:rPr>
+    </w:lvl>
+    <w:lvl w:ilvl="5" w:tentative="1">
+      <w:start w:val="1"/>
+      <w:numFmt w:val="bullet"/>
+      <w:lvlText w:val=""/>
+      <w:lvlJc w:val="left"/>
+      <w:pPr>
+        <w:tabs>
+          <w:tab w:val="num" w:pos="4320"/>
+        </w:tabs>
+        <w:ind w:left="4320" w:hanging="360"/>
+      </w:pPr>
+      <w:rPr>
+        <w:rFonts w:ascii="Wingdings" w:hAnsi="Wingdings" w:hint="default"/>
+        <w:sz w:val="20"/>
+      </w:rPr>
+    </w:lvl>
+    <w:lvl w:ilvl="6" w:tentative="1">
+      <w:start w:val="1"/>
+      <w:numFmt w:val="bullet"/>
+      <w:lvlText w:val=""/>
+      <w:lvlJc w:val="left"/>
+      <w:pPr>
+        <w:tabs>
+          <w:tab w:val="num" w:pos="5040"/>
+        </w:tabs>
+        <w:ind w:left="5040" w:hanging="360"/>
+      </w:pPr>
+      <w:rPr>
+        <w:rFonts w:ascii="Wingdings" w:hAnsi="Wingdings" w:hint="default"/>
+        <w:sz w:val="20"/>
+      </w:rPr>
+    </w:lvl>
+    <w:lvl w:ilvl="7" w:tentative="1">
+      <w:start w:val="1"/>
+      <w:numFmt w:val="bullet"/>
+      <w:lvlText w:val=""/>
+      <w:lvlJc w:val="left"/>
+      <w:pPr>
+        <w:tabs>
+          <w:tab w:val="num" w:pos="5760"/>
+        </w:tabs>
+        <w:ind w:left="5760" w:hanging="360"/>
+      </w:pPr>
+      <w:rPr>
+        <w:rFonts w:ascii="Wingdings" w:hAnsi="Wingdings" w:hint="default"/>
+        <w:sz w:val="20"/>
+      </w:rPr>
+    </w:lvl>
+    <w:lvl w:ilvl="8" w:tentative="1">
+      <w:start w:val="1"/>
+      <w:numFmt w:val="bullet"/>
+      <w:lvlText w:val=""/>
+      <w:lvlJc w:val="left"/>
+      <w:pPr>
+        <w:tabs>
+          <w:tab w:val="num" w:pos="6480"/>
+        </w:tabs>
+        <w:ind w:left="6480" w:hanging="360"/>
+      </w:pPr>
+      <w:rPr>
+        <w:rFonts w:ascii="Wingdings" w:hAnsi="Wingdings" w:hint="default"/>
+        <w:sz w:val="20"/>
+      </w:rPr>
+    </w:lvl>
+  </w:abstractNum>
+  <w:num w:numId="1" w16cid:durableId="1648241506">
+    <w:abstractNumId w:val="0"/>
+  </w:num>
+  <w:num w:numId="2" w16cid:durableId="1176769366">
+    <w:abstractNumId w:val="1"/>
+  </w:num>
+</w:numbering>
 </file>
 
 <file path=word/styles.xml><?xml version="1.0" encoding="utf-8"?>
@@ -437,7 +4998,6 @@
     <w:next w:val="Normal"/>
     <w:link w:val="Heading2Char"/>
     <w:uiPriority w:val="9"/>
-    <w:semiHidden/>
     <w:unhideWhenUsed/>
     <w:qFormat/>
     <w:rsid w:val="00604990"/>
@@ -652,7 +5212,6 @@
     <w:basedOn w:val="DefaultParagraphFont"/>
     <w:link w:val="Heading2"/>
     <w:uiPriority w:val="9"/>
-    <w:semiHidden/>
     <w:rsid w:val="00604990"/>
     <w:rPr>
       <w:rFonts w:asciiTheme="majorHAnsi" w:eastAsiaTheme="majorEastAsia" w:hAnsiTheme="majorHAnsi" w:cstheme="majorBidi"/>
@@ -923,6 +5482,42 @@
       <w:smallCaps/>
       <w:color w:val="2F5496" w:themeColor="accent1" w:themeShade="BF"/>
       <w:spacing w:val="5"/>
+    </w:rPr>
+  </w:style>
+  <w:style w:type="paragraph" w:customStyle="1" w:styleId="my-2">
+    <w:name w:val="my-2"/>
+    <w:basedOn w:val="Normal"/>
+    <w:rsid w:val="00E81D69"/>
+    <w:pPr>
+      <w:spacing w:before="100" w:beforeAutospacing="1" w:after="100" w:afterAutospacing="1"/>
+    </w:pPr>
+    <w:rPr>
+      <w:rFonts w:ascii="Times New Roman" w:eastAsia="Times New Roman" w:hAnsi="Times New Roman" w:cs="Times New Roman"/>
+      <w:kern w:val="0"/>
+      <w:lang w:eastAsia="en-GB"/>
+      <w14:ligatures w14:val="none"/>
+    </w:rPr>
+  </w:style>
+  <w:style w:type="character" w:styleId="Emphasis">
+    <w:name w:val="Emphasis"/>
+    <w:basedOn w:val="DefaultParagraphFont"/>
+    <w:uiPriority w:val="20"/>
+    <w:qFormat/>
+    <w:rsid w:val="00E81D69"/>
+    <w:rPr>
+      <w:i/>
+      <w:iCs/>
+    </w:rPr>
+  </w:style>
+  <w:style w:type="character" w:styleId="Strong">
+    <w:name w:val="Strong"/>
+    <w:basedOn w:val="DefaultParagraphFont"/>
+    <w:uiPriority w:val="22"/>
+    <w:qFormat/>
+    <w:rsid w:val="00E81D69"/>
+    <w:rPr>
+      <w:b/>
+      <w:bCs/>
     </w:rPr>
   </w:style>
 </w:styles>

</xml_diff>